<commit_message>
Swap header hierarchy: 6M/2Y as top level, GA/BPD groups as subgroups
The two Table_1 docx files now present the timepoint (6M / 2Y) as the
top-level header and the GA or BPD group as the subgroup directly under
each timepoint, so all three 6M group columns are grouped together on
the left and all three 2Y group columns on the right, followed by the
two P-value columns.  Uses flextable set_header_df with unique internal
col_keys to allow duplicate subgroup display labels under the two
timepoint bands.

https://claude.ai/code/session_011RiFZevQfeNr1NU3Lbttjc
</commit_message>
<xml_diff>
--- a/table1/Table_1_BPD_6M_2Y.docx
+++ b/table1/Table_1_BPD_6M_2Y.docx
@@ -19,7 +19,7 @@
       </w:tblPr>
       <w:tr>
         <w:trPr>
-          <w:trHeight w:val="360" w:hRule="auto"/>
+          <w:trHeight w:val="437" w:hRule="auto"/>
           <w:tblHeader/>
         </w:trPr>
         header1
@@ -27,10 +27,10 @@
           <w:tcPr>
             <w:vMerge w:val="restart"/>
             <w:tcBorders>
-              <w:bottom w:val="single" w:sz="12" w:space="0" w:color="666666"/>
+              <w:bottom w:val="none" w:sz="0" w:space="0" w:color="FFFFFF"/>
               <w:top w:val="single" w:sz="8" w:space="0" w:color="000000"/>
               <w:left w:val="single" w:sz="8" w:space="0" w:color="000000"/>
-              <w:right w:val="none" w:sz="0" w:space="0" w:color="000000"/>
+              <w:right w:val="single" w:sz="6" w:space="0" w:color="000000"/>
             </w:tcBorders>
             <w:shd w:val="clear" w:color="auto" w:fill="FFFFFF"/>
             <w:tcMar>
@@ -70,12 +70,12 @@
         </w:tc>
         <w:tc>
           <w:tcPr>
-            <w:gridSpan w:val="2"/>
-            <w:tcBorders>
-              <w:bottom w:val="single" w:sz="12" w:space="0" w:color="666666"/>
+            <w:gridSpan w:val="3"/>
+            <w:tcBorders>
+              <w:bottom w:val="none" w:sz="0" w:space="0" w:color="FFFFFF"/>
               <w:top w:val="single" w:sz="8" w:space="0" w:color="000000"/>
-              <w:left w:val="none" w:sz="0" w:space="0" w:color="000000"/>
-              <w:right w:val="none" w:sz="0" w:space="0" w:color="000000"/>
+              <w:left w:val="single" w:sz="6" w:space="0" w:color="000000"/>
+              <w:right w:val="none" w:sz="0" w:space="0" w:color="FFFFFF"/>
             </w:tcBorders>
             <w:shd w:val="clear" w:color="auto" w:fill="FFFFFF"/>
             <w:tcMar>
@@ -109,18 +109,18 @@
                 <w:szCs w:val="20"/>
                 <w:color w:val="000000"/>
               </w:rPr>
-              <w:t xml:space="preserve">HC</w:t>
-            </w:r>
-          </w:p>
-        </w:tc>
-        <w:tc>
-          <w:tcPr>
-            <w:gridSpan w:val="2"/>
-            <w:tcBorders>
-              <w:bottom w:val="single" w:sz="12" w:space="0" w:color="666666"/>
+              <w:t xml:space="preserve">6M</w:t>
+            </w:r>
+          </w:p>
+        </w:tc>
+        <w:tc>
+          <w:tcPr>
+            <w:gridSpan w:val="3"/>
+            <w:tcBorders>
+              <w:bottom w:val="none" w:sz="0" w:space="0" w:color="FFFFFF"/>
               <w:top w:val="single" w:sz="8" w:space="0" w:color="000000"/>
-              <w:left w:val="none" w:sz="0" w:space="0" w:color="000000"/>
-              <w:right w:val="none" w:sz="0" w:space="0" w:color="000000"/>
+              <w:left w:val="single" w:sz="6" w:space="0" w:color="000000"/>
+              <w:right w:val="none" w:sz="0" w:space="0" w:color="FFFFFF"/>
             </w:tcBorders>
             <w:shd w:val="clear" w:color="auto" w:fill="FFFFFF"/>
             <w:tcMar>
@@ -154,7 +154,7 @@
                 <w:szCs w:val="20"/>
                 <w:color w:val="000000"/>
               </w:rPr>
-              <w:t xml:space="preserve">No+Mild BPD</w:t>
+              <w:t xml:space="preserve">2Y</w:t>
             </w:r>
           </w:p>
         </w:tc>
@@ -162,55 +162,10 @@
           <w:tcPr>
             <w:gridSpan w:val="2"/>
             <w:tcBorders>
-              <w:bottom w:val="single" w:sz="12" w:space="0" w:color="666666"/>
+              <w:bottom w:val="none" w:sz="0" w:space="0" w:color="FFFFFF"/>
               <w:top w:val="single" w:sz="8" w:space="0" w:color="000000"/>
-              <w:left w:val="none" w:sz="0" w:space="0" w:color="000000"/>
-              <w:right w:val="none" w:sz="0" w:space="0" w:color="000000"/>
-            </w:tcBorders>
-            <w:shd w:val="clear" w:color="auto" w:fill="FFFFFF"/>
-            <w:tcMar>
-              <w:top w:w="0" w:type="dxa"/>
-              <w:bottom w:w="0" w:type="dxa"/>
-              <w:left w:w="0" w:type="dxa"/>
-              <w:right w:w="0" w:type="dxa"/>
-            </w:tcMar>
-            <w:vAlign w:val="center"/>
-          </w:tcPr>
-          <w:p>
-            <w:pPr>
-              <w:pStyle w:val="Normal"/>
-              <w:jc w:val="center"/>
-              <w:pBdr>
-                <w:bottom w:val="none" w:sz="0" w:space="0" w:color="000000"/>
-                <w:top w:val="none" w:sz="0" w:space="0" w:color="000000"/>
-                <w:left w:val="none" w:sz="0" w:space="0" w:color="000000"/>
-                <w:right w:val="none" w:sz="0" w:space="0" w:color="000000"/>
-              </w:pBdr>
-              <w:spacing w:after="40" w:before="40" w:line="240"/>
-              <w:ind w:left="100" w:right="100" w:firstLine="0" w:firstLineChars="0"/>
-            </w:pPr>
-            <w:r>
-              <w:rPr>
-                <w:rFonts w:ascii="DejaVu Sans" w:hAnsi="DejaVu Sans" w:eastAsia="DejaVu Sans" w:cs="DejaVu Sans"/>
-                <w:i w:val="false"/>
-                <w:b w:val="true"/>
-                <w:u w:val="none"/>
-                <w:sz w:val="20"/>
-                <w:szCs w:val="20"/>
-                <w:color w:val="000000"/>
-              </w:rPr>
-              <w:t xml:space="preserve">M+S BPD</w:t>
-            </w:r>
-          </w:p>
-        </w:tc>
-        <w:tc>
-          <w:tcPr>
-            <w:gridSpan w:val="2"/>
-            <w:tcBorders>
-              <w:bottom w:val="single" w:sz="12" w:space="0" w:color="666666"/>
-              <w:top w:val="single" w:sz="8" w:space="0" w:color="000000"/>
-              <w:left w:val="none" w:sz="0" w:space="0" w:color="000000"/>
-              <w:right w:val="none" w:sz="0" w:space="0" w:color="000000"/>
+              <w:left w:val="single" w:sz="6" w:space="0" w:color="000000"/>
+              <w:right w:val="none" w:sz="0" w:space="0" w:color="FFFFFF"/>
             </w:tcBorders>
             <w:shd w:val="clear" w:color="auto" w:fill="FFFFFF"/>
             <w:tcMar>
@@ -251,7 +206,7 @@
       </w:tr>
       <w:tr>
         <w:trPr>
-          <w:trHeight w:val="360" w:hRule="auto"/>
+          <w:trHeight w:val="463" w:hRule="auto"/>
           <w:tblHeader/>
         </w:trPr>
         header2
@@ -260,9 +215,9 @@
             <w:vMerge/>
             <w:tcBorders>
               <w:bottom w:val="single" w:sz="8" w:space="0" w:color="000000"/>
-              <w:top w:val="single" w:sz="12" w:space="0" w:color="666666"/>
+              <w:top w:val="none" w:sz="0" w:space="0" w:color="FFFFFF"/>
               <w:left w:val="single" w:sz="8" w:space="0" w:color="000000"/>
-              <w:right w:val="none" w:sz="0" w:space="0" w:color="000000"/>
+              <w:right w:val="single" w:sz="6" w:space="0" w:color="000000"/>
             </w:tcBorders>
             <w:shd w:val="clear" w:color="auto" w:fill="FFFFFF"/>
             <w:tcMar>
@@ -292,9 +247,9 @@
           <w:tcPr>
             <w:tcBorders>
               <w:bottom w:val="single" w:sz="8" w:space="0" w:color="000000"/>
-              <w:top w:val="single" w:sz="12" w:space="0" w:color="666666"/>
-              <w:left w:val="none" w:sz="0" w:space="0" w:color="000000"/>
-              <w:right w:val="none" w:sz="0" w:space="0" w:color="000000"/>
+              <w:top w:val="none" w:sz="0" w:space="0" w:color="FFFFFF"/>
+              <w:left w:val="single" w:sz="6" w:space="0" w:color="000000"/>
+              <w:right w:val="none" w:sz="0" w:space="0" w:color="FFFFFF"/>
             </w:tcBorders>
             <w:shd w:val="clear" w:color="auto" w:fill="FFFFFF"/>
             <w:tcMar>
@@ -328,7 +283,7 @@
                 <w:szCs w:val="20"/>
                 <w:color w:val="000000"/>
               </w:rPr>
-              <w:t xml:space="preserve">6M (n=50)</w:t>
+              <w:t xml:space="preserve">HC (n=50)</w:t>
             </w:r>
           </w:p>
         </w:tc>
@@ -336,9 +291,9 @@
           <w:tcPr>
             <w:tcBorders>
               <w:bottom w:val="single" w:sz="8" w:space="0" w:color="000000"/>
-              <w:top w:val="single" w:sz="12" w:space="0" w:color="666666"/>
-              <w:left w:val="none" w:sz="0" w:space="0" w:color="000000"/>
-              <w:right w:val="none" w:sz="0" w:space="0" w:color="000000"/>
+              <w:top w:val="none" w:sz="0" w:space="0" w:color="FFFFFF"/>
+              <w:left w:val="none" w:sz="0" w:space="0" w:color="FFFFFF"/>
+              <w:right w:val="none" w:sz="0" w:space="0" w:color="FFFFFF"/>
             </w:tcBorders>
             <w:shd w:val="clear" w:color="auto" w:fill="FFFFFF"/>
             <w:tcMar>
@@ -372,7 +327,7 @@
                 <w:szCs w:val="20"/>
                 <w:color w:val="000000"/>
               </w:rPr>
-              <w:t xml:space="preserve">2Y (n=50)</w:t>
+              <w:t xml:space="preserve">No+Mild BPD (n=40)</w:t>
             </w:r>
           </w:p>
         </w:tc>
@@ -380,9 +335,9 @@
           <w:tcPr>
             <w:tcBorders>
               <w:bottom w:val="single" w:sz="8" w:space="0" w:color="000000"/>
-              <w:top w:val="single" w:sz="12" w:space="0" w:color="666666"/>
-              <w:left w:val="none" w:sz="0" w:space="0" w:color="000000"/>
-              <w:right w:val="none" w:sz="0" w:space="0" w:color="000000"/>
+              <w:top w:val="none" w:sz="0" w:space="0" w:color="FFFFFF"/>
+              <w:left w:val="none" w:sz="0" w:space="0" w:color="FFFFFF"/>
+              <w:right w:val="single" w:sz="6" w:space="0" w:color="000000"/>
             </w:tcBorders>
             <w:shd w:val="clear" w:color="auto" w:fill="FFFFFF"/>
             <w:tcMar>
@@ -416,7 +371,7 @@
                 <w:szCs w:val="20"/>
                 <w:color w:val="000000"/>
               </w:rPr>
-              <w:t xml:space="preserve">6M (n=40)</w:t>
+              <w:t xml:space="preserve">M+S BPD (n=49)</w:t>
             </w:r>
           </w:p>
         </w:tc>
@@ -424,9 +379,9 @@
           <w:tcPr>
             <w:tcBorders>
               <w:bottom w:val="single" w:sz="8" w:space="0" w:color="000000"/>
-              <w:top w:val="single" w:sz="12" w:space="0" w:color="666666"/>
-              <w:left w:val="none" w:sz="0" w:space="0" w:color="000000"/>
-              <w:right w:val="none" w:sz="0" w:space="0" w:color="000000"/>
+              <w:top w:val="none" w:sz="0" w:space="0" w:color="FFFFFF"/>
+              <w:left w:val="single" w:sz="6" w:space="0" w:color="000000"/>
+              <w:right w:val="none" w:sz="0" w:space="0" w:color="FFFFFF"/>
             </w:tcBorders>
             <w:shd w:val="clear" w:color="auto" w:fill="FFFFFF"/>
             <w:tcMar>
@@ -460,7 +415,7 @@
                 <w:szCs w:val="20"/>
                 <w:color w:val="000000"/>
               </w:rPr>
-              <w:t xml:space="preserve">2Y (n=40)</w:t>
+              <w:t xml:space="preserve">HC (n=50)</w:t>
             </w:r>
           </w:p>
         </w:tc>
@@ -468,9 +423,9 @@
           <w:tcPr>
             <w:tcBorders>
               <w:bottom w:val="single" w:sz="8" w:space="0" w:color="000000"/>
-              <w:top w:val="single" w:sz="12" w:space="0" w:color="666666"/>
-              <w:left w:val="none" w:sz="0" w:space="0" w:color="000000"/>
-              <w:right w:val="none" w:sz="0" w:space="0" w:color="000000"/>
+              <w:top w:val="none" w:sz="0" w:space="0" w:color="FFFFFF"/>
+              <w:left w:val="none" w:sz="0" w:space="0" w:color="FFFFFF"/>
+              <w:right w:val="none" w:sz="0" w:space="0" w:color="FFFFFF"/>
             </w:tcBorders>
             <w:shd w:val="clear" w:color="auto" w:fill="FFFFFF"/>
             <w:tcMar>
@@ -504,7 +459,7 @@
                 <w:szCs w:val="20"/>
                 <w:color w:val="000000"/>
               </w:rPr>
-              <w:t xml:space="preserve">6M (n=49)</w:t>
+              <w:t xml:space="preserve">No+Mild BPD (n=40)</w:t>
             </w:r>
           </w:p>
         </w:tc>
@@ -512,9 +467,9 @@
           <w:tcPr>
             <w:tcBorders>
               <w:bottom w:val="single" w:sz="8" w:space="0" w:color="000000"/>
-              <w:top w:val="single" w:sz="12" w:space="0" w:color="666666"/>
-              <w:left w:val="none" w:sz="0" w:space="0" w:color="000000"/>
-              <w:right w:val="none" w:sz="0" w:space="0" w:color="000000"/>
+              <w:top w:val="none" w:sz="0" w:space="0" w:color="FFFFFF"/>
+              <w:left w:val="none" w:sz="0" w:space="0" w:color="FFFFFF"/>
+              <w:right w:val="single" w:sz="6" w:space="0" w:color="000000"/>
             </w:tcBorders>
             <w:shd w:val="clear" w:color="auto" w:fill="FFFFFF"/>
             <w:tcMar>
@@ -548,7 +503,7 @@
                 <w:szCs w:val="20"/>
                 <w:color w:val="000000"/>
               </w:rPr>
-              <w:t xml:space="preserve">2Y (n=49)</w:t>
+              <w:t xml:space="preserve">M+S BPD (n=49)</w:t>
             </w:r>
           </w:p>
         </w:tc>
@@ -556,9 +511,9 @@
           <w:tcPr>
             <w:tcBorders>
               <w:bottom w:val="single" w:sz="8" w:space="0" w:color="000000"/>
-              <w:top w:val="single" w:sz="12" w:space="0" w:color="666666"/>
-              <w:left w:val="none" w:sz="0" w:space="0" w:color="000000"/>
-              <w:right w:val="none" w:sz="0" w:space="0" w:color="000000"/>
+              <w:top w:val="none" w:sz="0" w:space="0" w:color="FFFFFF"/>
+              <w:left w:val="single" w:sz="6" w:space="0" w:color="000000"/>
+              <w:right w:val="none" w:sz="0" w:space="0" w:color="FFFFFF"/>
             </w:tcBorders>
             <w:shd w:val="clear" w:color="auto" w:fill="FFFFFF"/>
             <w:tcMar>
@@ -600,8 +555,8 @@
           <w:tcPr>
             <w:tcBorders>
               <w:bottom w:val="single" w:sz="8" w:space="0" w:color="000000"/>
-              <w:top w:val="single" w:sz="12" w:space="0" w:color="666666"/>
-              <w:left w:val="none" w:sz="0" w:space="0" w:color="000000"/>
+              <w:top w:val="none" w:sz="0" w:space="0" w:color="FFFFFF"/>
+              <w:left w:val="none" w:sz="0" w:space="0" w:color="FFFFFF"/>
               <w:right w:val="single" w:sz="8" w:space="0" w:color="000000"/>
             </w:tcBorders>
             <w:shd w:val="clear" w:color="auto" w:fill="FFFFFF"/>
@@ -652,6 +607,50 @@
               <w:bottom w:val="single" w:sz="4" w:space="0" w:color="999999"/>
               <w:top w:val="single" w:sz="8" w:space="0" w:color="000000"/>
               <w:left w:val="single" w:sz="8" w:space="0" w:color="000000"/>
+              <w:right w:val="single" w:sz="6" w:space="0" w:color="000000"/>
+            </w:tcBorders>
+            <w:shd w:val="clear" w:color="auto" w:fill="FFFFFF"/>
+            <w:tcMar>
+              <w:top w:w="0" w:type="dxa"/>
+              <w:bottom w:w="0" w:type="dxa"/>
+              <w:left w:w="0" w:type="dxa"/>
+              <w:right w:w="0" w:type="dxa"/>
+            </w:tcMar>
+            <w:vAlign w:val="center"/>
+          </w:tcPr>
+          <w:p>
+            <w:pPr>
+              <w:pStyle w:val="Normal"/>
+              <w:jc w:val="left"/>
+              <w:pBdr>
+                <w:bottom w:val="none" w:sz="0" w:space="0" w:color="000000"/>
+                <w:top w:val="none" w:sz="0" w:space="0" w:color="000000"/>
+                <w:left w:val="none" w:sz="0" w:space="0" w:color="000000"/>
+                <w:right w:val="none" w:sz="0" w:space="0" w:color="000000"/>
+              </w:pBdr>
+              <w:spacing w:after="40" w:before="40" w:line="240"/>
+              <w:ind w:left="100" w:right="100" w:firstLine="0" w:firstLineChars="0"/>
+            </w:pPr>
+            <w:r>
+              <w:rPr>
+                <w:rFonts w:ascii="DejaVu Sans" w:hAnsi="DejaVu Sans" w:eastAsia="DejaVu Sans" w:cs="DejaVu Sans"/>
+                <w:i w:val="false"/>
+                <w:b w:val="false"/>
+                <w:u w:val="none"/>
+                <w:sz w:val="18"/>
+                <w:szCs w:val="18"/>
+                <w:color w:val="000000"/>
+              </w:rPr>
+              <w:t xml:space="preserve">Sex (male, n(%))</w:t>
+            </w:r>
+          </w:p>
+        </w:tc>
+        <w:tc>
+          <w:tcPr>
+            <w:tcBorders>
+              <w:bottom w:val="single" w:sz="4" w:space="0" w:color="999999"/>
+              <w:top w:val="single" w:sz="8" w:space="0" w:color="000000"/>
+              <w:left w:val="single" w:sz="6" w:space="0" w:color="000000"/>
               <w:right w:val="none" w:sz="0" w:space="0" w:color="000000"/>
             </w:tcBorders>
             <w:shd w:val="clear" w:color="auto" w:fill="FFFFFF"/>
@@ -666,27 +665,27 @@
           <w:p>
             <w:pPr>
               <w:pStyle w:val="Normal"/>
-              <w:jc w:val="left"/>
-              <w:pBdr>
-                <w:bottom w:val="none" w:sz="0" w:space="0" w:color="000000"/>
-                <w:top w:val="none" w:sz="0" w:space="0" w:color="000000"/>
-                <w:left w:val="none" w:sz="0" w:space="0" w:color="000000"/>
-                <w:right w:val="none" w:sz="0" w:space="0" w:color="000000"/>
-              </w:pBdr>
-              <w:spacing w:after="40" w:before="40" w:line="240"/>
-              <w:ind w:left="100" w:right="100" w:firstLine="0" w:firstLineChars="0"/>
-            </w:pPr>
-            <w:r>
-              <w:rPr>
-                <w:rFonts w:ascii="DejaVu Sans" w:hAnsi="DejaVu Sans" w:eastAsia="DejaVu Sans" w:cs="DejaVu Sans"/>
-                <w:i w:val="false"/>
-                <w:b w:val="false"/>
-                <w:u w:val="none"/>
-                <w:sz w:val="18"/>
-                <w:szCs w:val="18"/>
-                <w:color w:val="000000"/>
-              </w:rPr>
-              <w:t xml:space="preserve">Sex (male, n(%))</w:t>
+              <w:jc w:val="center"/>
+              <w:pBdr>
+                <w:bottom w:val="none" w:sz="0" w:space="0" w:color="000000"/>
+                <w:top w:val="none" w:sz="0" w:space="0" w:color="000000"/>
+                <w:left w:val="none" w:sz="0" w:space="0" w:color="000000"/>
+                <w:right w:val="none" w:sz="0" w:space="0" w:color="000000"/>
+              </w:pBdr>
+              <w:spacing w:after="40" w:before="40" w:line="240"/>
+              <w:ind w:left="100" w:right="100" w:firstLine="0" w:firstLineChars="0"/>
+            </w:pPr>
+            <w:r>
+              <w:rPr>
+                <w:rFonts w:ascii="DejaVu Sans" w:hAnsi="DejaVu Sans" w:eastAsia="DejaVu Sans" w:cs="DejaVu Sans"/>
+                <w:i w:val="false"/>
+                <w:b w:val="false"/>
+                <w:u w:val="none"/>
+                <w:sz w:val="18"/>
+                <w:szCs w:val="18"/>
+                <w:color w:val="000000"/>
+              </w:rPr>
+              <w:t xml:space="preserve">20 (40.0%)</w:t>
             </w:r>
           </w:p>
         </w:tc>
@@ -730,6 +729,94 @@
                 <w:szCs w:val="18"/>
                 <w:color w:val="000000"/>
               </w:rPr>
+              <w:t xml:space="preserve">19 (47.5%)</w:t>
+            </w:r>
+          </w:p>
+        </w:tc>
+        <w:tc>
+          <w:tcPr>
+            <w:tcBorders>
+              <w:bottom w:val="single" w:sz="4" w:space="0" w:color="999999"/>
+              <w:top w:val="single" w:sz="8" w:space="0" w:color="000000"/>
+              <w:left w:val="none" w:sz="0" w:space="0" w:color="000000"/>
+              <w:right w:val="single" w:sz="6" w:space="0" w:color="000000"/>
+            </w:tcBorders>
+            <w:shd w:val="clear" w:color="auto" w:fill="FFFFFF"/>
+            <w:tcMar>
+              <w:top w:w="0" w:type="dxa"/>
+              <w:bottom w:w="0" w:type="dxa"/>
+              <w:left w:w="0" w:type="dxa"/>
+              <w:right w:w="0" w:type="dxa"/>
+            </w:tcMar>
+            <w:vAlign w:val="center"/>
+          </w:tcPr>
+          <w:p>
+            <w:pPr>
+              <w:pStyle w:val="Normal"/>
+              <w:jc w:val="center"/>
+              <w:pBdr>
+                <w:bottom w:val="none" w:sz="0" w:space="0" w:color="000000"/>
+                <w:top w:val="none" w:sz="0" w:space="0" w:color="000000"/>
+                <w:left w:val="none" w:sz="0" w:space="0" w:color="000000"/>
+                <w:right w:val="none" w:sz="0" w:space="0" w:color="000000"/>
+              </w:pBdr>
+              <w:spacing w:after="40" w:before="40" w:line="240"/>
+              <w:ind w:left="100" w:right="100" w:firstLine="0" w:firstLineChars="0"/>
+            </w:pPr>
+            <w:r>
+              <w:rPr>
+                <w:rFonts w:ascii="DejaVu Sans" w:hAnsi="DejaVu Sans" w:eastAsia="DejaVu Sans" w:cs="DejaVu Sans"/>
+                <w:i w:val="false"/>
+                <w:b w:val="false"/>
+                <w:u w:val="none"/>
+                <w:sz w:val="18"/>
+                <w:szCs w:val="18"/>
+                <w:color w:val="000000"/>
+              </w:rPr>
+              <w:t xml:space="preserve">23 (46.9%)</w:t>
+            </w:r>
+          </w:p>
+        </w:tc>
+        <w:tc>
+          <w:tcPr>
+            <w:tcBorders>
+              <w:bottom w:val="single" w:sz="4" w:space="0" w:color="999999"/>
+              <w:top w:val="single" w:sz="8" w:space="0" w:color="000000"/>
+              <w:left w:val="single" w:sz="6" w:space="0" w:color="000000"/>
+              <w:right w:val="none" w:sz="0" w:space="0" w:color="000000"/>
+            </w:tcBorders>
+            <w:shd w:val="clear" w:color="auto" w:fill="FFFFFF"/>
+            <w:tcMar>
+              <w:top w:w="0" w:type="dxa"/>
+              <w:bottom w:w="0" w:type="dxa"/>
+              <w:left w:w="0" w:type="dxa"/>
+              <w:right w:w="0" w:type="dxa"/>
+            </w:tcMar>
+            <w:vAlign w:val="center"/>
+          </w:tcPr>
+          <w:p>
+            <w:pPr>
+              <w:pStyle w:val="Normal"/>
+              <w:jc w:val="center"/>
+              <w:pBdr>
+                <w:bottom w:val="none" w:sz="0" w:space="0" w:color="000000"/>
+                <w:top w:val="none" w:sz="0" w:space="0" w:color="000000"/>
+                <w:left w:val="none" w:sz="0" w:space="0" w:color="000000"/>
+                <w:right w:val="none" w:sz="0" w:space="0" w:color="000000"/>
+              </w:pBdr>
+              <w:spacing w:after="40" w:before="40" w:line="240"/>
+              <w:ind w:left="100" w:right="100" w:firstLine="0" w:firstLineChars="0"/>
+            </w:pPr>
+            <w:r>
+              <w:rPr>
+                <w:rFonts w:ascii="DejaVu Sans" w:hAnsi="DejaVu Sans" w:eastAsia="DejaVu Sans" w:cs="DejaVu Sans"/>
+                <w:i w:val="false"/>
+                <w:b w:val="false"/>
+                <w:u w:val="none"/>
+                <w:sz w:val="18"/>
+                <w:szCs w:val="18"/>
+                <w:color w:val="000000"/>
+              </w:rPr>
               <w:t xml:space="preserve">20 (40.0%)</w:t>
             </w:r>
           </w:p>
@@ -774,7 +861,7 @@
                 <w:szCs w:val="18"/>
                 <w:color w:val="000000"/>
               </w:rPr>
-              <w:t xml:space="preserve">20 (40.0%)</w:t>
+              <w:t xml:space="preserve">19 (47.5%)</w:t>
             </w:r>
           </w:p>
         </w:tc>
@@ -784,41 +871,41 @@
               <w:bottom w:val="single" w:sz="4" w:space="0" w:color="999999"/>
               <w:top w:val="single" w:sz="8" w:space="0" w:color="000000"/>
               <w:left w:val="none" w:sz="0" w:space="0" w:color="000000"/>
-              <w:right w:val="none" w:sz="0" w:space="0" w:color="000000"/>
-            </w:tcBorders>
-            <w:shd w:val="clear" w:color="auto" w:fill="FFFFFF"/>
-            <w:tcMar>
-              <w:top w:w="0" w:type="dxa"/>
-              <w:bottom w:w="0" w:type="dxa"/>
-              <w:left w:w="0" w:type="dxa"/>
-              <w:right w:w="0" w:type="dxa"/>
-            </w:tcMar>
-            <w:vAlign w:val="center"/>
-          </w:tcPr>
-          <w:p>
-            <w:pPr>
-              <w:pStyle w:val="Normal"/>
-              <w:jc w:val="center"/>
-              <w:pBdr>
-                <w:bottom w:val="none" w:sz="0" w:space="0" w:color="000000"/>
-                <w:top w:val="none" w:sz="0" w:space="0" w:color="000000"/>
-                <w:left w:val="none" w:sz="0" w:space="0" w:color="000000"/>
-                <w:right w:val="none" w:sz="0" w:space="0" w:color="000000"/>
-              </w:pBdr>
-              <w:spacing w:after="40" w:before="40" w:line="240"/>
-              <w:ind w:left="100" w:right="100" w:firstLine="0" w:firstLineChars="0"/>
-            </w:pPr>
-            <w:r>
-              <w:rPr>
-                <w:rFonts w:ascii="DejaVu Sans" w:hAnsi="DejaVu Sans" w:eastAsia="DejaVu Sans" w:cs="DejaVu Sans"/>
-                <w:i w:val="false"/>
-                <w:b w:val="false"/>
-                <w:u w:val="none"/>
-                <w:sz w:val="18"/>
-                <w:szCs w:val="18"/>
-                <w:color w:val="000000"/>
-              </w:rPr>
-              <w:t xml:space="preserve">19 (47.5%)</w:t>
+              <w:right w:val="single" w:sz="6" w:space="0" w:color="000000"/>
+            </w:tcBorders>
+            <w:shd w:val="clear" w:color="auto" w:fill="FFFFFF"/>
+            <w:tcMar>
+              <w:top w:w="0" w:type="dxa"/>
+              <w:bottom w:w="0" w:type="dxa"/>
+              <w:left w:w="0" w:type="dxa"/>
+              <w:right w:w="0" w:type="dxa"/>
+            </w:tcMar>
+            <w:vAlign w:val="center"/>
+          </w:tcPr>
+          <w:p>
+            <w:pPr>
+              <w:pStyle w:val="Normal"/>
+              <w:jc w:val="center"/>
+              <w:pBdr>
+                <w:bottom w:val="none" w:sz="0" w:space="0" w:color="000000"/>
+                <w:top w:val="none" w:sz="0" w:space="0" w:color="000000"/>
+                <w:left w:val="none" w:sz="0" w:space="0" w:color="000000"/>
+                <w:right w:val="none" w:sz="0" w:space="0" w:color="000000"/>
+              </w:pBdr>
+              <w:spacing w:after="40" w:before="40" w:line="240"/>
+              <w:ind w:left="100" w:right="100" w:firstLine="0" w:firstLineChars="0"/>
+            </w:pPr>
+            <w:r>
+              <w:rPr>
+                <w:rFonts w:ascii="DejaVu Sans" w:hAnsi="DejaVu Sans" w:eastAsia="DejaVu Sans" w:cs="DejaVu Sans"/>
+                <w:i w:val="false"/>
+                <w:b w:val="false"/>
+                <w:u w:val="none"/>
+                <w:sz w:val="18"/>
+                <w:szCs w:val="18"/>
+                <w:color w:val="000000"/>
+              </w:rPr>
+              <w:t xml:space="preserve">23 (46.9%)</w:t>
             </w:r>
           </w:p>
         </w:tc>
@@ -827,139 +914,7 @@
             <w:tcBorders>
               <w:bottom w:val="single" w:sz="4" w:space="0" w:color="999999"/>
               <w:top w:val="single" w:sz="8" w:space="0" w:color="000000"/>
-              <w:left w:val="none" w:sz="0" w:space="0" w:color="000000"/>
-              <w:right w:val="none" w:sz="0" w:space="0" w:color="000000"/>
-            </w:tcBorders>
-            <w:shd w:val="clear" w:color="auto" w:fill="FFFFFF"/>
-            <w:tcMar>
-              <w:top w:w="0" w:type="dxa"/>
-              <w:bottom w:w="0" w:type="dxa"/>
-              <w:left w:w="0" w:type="dxa"/>
-              <w:right w:w="0" w:type="dxa"/>
-            </w:tcMar>
-            <w:vAlign w:val="center"/>
-          </w:tcPr>
-          <w:p>
-            <w:pPr>
-              <w:pStyle w:val="Normal"/>
-              <w:jc w:val="center"/>
-              <w:pBdr>
-                <w:bottom w:val="none" w:sz="0" w:space="0" w:color="000000"/>
-                <w:top w:val="none" w:sz="0" w:space="0" w:color="000000"/>
-                <w:left w:val="none" w:sz="0" w:space="0" w:color="000000"/>
-                <w:right w:val="none" w:sz="0" w:space="0" w:color="000000"/>
-              </w:pBdr>
-              <w:spacing w:after="40" w:before="40" w:line="240"/>
-              <w:ind w:left="100" w:right="100" w:firstLine="0" w:firstLineChars="0"/>
-            </w:pPr>
-            <w:r>
-              <w:rPr>
-                <w:rFonts w:ascii="DejaVu Sans" w:hAnsi="DejaVu Sans" w:eastAsia="DejaVu Sans" w:cs="DejaVu Sans"/>
-                <w:i w:val="false"/>
-                <w:b w:val="false"/>
-                <w:u w:val="none"/>
-                <w:sz w:val="18"/>
-                <w:szCs w:val="18"/>
-                <w:color w:val="000000"/>
-              </w:rPr>
-              <w:t xml:space="preserve">19 (47.5%)</w:t>
-            </w:r>
-          </w:p>
-        </w:tc>
-        <w:tc>
-          <w:tcPr>
-            <w:tcBorders>
-              <w:bottom w:val="single" w:sz="4" w:space="0" w:color="999999"/>
-              <w:top w:val="single" w:sz="8" w:space="0" w:color="000000"/>
-              <w:left w:val="none" w:sz="0" w:space="0" w:color="000000"/>
-              <w:right w:val="none" w:sz="0" w:space="0" w:color="000000"/>
-            </w:tcBorders>
-            <w:shd w:val="clear" w:color="auto" w:fill="FFFFFF"/>
-            <w:tcMar>
-              <w:top w:w="0" w:type="dxa"/>
-              <w:bottom w:w="0" w:type="dxa"/>
-              <w:left w:w="0" w:type="dxa"/>
-              <w:right w:w="0" w:type="dxa"/>
-            </w:tcMar>
-            <w:vAlign w:val="center"/>
-          </w:tcPr>
-          <w:p>
-            <w:pPr>
-              <w:pStyle w:val="Normal"/>
-              <w:jc w:val="center"/>
-              <w:pBdr>
-                <w:bottom w:val="none" w:sz="0" w:space="0" w:color="000000"/>
-                <w:top w:val="none" w:sz="0" w:space="0" w:color="000000"/>
-                <w:left w:val="none" w:sz="0" w:space="0" w:color="000000"/>
-                <w:right w:val="none" w:sz="0" w:space="0" w:color="000000"/>
-              </w:pBdr>
-              <w:spacing w:after="40" w:before="40" w:line="240"/>
-              <w:ind w:left="100" w:right="100" w:firstLine="0" w:firstLineChars="0"/>
-            </w:pPr>
-            <w:r>
-              <w:rPr>
-                <w:rFonts w:ascii="DejaVu Sans" w:hAnsi="DejaVu Sans" w:eastAsia="DejaVu Sans" w:cs="DejaVu Sans"/>
-                <w:i w:val="false"/>
-                <w:b w:val="false"/>
-                <w:u w:val="none"/>
-                <w:sz w:val="18"/>
-                <w:szCs w:val="18"/>
-                <w:color w:val="000000"/>
-              </w:rPr>
-              <w:t xml:space="preserve">23 (46.9%)</w:t>
-            </w:r>
-          </w:p>
-        </w:tc>
-        <w:tc>
-          <w:tcPr>
-            <w:tcBorders>
-              <w:bottom w:val="single" w:sz="4" w:space="0" w:color="999999"/>
-              <w:top w:val="single" w:sz="8" w:space="0" w:color="000000"/>
-              <w:left w:val="none" w:sz="0" w:space="0" w:color="000000"/>
-              <w:right w:val="none" w:sz="0" w:space="0" w:color="000000"/>
-            </w:tcBorders>
-            <w:shd w:val="clear" w:color="auto" w:fill="FFFFFF"/>
-            <w:tcMar>
-              <w:top w:w="0" w:type="dxa"/>
-              <w:bottom w:w="0" w:type="dxa"/>
-              <w:left w:w="0" w:type="dxa"/>
-              <w:right w:w="0" w:type="dxa"/>
-            </w:tcMar>
-            <w:vAlign w:val="center"/>
-          </w:tcPr>
-          <w:p>
-            <w:pPr>
-              <w:pStyle w:val="Normal"/>
-              <w:jc w:val="center"/>
-              <w:pBdr>
-                <w:bottom w:val="none" w:sz="0" w:space="0" w:color="000000"/>
-                <w:top w:val="none" w:sz="0" w:space="0" w:color="000000"/>
-                <w:left w:val="none" w:sz="0" w:space="0" w:color="000000"/>
-                <w:right w:val="none" w:sz="0" w:space="0" w:color="000000"/>
-              </w:pBdr>
-              <w:spacing w:after="40" w:before="40" w:line="240"/>
-              <w:ind w:left="100" w:right="100" w:firstLine="0" w:firstLineChars="0"/>
-            </w:pPr>
-            <w:r>
-              <w:rPr>
-                <w:rFonts w:ascii="DejaVu Sans" w:hAnsi="DejaVu Sans" w:eastAsia="DejaVu Sans" w:cs="DejaVu Sans"/>
-                <w:i w:val="false"/>
-                <w:b w:val="false"/>
-                <w:u w:val="none"/>
-                <w:sz w:val="18"/>
-                <w:szCs w:val="18"/>
-                <w:color w:val="000000"/>
-              </w:rPr>
-              <w:t xml:space="preserve">23 (46.9%)</w:t>
-            </w:r>
-          </w:p>
-        </w:tc>
-        <w:tc>
-          <w:tcPr>
-            <w:tcBorders>
-              <w:bottom w:val="single" w:sz="4" w:space="0" w:color="999999"/>
-              <w:top w:val="single" w:sz="8" w:space="0" w:color="000000"/>
-              <w:left w:val="none" w:sz="0" w:space="0" w:color="000000"/>
+              <w:left w:val="single" w:sz="6" w:space="0" w:color="000000"/>
               <w:right w:val="none" w:sz="0" w:space="0" w:color="000000"/>
             </w:tcBorders>
             <w:shd w:val="clear" w:color="auto" w:fill="FFFFFF"/>
@@ -1054,6 +1009,50 @@
               <w:bottom w:val="single" w:sz="4" w:space="0" w:color="999999"/>
               <w:top w:val="single" w:sz="4" w:space="0" w:color="999999"/>
               <w:left w:val="single" w:sz="8" w:space="0" w:color="000000"/>
+              <w:right w:val="single" w:sz="6" w:space="0" w:color="000000"/>
+            </w:tcBorders>
+            <w:shd w:val="clear" w:color="auto" w:fill="FFFFFF"/>
+            <w:tcMar>
+              <w:top w:w="0" w:type="dxa"/>
+              <w:bottom w:w="0" w:type="dxa"/>
+              <w:left w:w="0" w:type="dxa"/>
+              <w:right w:w="0" w:type="dxa"/>
+            </w:tcMar>
+            <w:vAlign w:val="center"/>
+          </w:tcPr>
+          <w:p>
+            <w:pPr>
+              <w:pStyle w:val="Normal"/>
+              <w:jc w:val="left"/>
+              <w:pBdr>
+                <w:bottom w:val="none" w:sz="0" w:space="0" w:color="000000"/>
+                <w:top w:val="none" w:sz="0" w:space="0" w:color="000000"/>
+                <w:left w:val="none" w:sz="0" w:space="0" w:color="000000"/>
+                <w:right w:val="none" w:sz="0" w:space="0" w:color="000000"/>
+              </w:pBdr>
+              <w:spacing w:after="40" w:before="40" w:line="240"/>
+              <w:ind w:left="100" w:right="100" w:firstLine="0" w:firstLineChars="0"/>
+            </w:pPr>
+            <w:r>
+              <w:rPr>
+                <w:rFonts w:ascii="DejaVu Sans" w:hAnsi="DejaVu Sans" w:eastAsia="DejaVu Sans" w:cs="DejaVu Sans"/>
+                <w:i w:val="false"/>
+                <w:b w:val="false"/>
+                <w:u w:val="none"/>
+                <w:sz w:val="18"/>
+                <w:szCs w:val="18"/>
+                <w:color w:val="000000"/>
+              </w:rPr>
+              <w:t xml:space="preserve">Gestational age (wk)</w:t>
+            </w:r>
+          </w:p>
+        </w:tc>
+        <w:tc>
+          <w:tcPr>
+            <w:tcBorders>
+              <w:bottom w:val="single" w:sz="4" w:space="0" w:color="999999"/>
+              <w:top w:val="single" w:sz="4" w:space="0" w:color="999999"/>
+              <w:left w:val="single" w:sz="6" w:space="0" w:color="000000"/>
               <w:right w:val="none" w:sz="0" w:space="0" w:color="000000"/>
             </w:tcBorders>
             <w:shd w:val="clear" w:color="auto" w:fill="FFFFFF"/>
@@ -1068,27 +1067,27 @@
           <w:p>
             <w:pPr>
               <w:pStyle w:val="Normal"/>
-              <w:jc w:val="left"/>
-              <w:pBdr>
-                <w:bottom w:val="none" w:sz="0" w:space="0" w:color="000000"/>
-                <w:top w:val="none" w:sz="0" w:space="0" w:color="000000"/>
-                <w:left w:val="none" w:sz="0" w:space="0" w:color="000000"/>
-                <w:right w:val="none" w:sz="0" w:space="0" w:color="000000"/>
-              </w:pBdr>
-              <w:spacing w:after="40" w:before="40" w:line="240"/>
-              <w:ind w:left="100" w:right="100" w:firstLine="0" w:firstLineChars="0"/>
-            </w:pPr>
-            <w:r>
-              <w:rPr>
-                <w:rFonts w:ascii="DejaVu Sans" w:hAnsi="DejaVu Sans" w:eastAsia="DejaVu Sans" w:cs="DejaVu Sans"/>
-                <w:i w:val="false"/>
-                <w:b w:val="false"/>
-                <w:u w:val="none"/>
-                <w:sz w:val="18"/>
-                <w:szCs w:val="18"/>
-                <w:color w:val="000000"/>
-              </w:rPr>
-              <w:t xml:space="preserve">Gestational age (wk)</w:t>
+              <w:jc w:val="center"/>
+              <w:pBdr>
+                <w:bottom w:val="none" w:sz="0" w:space="0" w:color="000000"/>
+                <w:top w:val="none" w:sz="0" w:space="0" w:color="000000"/>
+                <w:left w:val="none" w:sz="0" w:space="0" w:color="000000"/>
+                <w:right w:val="none" w:sz="0" w:space="0" w:color="000000"/>
+              </w:pBdr>
+              <w:spacing w:after="40" w:before="40" w:line="240"/>
+              <w:ind w:left="100" w:right="100" w:firstLine="0" w:firstLineChars="0"/>
+            </w:pPr>
+            <w:r>
+              <w:rPr>
+                <w:rFonts w:ascii="DejaVu Sans" w:hAnsi="DejaVu Sans" w:eastAsia="DejaVu Sans" w:cs="DejaVu Sans"/>
+                <w:i w:val="false"/>
+                <w:b w:val="false"/>
+                <w:u w:val="none"/>
+                <w:sz w:val="18"/>
+                <w:szCs w:val="18"/>
+                <w:color w:val="000000"/>
+              </w:rPr>
+              <w:t xml:space="preserve">39.07 ± 0.80</w:t>
             </w:r>
           </w:p>
         </w:tc>
@@ -1132,6 +1131,94 @@
                 <w:szCs w:val="18"/>
                 <w:color w:val="000000"/>
               </w:rPr>
+              <w:t xml:space="preserve">30.17 ± 1.69</w:t>
+            </w:r>
+          </w:p>
+        </w:tc>
+        <w:tc>
+          <w:tcPr>
+            <w:tcBorders>
+              <w:bottom w:val="single" w:sz="4" w:space="0" w:color="999999"/>
+              <w:top w:val="single" w:sz="4" w:space="0" w:color="999999"/>
+              <w:left w:val="none" w:sz="0" w:space="0" w:color="000000"/>
+              <w:right w:val="single" w:sz="6" w:space="0" w:color="000000"/>
+            </w:tcBorders>
+            <w:shd w:val="clear" w:color="auto" w:fill="FFFFFF"/>
+            <w:tcMar>
+              <w:top w:w="0" w:type="dxa"/>
+              <w:bottom w:w="0" w:type="dxa"/>
+              <w:left w:w="0" w:type="dxa"/>
+              <w:right w:w="0" w:type="dxa"/>
+            </w:tcMar>
+            <w:vAlign w:val="center"/>
+          </w:tcPr>
+          <w:p>
+            <w:pPr>
+              <w:pStyle w:val="Normal"/>
+              <w:jc w:val="center"/>
+              <w:pBdr>
+                <w:bottom w:val="none" w:sz="0" w:space="0" w:color="000000"/>
+                <w:top w:val="none" w:sz="0" w:space="0" w:color="000000"/>
+                <w:left w:val="none" w:sz="0" w:space="0" w:color="000000"/>
+                <w:right w:val="none" w:sz="0" w:space="0" w:color="000000"/>
+              </w:pBdr>
+              <w:spacing w:after="40" w:before="40" w:line="240"/>
+              <w:ind w:left="100" w:right="100" w:firstLine="0" w:firstLineChars="0"/>
+            </w:pPr>
+            <w:r>
+              <w:rPr>
+                <w:rFonts w:ascii="DejaVu Sans" w:hAnsi="DejaVu Sans" w:eastAsia="DejaVu Sans" w:cs="DejaVu Sans"/>
+                <w:i w:val="false"/>
+                <w:b w:val="false"/>
+                <w:u w:val="none"/>
+                <w:sz w:val="18"/>
+                <w:szCs w:val="18"/>
+                <w:color w:val="000000"/>
+              </w:rPr>
+              <w:t xml:space="preserve">27.24 ± 2.42</w:t>
+            </w:r>
+          </w:p>
+        </w:tc>
+        <w:tc>
+          <w:tcPr>
+            <w:tcBorders>
+              <w:bottom w:val="single" w:sz="4" w:space="0" w:color="999999"/>
+              <w:top w:val="single" w:sz="4" w:space="0" w:color="999999"/>
+              <w:left w:val="single" w:sz="6" w:space="0" w:color="000000"/>
+              <w:right w:val="none" w:sz="0" w:space="0" w:color="000000"/>
+            </w:tcBorders>
+            <w:shd w:val="clear" w:color="auto" w:fill="FFFFFF"/>
+            <w:tcMar>
+              <w:top w:w="0" w:type="dxa"/>
+              <w:bottom w:w="0" w:type="dxa"/>
+              <w:left w:w="0" w:type="dxa"/>
+              <w:right w:w="0" w:type="dxa"/>
+            </w:tcMar>
+            <w:vAlign w:val="center"/>
+          </w:tcPr>
+          <w:p>
+            <w:pPr>
+              <w:pStyle w:val="Normal"/>
+              <w:jc w:val="center"/>
+              <w:pBdr>
+                <w:bottom w:val="none" w:sz="0" w:space="0" w:color="000000"/>
+                <w:top w:val="none" w:sz="0" w:space="0" w:color="000000"/>
+                <w:left w:val="none" w:sz="0" w:space="0" w:color="000000"/>
+                <w:right w:val="none" w:sz="0" w:space="0" w:color="000000"/>
+              </w:pBdr>
+              <w:spacing w:after="40" w:before="40" w:line="240"/>
+              <w:ind w:left="100" w:right="100" w:firstLine="0" w:firstLineChars="0"/>
+            </w:pPr>
+            <w:r>
+              <w:rPr>
+                <w:rFonts w:ascii="DejaVu Sans" w:hAnsi="DejaVu Sans" w:eastAsia="DejaVu Sans" w:cs="DejaVu Sans"/>
+                <w:i w:val="false"/>
+                <w:b w:val="false"/>
+                <w:u w:val="none"/>
+                <w:sz w:val="18"/>
+                <w:szCs w:val="18"/>
+                <w:color w:val="000000"/>
+              </w:rPr>
               <w:t xml:space="preserve">39.07 ± 0.80</w:t>
             </w:r>
           </w:p>
@@ -1176,7 +1263,7 @@
                 <w:szCs w:val="18"/>
                 <w:color w:val="000000"/>
               </w:rPr>
-              <w:t xml:space="preserve">39.07 ± 0.80</w:t>
+              <w:t xml:space="preserve">30.18 ± 1.69</w:t>
             </w:r>
           </w:p>
         </w:tc>
@@ -1186,95 +1273,7 @@
               <w:bottom w:val="single" w:sz="4" w:space="0" w:color="999999"/>
               <w:top w:val="single" w:sz="4" w:space="0" w:color="999999"/>
               <w:left w:val="none" w:sz="0" w:space="0" w:color="000000"/>
-              <w:right w:val="none" w:sz="0" w:space="0" w:color="000000"/>
-            </w:tcBorders>
-            <w:shd w:val="clear" w:color="auto" w:fill="FFFFFF"/>
-            <w:tcMar>
-              <w:top w:w="0" w:type="dxa"/>
-              <w:bottom w:w="0" w:type="dxa"/>
-              <w:left w:w="0" w:type="dxa"/>
-              <w:right w:w="0" w:type="dxa"/>
-            </w:tcMar>
-            <w:vAlign w:val="center"/>
-          </w:tcPr>
-          <w:p>
-            <w:pPr>
-              <w:pStyle w:val="Normal"/>
-              <w:jc w:val="center"/>
-              <w:pBdr>
-                <w:bottom w:val="none" w:sz="0" w:space="0" w:color="000000"/>
-                <w:top w:val="none" w:sz="0" w:space="0" w:color="000000"/>
-                <w:left w:val="none" w:sz="0" w:space="0" w:color="000000"/>
-                <w:right w:val="none" w:sz="0" w:space="0" w:color="000000"/>
-              </w:pBdr>
-              <w:spacing w:after="40" w:before="40" w:line="240"/>
-              <w:ind w:left="100" w:right="100" w:firstLine="0" w:firstLineChars="0"/>
-            </w:pPr>
-            <w:r>
-              <w:rPr>
-                <w:rFonts w:ascii="DejaVu Sans" w:hAnsi="DejaVu Sans" w:eastAsia="DejaVu Sans" w:cs="DejaVu Sans"/>
-                <w:i w:val="false"/>
-                <w:b w:val="false"/>
-                <w:u w:val="none"/>
-                <w:sz w:val="18"/>
-                <w:szCs w:val="18"/>
-                <w:color w:val="000000"/>
-              </w:rPr>
-              <w:t xml:space="preserve">30.17 ± 1.69</w:t>
-            </w:r>
-          </w:p>
-        </w:tc>
-        <w:tc>
-          <w:tcPr>
-            <w:tcBorders>
-              <w:bottom w:val="single" w:sz="4" w:space="0" w:color="999999"/>
-              <w:top w:val="single" w:sz="4" w:space="0" w:color="999999"/>
-              <w:left w:val="none" w:sz="0" w:space="0" w:color="000000"/>
-              <w:right w:val="none" w:sz="0" w:space="0" w:color="000000"/>
-            </w:tcBorders>
-            <w:shd w:val="clear" w:color="auto" w:fill="FFFFFF"/>
-            <w:tcMar>
-              <w:top w:w="0" w:type="dxa"/>
-              <w:bottom w:w="0" w:type="dxa"/>
-              <w:left w:w="0" w:type="dxa"/>
-              <w:right w:w="0" w:type="dxa"/>
-            </w:tcMar>
-            <w:vAlign w:val="center"/>
-          </w:tcPr>
-          <w:p>
-            <w:pPr>
-              <w:pStyle w:val="Normal"/>
-              <w:jc w:val="center"/>
-              <w:pBdr>
-                <w:bottom w:val="none" w:sz="0" w:space="0" w:color="000000"/>
-                <w:top w:val="none" w:sz="0" w:space="0" w:color="000000"/>
-                <w:left w:val="none" w:sz="0" w:space="0" w:color="000000"/>
-                <w:right w:val="none" w:sz="0" w:space="0" w:color="000000"/>
-              </w:pBdr>
-              <w:spacing w:after="40" w:before="40" w:line="240"/>
-              <w:ind w:left="100" w:right="100" w:firstLine="0" w:firstLineChars="0"/>
-            </w:pPr>
-            <w:r>
-              <w:rPr>
-                <w:rFonts w:ascii="DejaVu Sans" w:hAnsi="DejaVu Sans" w:eastAsia="DejaVu Sans" w:cs="DejaVu Sans"/>
-                <w:i w:val="false"/>
-                <w:b w:val="false"/>
-                <w:u w:val="none"/>
-                <w:sz w:val="18"/>
-                <w:szCs w:val="18"/>
-                <w:color w:val="000000"/>
-              </w:rPr>
-              <w:t xml:space="preserve">30.18 ± 1.69</w:t>
-            </w:r>
-          </w:p>
-        </w:tc>
-        <w:tc>
-          <w:tcPr>
-            <w:tcBorders>
-              <w:bottom w:val="single" w:sz="4" w:space="0" w:color="999999"/>
-              <w:top w:val="single" w:sz="4" w:space="0" w:color="999999"/>
-              <w:left w:val="none" w:sz="0" w:space="0" w:color="000000"/>
-              <w:right w:val="none" w:sz="0" w:space="0" w:color="000000"/>
+              <w:right w:val="single" w:sz="6" w:space="0" w:color="000000"/>
             </w:tcBorders>
             <w:shd w:val="clear" w:color="auto" w:fill="FFFFFF"/>
             <w:tcMar>
@@ -1317,51 +1316,7 @@
             <w:tcBorders>
               <w:bottom w:val="single" w:sz="4" w:space="0" w:color="999999"/>
               <w:top w:val="single" w:sz="4" w:space="0" w:color="999999"/>
-              <w:left w:val="none" w:sz="0" w:space="0" w:color="000000"/>
-              <w:right w:val="none" w:sz="0" w:space="0" w:color="000000"/>
-            </w:tcBorders>
-            <w:shd w:val="clear" w:color="auto" w:fill="FFFFFF"/>
-            <w:tcMar>
-              <w:top w:w="0" w:type="dxa"/>
-              <w:bottom w:w="0" w:type="dxa"/>
-              <w:left w:w="0" w:type="dxa"/>
-              <w:right w:w="0" w:type="dxa"/>
-            </w:tcMar>
-            <w:vAlign w:val="center"/>
-          </w:tcPr>
-          <w:p>
-            <w:pPr>
-              <w:pStyle w:val="Normal"/>
-              <w:jc w:val="center"/>
-              <w:pBdr>
-                <w:bottom w:val="none" w:sz="0" w:space="0" w:color="000000"/>
-                <w:top w:val="none" w:sz="0" w:space="0" w:color="000000"/>
-                <w:left w:val="none" w:sz="0" w:space="0" w:color="000000"/>
-                <w:right w:val="none" w:sz="0" w:space="0" w:color="000000"/>
-              </w:pBdr>
-              <w:spacing w:after="40" w:before="40" w:line="240"/>
-              <w:ind w:left="100" w:right="100" w:firstLine="0" w:firstLineChars="0"/>
-            </w:pPr>
-            <w:r>
-              <w:rPr>
-                <w:rFonts w:ascii="DejaVu Sans" w:hAnsi="DejaVu Sans" w:eastAsia="DejaVu Sans" w:cs="DejaVu Sans"/>
-                <w:i w:val="false"/>
-                <w:b w:val="false"/>
-                <w:u w:val="none"/>
-                <w:sz w:val="18"/>
-                <w:szCs w:val="18"/>
-                <w:color w:val="000000"/>
-              </w:rPr>
-              <w:t xml:space="preserve">27.24 ± 2.42</w:t>
-            </w:r>
-          </w:p>
-        </w:tc>
-        <w:tc>
-          <w:tcPr>
-            <w:tcBorders>
-              <w:bottom w:val="single" w:sz="4" w:space="0" w:color="999999"/>
-              <w:top w:val="single" w:sz="4" w:space="0" w:color="999999"/>
-              <w:left w:val="none" w:sz="0" w:space="0" w:color="000000"/>
+              <w:left w:val="single" w:sz="6" w:space="0" w:color="000000"/>
               <w:right w:val="none" w:sz="0" w:space="0" w:color="000000"/>
             </w:tcBorders>
             <w:shd w:val="clear" w:color="auto" w:fill="FFFFFF"/>
@@ -1456,6 +1411,50 @@
               <w:bottom w:val="single" w:sz="4" w:space="0" w:color="999999"/>
               <w:top w:val="single" w:sz="4" w:space="0" w:color="999999"/>
               <w:left w:val="single" w:sz="8" w:space="0" w:color="000000"/>
+              <w:right w:val="single" w:sz="6" w:space="0" w:color="000000"/>
+            </w:tcBorders>
+            <w:shd w:val="clear" w:color="auto" w:fill="FFFFFF"/>
+            <w:tcMar>
+              <w:top w:w="0" w:type="dxa"/>
+              <w:bottom w:w="0" w:type="dxa"/>
+              <w:left w:w="0" w:type="dxa"/>
+              <w:right w:w="0" w:type="dxa"/>
+            </w:tcMar>
+            <w:vAlign w:val="center"/>
+          </w:tcPr>
+          <w:p>
+            <w:pPr>
+              <w:pStyle w:val="Normal"/>
+              <w:jc w:val="left"/>
+              <w:pBdr>
+                <w:bottom w:val="none" w:sz="0" w:space="0" w:color="000000"/>
+                <w:top w:val="none" w:sz="0" w:space="0" w:color="000000"/>
+                <w:left w:val="none" w:sz="0" w:space="0" w:color="000000"/>
+                <w:right w:val="none" w:sz="0" w:space="0" w:color="000000"/>
+              </w:pBdr>
+              <w:spacing w:after="40" w:before="40" w:line="240"/>
+              <w:ind w:left="100" w:right="100" w:firstLine="0" w:firstLineChars="0"/>
+            </w:pPr>
+            <w:r>
+              <w:rPr>
+                <w:rFonts w:ascii="DejaVu Sans" w:hAnsi="DejaVu Sans" w:eastAsia="DejaVu Sans" w:cs="DejaVu Sans"/>
+                <w:i w:val="false"/>
+                <w:b w:val="false"/>
+                <w:u w:val="none"/>
+                <w:sz w:val="18"/>
+                <w:szCs w:val="18"/>
+                <w:color w:val="000000"/>
+              </w:rPr>
+              <w:t xml:space="preserve">Birth body weight (g)</w:t>
+            </w:r>
+          </w:p>
+        </w:tc>
+        <w:tc>
+          <w:tcPr>
+            <w:tcBorders>
+              <w:bottom w:val="single" w:sz="4" w:space="0" w:color="999999"/>
+              <w:top w:val="single" w:sz="4" w:space="0" w:color="999999"/>
+              <w:left w:val="single" w:sz="6" w:space="0" w:color="000000"/>
               <w:right w:val="none" w:sz="0" w:space="0" w:color="000000"/>
             </w:tcBorders>
             <w:shd w:val="clear" w:color="auto" w:fill="FFFFFF"/>
@@ -1470,27 +1469,27 @@
           <w:p>
             <w:pPr>
               <w:pStyle w:val="Normal"/>
-              <w:jc w:val="left"/>
-              <w:pBdr>
-                <w:bottom w:val="none" w:sz="0" w:space="0" w:color="000000"/>
-                <w:top w:val="none" w:sz="0" w:space="0" w:color="000000"/>
-                <w:left w:val="none" w:sz="0" w:space="0" w:color="000000"/>
-                <w:right w:val="none" w:sz="0" w:space="0" w:color="000000"/>
-              </w:pBdr>
-              <w:spacing w:after="40" w:before="40" w:line="240"/>
-              <w:ind w:left="100" w:right="100" w:firstLine="0" w:firstLineChars="0"/>
-            </w:pPr>
-            <w:r>
-              <w:rPr>
-                <w:rFonts w:ascii="DejaVu Sans" w:hAnsi="DejaVu Sans" w:eastAsia="DejaVu Sans" w:cs="DejaVu Sans"/>
-                <w:i w:val="false"/>
-                <w:b w:val="false"/>
-                <w:u w:val="none"/>
-                <w:sz w:val="18"/>
-                <w:szCs w:val="18"/>
-                <w:color w:val="000000"/>
-              </w:rPr>
-              <w:t xml:space="preserve">Birth body weight (g)</w:t>
+              <w:jc w:val="center"/>
+              <w:pBdr>
+                <w:bottom w:val="none" w:sz="0" w:space="0" w:color="000000"/>
+                <w:top w:val="none" w:sz="0" w:space="0" w:color="000000"/>
+                <w:left w:val="none" w:sz="0" w:space="0" w:color="000000"/>
+                <w:right w:val="none" w:sz="0" w:space="0" w:color="000000"/>
+              </w:pBdr>
+              <w:spacing w:after="40" w:before="40" w:line="240"/>
+              <w:ind w:left="100" w:right="100" w:firstLine="0" w:firstLineChars="0"/>
+            </w:pPr>
+            <w:r>
+              <w:rPr>
+                <w:rFonts w:ascii="DejaVu Sans" w:hAnsi="DejaVu Sans" w:eastAsia="DejaVu Sans" w:cs="DejaVu Sans"/>
+                <w:i w:val="false"/>
+                <w:b w:val="false"/>
+                <w:u w:val="none"/>
+                <w:sz w:val="18"/>
+                <w:szCs w:val="18"/>
+                <w:color w:val="000000"/>
+              </w:rPr>
+              <w:t xml:space="preserve">3145.70 ± 367.06</w:t>
             </w:r>
           </w:p>
         </w:tc>
@@ -1534,6 +1533,94 @@
                 <w:szCs w:val="18"/>
                 <w:color w:val="000000"/>
               </w:rPr>
+              <w:t xml:space="preserve">1404.90 ± 287.17</w:t>
+            </w:r>
+          </w:p>
+        </w:tc>
+        <w:tc>
+          <w:tcPr>
+            <w:tcBorders>
+              <w:bottom w:val="single" w:sz="4" w:space="0" w:color="999999"/>
+              <w:top w:val="single" w:sz="4" w:space="0" w:color="999999"/>
+              <w:left w:val="none" w:sz="0" w:space="0" w:color="000000"/>
+              <w:right w:val="single" w:sz="6" w:space="0" w:color="000000"/>
+            </w:tcBorders>
+            <w:shd w:val="clear" w:color="auto" w:fill="FFFFFF"/>
+            <w:tcMar>
+              <w:top w:w="0" w:type="dxa"/>
+              <w:bottom w:w="0" w:type="dxa"/>
+              <w:left w:w="0" w:type="dxa"/>
+              <w:right w:w="0" w:type="dxa"/>
+            </w:tcMar>
+            <w:vAlign w:val="center"/>
+          </w:tcPr>
+          <w:p>
+            <w:pPr>
+              <w:pStyle w:val="Normal"/>
+              <w:jc w:val="center"/>
+              <w:pBdr>
+                <w:bottom w:val="none" w:sz="0" w:space="0" w:color="000000"/>
+                <w:top w:val="none" w:sz="0" w:space="0" w:color="000000"/>
+                <w:left w:val="none" w:sz="0" w:space="0" w:color="000000"/>
+                <w:right w:val="none" w:sz="0" w:space="0" w:color="000000"/>
+              </w:pBdr>
+              <w:spacing w:after="40" w:before="40" w:line="240"/>
+              <w:ind w:left="100" w:right="100" w:firstLine="0" w:firstLineChars="0"/>
+            </w:pPr>
+            <w:r>
+              <w:rPr>
+                <w:rFonts w:ascii="DejaVu Sans" w:hAnsi="DejaVu Sans" w:eastAsia="DejaVu Sans" w:cs="DejaVu Sans"/>
+                <w:i w:val="false"/>
+                <w:b w:val="false"/>
+                <w:u w:val="none"/>
+                <w:sz w:val="18"/>
+                <w:szCs w:val="18"/>
+                <w:color w:val="000000"/>
+              </w:rPr>
+              <w:t xml:space="preserve">843.47 ± 241.74</w:t>
+            </w:r>
+          </w:p>
+        </w:tc>
+        <w:tc>
+          <w:tcPr>
+            <w:tcBorders>
+              <w:bottom w:val="single" w:sz="4" w:space="0" w:color="999999"/>
+              <w:top w:val="single" w:sz="4" w:space="0" w:color="999999"/>
+              <w:left w:val="single" w:sz="6" w:space="0" w:color="000000"/>
+              <w:right w:val="none" w:sz="0" w:space="0" w:color="000000"/>
+            </w:tcBorders>
+            <w:shd w:val="clear" w:color="auto" w:fill="FFFFFF"/>
+            <w:tcMar>
+              <w:top w:w="0" w:type="dxa"/>
+              <w:bottom w:w="0" w:type="dxa"/>
+              <w:left w:w="0" w:type="dxa"/>
+              <w:right w:w="0" w:type="dxa"/>
+            </w:tcMar>
+            <w:vAlign w:val="center"/>
+          </w:tcPr>
+          <w:p>
+            <w:pPr>
+              <w:pStyle w:val="Normal"/>
+              <w:jc w:val="center"/>
+              <w:pBdr>
+                <w:bottom w:val="none" w:sz="0" w:space="0" w:color="000000"/>
+                <w:top w:val="none" w:sz="0" w:space="0" w:color="000000"/>
+                <w:left w:val="none" w:sz="0" w:space="0" w:color="000000"/>
+                <w:right w:val="none" w:sz="0" w:space="0" w:color="000000"/>
+              </w:pBdr>
+              <w:spacing w:after="40" w:before="40" w:line="240"/>
+              <w:ind w:left="100" w:right="100" w:firstLine="0" w:firstLineChars="0"/>
+            </w:pPr>
+            <w:r>
+              <w:rPr>
+                <w:rFonts w:ascii="DejaVu Sans" w:hAnsi="DejaVu Sans" w:eastAsia="DejaVu Sans" w:cs="DejaVu Sans"/>
+                <w:i w:val="false"/>
+                <w:b w:val="false"/>
+                <w:u w:val="none"/>
+                <w:sz w:val="18"/>
+                <w:szCs w:val="18"/>
+                <w:color w:val="000000"/>
+              </w:rPr>
               <w:t xml:space="preserve">3145.70 ± 367.06</w:t>
             </w:r>
           </w:p>
@@ -1578,7 +1665,7 @@
                 <w:szCs w:val="18"/>
                 <w:color w:val="000000"/>
               </w:rPr>
-              <w:t xml:space="preserve">3145.70 ± 367.06</w:t>
+              <w:t xml:space="preserve">1404.90 ± 287.17</w:t>
             </w:r>
           </w:p>
         </w:tc>
@@ -1588,139 +1675,7 @@
               <w:bottom w:val="single" w:sz="4" w:space="0" w:color="999999"/>
               <w:top w:val="single" w:sz="4" w:space="0" w:color="999999"/>
               <w:left w:val="none" w:sz="0" w:space="0" w:color="000000"/>
-              <w:right w:val="none" w:sz="0" w:space="0" w:color="000000"/>
-            </w:tcBorders>
-            <w:shd w:val="clear" w:color="auto" w:fill="FFFFFF"/>
-            <w:tcMar>
-              <w:top w:w="0" w:type="dxa"/>
-              <w:bottom w:w="0" w:type="dxa"/>
-              <w:left w:w="0" w:type="dxa"/>
-              <w:right w:w="0" w:type="dxa"/>
-            </w:tcMar>
-            <w:vAlign w:val="center"/>
-          </w:tcPr>
-          <w:p>
-            <w:pPr>
-              <w:pStyle w:val="Normal"/>
-              <w:jc w:val="center"/>
-              <w:pBdr>
-                <w:bottom w:val="none" w:sz="0" w:space="0" w:color="000000"/>
-                <w:top w:val="none" w:sz="0" w:space="0" w:color="000000"/>
-                <w:left w:val="none" w:sz="0" w:space="0" w:color="000000"/>
-                <w:right w:val="none" w:sz="0" w:space="0" w:color="000000"/>
-              </w:pBdr>
-              <w:spacing w:after="40" w:before="40" w:line="240"/>
-              <w:ind w:left="100" w:right="100" w:firstLine="0" w:firstLineChars="0"/>
-            </w:pPr>
-            <w:r>
-              <w:rPr>
-                <w:rFonts w:ascii="DejaVu Sans" w:hAnsi="DejaVu Sans" w:eastAsia="DejaVu Sans" w:cs="DejaVu Sans"/>
-                <w:i w:val="false"/>
-                <w:b w:val="false"/>
-                <w:u w:val="none"/>
-                <w:sz w:val="18"/>
-                <w:szCs w:val="18"/>
-                <w:color w:val="000000"/>
-              </w:rPr>
-              <w:t xml:space="preserve">1404.90 ± 287.17</w:t>
-            </w:r>
-          </w:p>
-        </w:tc>
-        <w:tc>
-          <w:tcPr>
-            <w:tcBorders>
-              <w:bottom w:val="single" w:sz="4" w:space="0" w:color="999999"/>
-              <w:top w:val="single" w:sz="4" w:space="0" w:color="999999"/>
-              <w:left w:val="none" w:sz="0" w:space="0" w:color="000000"/>
-              <w:right w:val="none" w:sz="0" w:space="0" w:color="000000"/>
-            </w:tcBorders>
-            <w:shd w:val="clear" w:color="auto" w:fill="FFFFFF"/>
-            <w:tcMar>
-              <w:top w:w="0" w:type="dxa"/>
-              <w:bottom w:w="0" w:type="dxa"/>
-              <w:left w:w="0" w:type="dxa"/>
-              <w:right w:w="0" w:type="dxa"/>
-            </w:tcMar>
-            <w:vAlign w:val="center"/>
-          </w:tcPr>
-          <w:p>
-            <w:pPr>
-              <w:pStyle w:val="Normal"/>
-              <w:jc w:val="center"/>
-              <w:pBdr>
-                <w:bottom w:val="none" w:sz="0" w:space="0" w:color="000000"/>
-                <w:top w:val="none" w:sz="0" w:space="0" w:color="000000"/>
-                <w:left w:val="none" w:sz="0" w:space="0" w:color="000000"/>
-                <w:right w:val="none" w:sz="0" w:space="0" w:color="000000"/>
-              </w:pBdr>
-              <w:spacing w:after="40" w:before="40" w:line="240"/>
-              <w:ind w:left="100" w:right="100" w:firstLine="0" w:firstLineChars="0"/>
-            </w:pPr>
-            <w:r>
-              <w:rPr>
-                <w:rFonts w:ascii="DejaVu Sans" w:hAnsi="DejaVu Sans" w:eastAsia="DejaVu Sans" w:cs="DejaVu Sans"/>
-                <w:i w:val="false"/>
-                <w:b w:val="false"/>
-                <w:u w:val="none"/>
-                <w:sz w:val="18"/>
-                <w:szCs w:val="18"/>
-                <w:color w:val="000000"/>
-              </w:rPr>
-              <w:t xml:space="preserve">1404.90 ± 287.17</w:t>
-            </w:r>
-          </w:p>
-        </w:tc>
-        <w:tc>
-          <w:tcPr>
-            <w:tcBorders>
-              <w:bottom w:val="single" w:sz="4" w:space="0" w:color="999999"/>
-              <w:top w:val="single" w:sz="4" w:space="0" w:color="999999"/>
-              <w:left w:val="none" w:sz="0" w:space="0" w:color="000000"/>
-              <w:right w:val="none" w:sz="0" w:space="0" w:color="000000"/>
-            </w:tcBorders>
-            <w:shd w:val="clear" w:color="auto" w:fill="FFFFFF"/>
-            <w:tcMar>
-              <w:top w:w="0" w:type="dxa"/>
-              <w:bottom w:w="0" w:type="dxa"/>
-              <w:left w:w="0" w:type="dxa"/>
-              <w:right w:w="0" w:type="dxa"/>
-            </w:tcMar>
-            <w:vAlign w:val="center"/>
-          </w:tcPr>
-          <w:p>
-            <w:pPr>
-              <w:pStyle w:val="Normal"/>
-              <w:jc w:val="center"/>
-              <w:pBdr>
-                <w:bottom w:val="none" w:sz="0" w:space="0" w:color="000000"/>
-                <w:top w:val="none" w:sz="0" w:space="0" w:color="000000"/>
-                <w:left w:val="none" w:sz="0" w:space="0" w:color="000000"/>
-                <w:right w:val="none" w:sz="0" w:space="0" w:color="000000"/>
-              </w:pBdr>
-              <w:spacing w:after="40" w:before="40" w:line="240"/>
-              <w:ind w:left="100" w:right="100" w:firstLine="0" w:firstLineChars="0"/>
-            </w:pPr>
-            <w:r>
-              <w:rPr>
-                <w:rFonts w:ascii="DejaVu Sans" w:hAnsi="DejaVu Sans" w:eastAsia="DejaVu Sans" w:cs="DejaVu Sans"/>
-                <w:i w:val="false"/>
-                <w:b w:val="false"/>
-                <w:u w:val="none"/>
-                <w:sz w:val="18"/>
-                <w:szCs w:val="18"/>
-                <w:color w:val="000000"/>
-              </w:rPr>
-              <w:t xml:space="preserve">843.47 ± 241.74</w:t>
-            </w:r>
-          </w:p>
-        </w:tc>
-        <w:tc>
-          <w:tcPr>
-            <w:tcBorders>
-              <w:bottom w:val="single" w:sz="4" w:space="0" w:color="999999"/>
-              <w:top w:val="single" w:sz="4" w:space="0" w:color="999999"/>
-              <w:left w:val="none" w:sz="0" w:space="0" w:color="000000"/>
-              <w:right w:val="none" w:sz="0" w:space="0" w:color="000000"/>
+              <w:right w:val="single" w:sz="6" w:space="0" w:color="000000"/>
             </w:tcBorders>
             <w:shd w:val="clear" w:color="auto" w:fill="FFFFFF"/>
             <w:tcMar>
@@ -1763,7 +1718,7 @@
             <w:tcBorders>
               <w:bottom w:val="single" w:sz="4" w:space="0" w:color="999999"/>
               <w:top w:val="single" w:sz="4" w:space="0" w:color="999999"/>
-              <w:left w:val="none" w:sz="0" w:space="0" w:color="000000"/>
+              <w:left w:val="single" w:sz="6" w:space="0" w:color="000000"/>
               <w:right w:val="none" w:sz="0" w:space="0" w:color="000000"/>
             </w:tcBorders>
             <w:shd w:val="clear" w:color="auto" w:fill="FFFFFF"/>
@@ -1858,6 +1813,50 @@
               <w:bottom w:val="single" w:sz="4" w:space="0" w:color="999999"/>
               <w:top w:val="single" w:sz="4" w:space="0" w:color="999999"/>
               <w:left w:val="single" w:sz="8" w:space="0" w:color="000000"/>
+              <w:right w:val="single" w:sz="6" w:space="0" w:color="000000"/>
+            </w:tcBorders>
+            <w:shd w:val="clear" w:color="auto" w:fill="FFFFFF"/>
+            <w:tcMar>
+              <w:top w:w="0" w:type="dxa"/>
+              <w:bottom w:w="0" w:type="dxa"/>
+              <w:left w:w="0" w:type="dxa"/>
+              <w:right w:w="0" w:type="dxa"/>
+            </w:tcMar>
+            <w:vAlign w:val="center"/>
+          </w:tcPr>
+          <w:p>
+            <w:pPr>
+              <w:pStyle w:val="Normal"/>
+              <w:jc w:val="left"/>
+              <w:pBdr>
+                <w:bottom w:val="none" w:sz="0" w:space="0" w:color="000000"/>
+                <w:top w:val="none" w:sz="0" w:space="0" w:color="000000"/>
+                <w:left w:val="none" w:sz="0" w:space="0" w:color="000000"/>
+                <w:right w:val="none" w:sz="0" w:space="0" w:color="000000"/>
+              </w:pBdr>
+              <w:spacing w:after="40" w:before="40" w:line="240"/>
+              <w:ind w:left="100" w:right="100" w:firstLine="0" w:firstLineChars="0"/>
+            </w:pPr>
+            <w:r>
+              <w:rPr>
+                <w:rFonts w:ascii="DejaVu Sans" w:hAnsi="DejaVu Sans" w:eastAsia="DejaVu Sans" w:cs="DejaVu Sans"/>
+                <w:i w:val="false"/>
+                <w:b w:val="false"/>
+                <w:u w:val="none"/>
+                <w:sz w:val="18"/>
+                <w:szCs w:val="18"/>
+                <w:color w:val="000000"/>
+              </w:rPr>
+              <w:t xml:space="preserve">Age corrected (month)</w:t>
+            </w:r>
+          </w:p>
+        </w:tc>
+        <w:tc>
+          <w:tcPr>
+            <w:tcBorders>
+              <w:bottom w:val="single" w:sz="4" w:space="0" w:color="999999"/>
+              <w:top w:val="single" w:sz="4" w:space="0" w:color="999999"/>
+              <w:left w:val="single" w:sz="6" w:space="0" w:color="000000"/>
               <w:right w:val="none" w:sz="0" w:space="0" w:color="000000"/>
             </w:tcBorders>
             <w:shd w:val="clear" w:color="auto" w:fill="FFFFFF"/>
@@ -1872,27 +1871,27 @@
           <w:p>
             <w:pPr>
               <w:pStyle w:val="Normal"/>
-              <w:jc w:val="left"/>
-              <w:pBdr>
-                <w:bottom w:val="none" w:sz="0" w:space="0" w:color="000000"/>
-                <w:top w:val="none" w:sz="0" w:space="0" w:color="000000"/>
-                <w:left w:val="none" w:sz="0" w:space="0" w:color="000000"/>
-                <w:right w:val="none" w:sz="0" w:space="0" w:color="000000"/>
-              </w:pBdr>
-              <w:spacing w:after="40" w:before="40" w:line="240"/>
-              <w:ind w:left="100" w:right="100" w:firstLine="0" w:firstLineChars="0"/>
-            </w:pPr>
-            <w:r>
-              <w:rPr>
-                <w:rFonts w:ascii="DejaVu Sans" w:hAnsi="DejaVu Sans" w:eastAsia="DejaVu Sans" w:cs="DejaVu Sans"/>
-                <w:i w:val="false"/>
-                <w:b w:val="false"/>
-                <w:u w:val="none"/>
-                <w:sz w:val="18"/>
-                <w:szCs w:val="18"/>
-                <w:color w:val="000000"/>
-              </w:rPr>
-              <w:t xml:space="preserve">Age corrected (month)</w:t>
+              <w:jc w:val="center"/>
+              <w:pBdr>
+                <w:bottom w:val="none" w:sz="0" w:space="0" w:color="000000"/>
+                <w:top w:val="none" w:sz="0" w:space="0" w:color="000000"/>
+                <w:left w:val="none" w:sz="0" w:space="0" w:color="000000"/>
+                <w:right w:val="none" w:sz="0" w:space="0" w:color="000000"/>
+              </w:pBdr>
+              <w:spacing w:after="40" w:before="40" w:line="240"/>
+              <w:ind w:left="100" w:right="100" w:firstLine="0" w:firstLineChars="0"/>
+            </w:pPr>
+            <w:r>
+              <w:rPr>
+                <w:rFonts w:ascii="DejaVu Sans" w:hAnsi="DejaVu Sans" w:eastAsia="DejaVu Sans" w:cs="DejaVu Sans"/>
+                <w:i w:val="false"/>
+                <w:b w:val="false"/>
+                <w:u w:val="none"/>
+                <w:sz w:val="18"/>
+                <w:szCs w:val="18"/>
+                <w:color w:val="000000"/>
+              </w:rPr>
+              <w:t xml:space="preserve">6.91 ± 1.55</w:t>
             </w:r>
           </w:p>
         </w:tc>
@@ -1936,7 +1935,95 @@
                 <w:szCs w:val="18"/>
                 <w:color w:val="000000"/>
               </w:rPr>
-              <w:t xml:space="preserve">6.91 ± 1.55</w:t>
+              <w:t xml:space="preserve">7.55 ± 2.33</w:t>
+            </w:r>
+          </w:p>
+        </w:tc>
+        <w:tc>
+          <w:tcPr>
+            <w:tcBorders>
+              <w:bottom w:val="single" w:sz="4" w:space="0" w:color="999999"/>
+              <w:top w:val="single" w:sz="4" w:space="0" w:color="999999"/>
+              <w:left w:val="none" w:sz="0" w:space="0" w:color="000000"/>
+              <w:right w:val="single" w:sz="6" w:space="0" w:color="000000"/>
+            </w:tcBorders>
+            <w:shd w:val="clear" w:color="auto" w:fill="FFFFFF"/>
+            <w:tcMar>
+              <w:top w:w="0" w:type="dxa"/>
+              <w:bottom w:w="0" w:type="dxa"/>
+              <w:left w:w="0" w:type="dxa"/>
+              <w:right w:w="0" w:type="dxa"/>
+            </w:tcMar>
+            <w:vAlign w:val="center"/>
+          </w:tcPr>
+          <w:p>
+            <w:pPr>
+              <w:pStyle w:val="Normal"/>
+              <w:jc w:val="center"/>
+              <w:pBdr>
+                <w:bottom w:val="none" w:sz="0" w:space="0" w:color="000000"/>
+                <w:top w:val="none" w:sz="0" w:space="0" w:color="000000"/>
+                <w:left w:val="none" w:sz="0" w:space="0" w:color="000000"/>
+                <w:right w:val="none" w:sz="0" w:space="0" w:color="000000"/>
+              </w:pBdr>
+              <w:spacing w:after="40" w:before="40" w:line="240"/>
+              <w:ind w:left="100" w:right="100" w:firstLine="0" w:firstLineChars="0"/>
+            </w:pPr>
+            <w:r>
+              <w:rPr>
+                <w:rFonts w:ascii="DejaVu Sans" w:hAnsi="DejaVu Sans" w:eastAsia="DejaVu Sans" w:cs="DejaVu Sans"/>
+                <w:i w:val="false"/>
+                <w:b w:val="false"/>
+                <w:u w:val="none"/>
+                <w:sz w:val="18"/>
+                <w:szCs w:val="18"/>
+                <w:color w:val="000000"/>
+              </w:rPr>
+              <w:t xml:space="preserve">7.08 ± 2.46</w:t>
+            </w:r>
+          </w:p>
+        </w:tc>
+        <w:tc>
+          <w:tcPr>
+            <w:tcBorders>
+              <w:bottom w:val="single" w:sz="4" w:space="0" w:color="999999"/>
+              <w:top w:val="single" w:sz="4" w:space="0" w:color="999999"/>
+              <w:left w:val="single" w:sz="6" w:space="0" w:color="000000"/>
+              <w:right w:val="none" w:sz="0" w:space="0" w:color="000000"/>
+            </w:tcBorders>
+            <w:shd w:val="clear" w:color="auto" w:fill="FFFFFF"/>
+            <w:tcMar>
+              <w:top w:w="0" w:type="dxa"/>
+              <w:bottom w:w="0" w:type="dxa"/>
+              <w:left w:w="0" w:type="dxa"/>
+              <w:right w:w="0" w:type="dxa"/>
+            </w:tcMar>
+            <w:vAlign w:val="center"/>
+          </w:tcPr>
+          <w:p>
+            <w:pPr>
+              <w:pStyle w:val="Normal"/>
+              <w:jc w:val="center"/>
+              <w:pBdr>
+                <w:bottom w:val="none" w:sz="0" w:space="0" w:color="000000"/>
+                <w:top w:val="none" w:sz="0" w:space="0" w:color="000000"/>
+                <w:left w:val="none" w:sz="0" w:space="0" w:color="000000"/>
+                <w:right w:val="none" w:sz="0" w:space="0" w:color="000000"/>
+              </w:pBdr>
+              <w:spacing w:after="40" w:before="40" w:line="240"/>
+              <w:ind w:left="100" w:right="100" w:firstLine="0" w:firstLineChars="0"/>
+            </w:pPr>
+            <w:r>
+              <w:rPr>
+                <w:rFonts w:ascii="DejaVu Sans" w:hAnsi="DejaVu Sans" w:eastAsia="DejaVu Sans" w:cs="DejaVu Sans"/>
+                <w:i w:val="false"/>
+                <w:b w:val="false"/>
+                <w:u w:val="none"/>
+                <w:sz w:val="18"/>
+                <w:szCs w:val="18"/>
+                <w:color w:val="000000"/>
+              </w:rPr>
+              <w:t xml:space="preserve">27.30 ± 2.59</w:t>
             </w:r>
           </w:p>
         </w:tc>
@@ -1980,7 +2067,7 @@
                 <w:szCs w:val="18"/>
                 <w:color w:val="000000"/>
               </w:rPr>
-              <w:t xml:space="preserve">27.30 ± 2.59</w:t>
+              <w:t xml:space="preserve">25.31 ± 1.00</w:t>
             </w:r>
           </w:p>
         </w:tc>
@@ -1990,139 +2077,7 @@
               <w:bottom w:val="single" w:sz="4" w:space="0" w:color="999999"/>
               <w:top w:val="single" w:sz="4" w:space="0" w:color="999999"/>
               <w:left w:val="none" w:sz="0" w:space="0" w:color="000000"/>
-              <w:right w:val="none" w:sz="0" w:space="0" w:color="000000"/>
-            </w:tcBorders>
-            <w:shd w:val="clear" w:color="auto" w:fill="FFFFFF"/>
-            <w:tcMar>
-              <w:top w:w="0" w:type="dxa"/>
-              <w:bottom w:w="0" w:type="dxa"/>
-              <w:left w:w="0" w:type="dxa"/>
-              <w:right w:w="0" w:type="dxa"/>
-            </w:tcMar>
-            <w:vAlign w:val="center"/>
-          </w:tcPr>
-          <w:p>
-            <w:pPr>
-              <w:pStyle w:val="Normal"/>
-              <w:jc w:val="center"/>
-              <w:pBdr>
-                <w:bottom w:val="none" w:sz="0" w:space="0" w:color="000000"/>
-                <w:top w:val="none" w:sz="0" w:space="0" w:color="000000"/>
-                <w:left w:val="none" w:sz="0" w:space="0" w:color="000000"/>
-                <w:right w:val="none" w:sz="0" w:space="0" w:color="000000"/>
-              </w:pBdr>
-              <w:spacing w:after="40" w:before="40" w:line="240"/>
-              <w:ind w:left="100" w:right="100" w:firstLine="0" w:firstLineChars="0"/>
-            </w:pPr>
-            <w:r>
-              <w:rPr>
-                <w:rFonts w:ascii="DejaVu Sans" w:hAnsi="DejaVu Sans" w:eastAsia="DejaVu Sans" w:cs="DejaVu Sans"/>
-                <w:i w:val="false"/>
-                <w:b w:val="false"/>
-                <w:u w:val="none"/>
-                <w:sz w:val="18"/>
-                <w:szCs w:val="18"/>
-                <w:color w:val="000000"/>
-              </w:rPr>
-              <w:t xml:space="preserve">7.55 ± 2.33</w:t>
-            </w:r>
-          </w:p>
-        </w:tc>
-        <w:tc>
-          <w:tcPr>
-            <w:tcBorders>
-              <w:bottom w:val="single" w:sz="4" w:space="0" w:color="999999"/>
-              <w:top w:val="single" w:sz="4" w:space="0" w:color="999999"/>
-              <w:left w:val="none" w:sz="0" w:space="0" w:color="000000"/>
-              <w:right w:val="none" w:sz="0" w:space="0" w:color="000000"/>
-            </w:tcBorders>
-            <w:shd w:val="clear" w:color="auto" w:fill="FFFFFF"/>
-            <w:tcMar>
-              <w:top w:w="0" w:type="dxa"/>
-              <w:bottom w:w="0" w:type="dxa"/>
-              <w:left w:w="0" w:type="dxa"/>
-              <w:right w:w="0" w:type="dxa"/>
-            </w:tcMar>
-            <w:vAlign w:val="center"/>
-          </w:tcPr>
-          <w:p>
-            <w:pPr>
-              <w:pStyle w:val="Normal"/>
-              <w:jc w:val="center"/>
-              <w:pBdr>
-                <w:bottom w:val="none" w:sz="0" w:space="0" w:color="000000"/>
-                <w:top w:val="none" w:sz="0" w:space="0" w:color="000000"/>
-                <w:left w:val="none" w:sz="0" w:space="0" w:color="000000"/>
-                <w:right w:val="none" w:sz="0" w:space="0" w:color="000000"/>
-              </w:pBdr>
-              <w:spacing w:after="40" w:before="40" w:line="240"/>
-              <w:ind w:left="100" w:right="100" w:firstLine="0" w:firstLineChars="0"/>
-            </w:pPr>
-            <w:r>
-              <w:rPr>
-                <w:rFonts w:ascii="DejaVu Sans" w:hAnsi="DejaVu Sans" w:eastAsia="DejaVu Sans" w:cs="DejaVu Sans"/>
-                <w:i w:val="false"/>
-                <w:b w:val="false"/>
-                <w:u w:val="none"/>
-                <w:sz w:val="18"/>
-                <w:szCs w:val="18"/>
-                <w:color w:val="000000"/>
-              </w:rPr>
-              <w:t xml:space="preserve">25.31 ± 1.00</w:t>
-            </w:r>
-          </w:p>
-        </w:tc>
-        <w:tc>
-          <w:tcPr>
-            <w:tcBorders>
-              <w:bottom w:val="single" w:sz="4" w:space="0" w:color="999999"/>
-              <w:top w:val="single" w:sz="4" w:space="0" w:color="999999"/>
-              <w:left w:val="none" w:sz="0" w:space="0" w:color="000000"/>
-              <w:right w:val="none" w:sz="0" w:space="0" w:color="000000"/>
-            </w:tcBorders>
-            <w:shd w:val="clear" w:color="auto" w:fill="FFFFFF"/>
-            <w:tcMar>
-              <w:top w:w="0" w:type="dxa"/>
-              <w:bottom w:w="0" w:type="dxa"/>
-              <w:left w:w="0" w:type="dxa"/>
-              <w:right w:w="0" w:type="dxa"/>
-            </w:tcMar>
-            <w:vAlign w:val="center"/>
-          </w:tcPr>
-          <w:p>
-            <w:pPr>
-              <w:pStyle w:val="Normal"/>
-              <w:jc w:val="center"/>
-              <w:pBdr>
-                <w:bottom w:val="none" w:sz="0" w:space="0" w:color="000000"/>
-                <w:top w:val="none" w:sz="0" w:space="0" w:color="000000"/>
-                <w:left w:val="none" w:sz="0" w:space="0" w:color="000000"/>
-                <w:right w:val="none" w:sz="0" w:space="0" w:color="000000"/>
-              </w:pBdr>
-              <w:spacing w:after="40" w:before="40" w:line="240"/>
-              <w:ind w:left="100" w:right="100" w:firstLine="0" w:firstLineChars="0"/>
-            </w:pPr>
-            <w:r>
-              <w:rPr>
-                <w:rFonts w:ascii="DejaVu Sans" w:hAnsi="DejaVu Sans" w:eastAsia="DejaVu Sans" w:cs="DejaVu Sans"/>
-                <w:i w:val="false"/>
-                <w:b w:val="false"/>
-                <w:u w:val="none"/>
-                <w:sz w:val="18"/>
-                <w:szCs w:val="18"/>
-                <w:color w:val="000000"/>
-              </w:rPr>
-              <w:t xml:space="preserve">7.08 ± 2.46</w:t>
-            </w:r>
-          </w:p>
-        </w:tc>
-        <w:tc>
-          <w:tcPr>
-            <w:tcBorders>
-              <w:bottom w:val="single" w:sz="4" w:space="0" w:color="999999"/>
-              <w:top w:val="single" w:sz="4" w:space="0" w:color="999999"/>
-              <w:left w:val="none" w:sz="0" w:space="0" w:color="000000"/>
-              <w:right w:val="none" w:sz="0" w:space="0" w:color="000000"/>
+              <w:right w:val="single" w:sz="6" w:space="0" w:color="000000"/>
             </w:tcBorders>
             <w:shd w:val="clear" w:color="auto" w:fill="FFFFFF"/>
             <w:tcMar>
@@ -2165,7 +2120,7 @@
             <w:tcBorders>
               <w:bottom w:val="single" w:sz="4" w:space="0" w:color="999999"/>
               <w:top w:val="single" w:sz="4" w:space="0" w:color="999999"/>
-              <w:left w:val="none" w:sz="0" w:space="0" w:color="000000"/>
+              <w:left w:val="single" w:sz="6" w:space="0" w:color="000000"/>
               <w:right w:val="none" w:sz="0" w:space="0" w:color="000000"/>
             </w:tcBorders>
             <w:shd w:val="clear" w:color="auto" w:fill="FFFFFF"/>
@@ -2260,6 +2215,50 @@
               <w:bottom w:val="single" w:sz="4" w:space="0" w:color="999999"/>
               <w:top w:val="single" w:sz="4" w:space="0" w:color="999999"/>
               <w:left w:val="single" w:sz="8" w:space="0" w:color="000000"/>
+              <w:right w:val="single" w:sz="6" w:space="0" w:color="000000"/>
+            </w:tcBorders>
+            <w:shd w:val="clear" w:color="auto" w:fill="FFFFFF"/>
+            <w:tcMar>
+              <w:top w:w="0" w:type="dxa"/>
+              <w:bottom w:w="0" w:type="dxa"/>
+              <w:left w:w="0" w:type="dxa"/>
+              <w:right w:w="0" w:type="dxa"/>
+            </w:tcMar>
+            <w:vAlign w:val="center"/>
+          </w:tcPr>
+          <w:p>
+            <w:pPr>
+              <w:pStyle w:val="Normal"/>
+              <w:jc w:val="left"/>
+              <w:pBdr>
+                <w:bottom w:val="none" w:sz="0" w:space="0" w:color="000000"/>
+                <w:top w:val="none" w:sz="0" w:space="0" w:color="000000"/>
+                <w:left w:val="none" w:sz="0" w:space="0" w:color="000000"/>
+                <w:right w:val="none" w:sz="0" w:space="0" w:color="000000"/>
+              </w:pBdr>
+              <w:spacing w:after="40" w:before="40" w:line="240"/>
+              <w:ind w:left="100" w:right="100" w:firstLine="0" w:firstLineChars="0"/>
+            </w:pPr>
+            <w:r>
+              <w:rPr>
+                <w:rFonts w:ascii="DejaVu Sans" w:hAnsi="DejaVu Sans" w:eastAsia="DejaVu Sans" w:cs="DejaVu Sans"/>
+                <w:i w:val="false"/>
+                <w:b w:val="false"/>
+                <w:u w:val="none"/>
+                <w:sz w:val="18"/>
+                <w:szCs w:val="18"/>
+                <w:color w:val="000000"/>
+              </w:rPr>
+              <w:t xml:space="preserve">Body weight (kg)</w:t>
+            </w:r>
+          </w:p>
+        </w:tc>
+        <w:tc>
+          <w:tcPr>
+            <w:tcBorders>
+              <w:bottom w:val="single" w:sz="4" w:space="0" w:color="999999"/>
+              <w:top w:val="single" w:sz="4" w:space="0" w:color="999999"/>
+              <w:left w:val="single" w:sz="6" w:space="0" w:color="000000"/>
               <w:right w:val="none" w:sz="0" w:space="0" w:color="000000"/>
             </w:tcBorders>
             <w:shd w:val="clear" w:color="auto" w:fill="FFFFFF"/>
@@ -2274,27 +2273,27 @@
           <w:p>
             <w:pPr>
               <w:pStyle w:val="Normal"/>
-              <w:jc w:val="left"/>
-              <w:pBdr>
-                <w:bottom w:val="none" w:sz="0" w:space="0" w:color="000000"/>
-                <w:top w:val="none" w:sz="0" w:space="0" w:color="000000"/>
-                <w:left w:val="none" w:sz="0" w:space="0" w:color="000000"/>
-                <w:right w:val="none" w:sz="0" w:space="0" w:color="000000"/>
-              </w:pBdr>
-              <w:spacing w:after="40" w:before="40" w:line="240"/>
-              <w:ind w:left="100" w:right="100" w:firstLine="0" w:firstLineChars="0"/>
-            </w:pPr>
-            <w:r>
-              <w:rPr>
-                <w:rFonts w:ascii="DejaVu Sans" w:hAnsi="DejaVu Sans" w:eastAsia="DejaVu Sans" w:cs="DejaVu Sans"/>
-                <w:i w:val="false"/>
-                <w:b w:val="false"/>
-                <w:u w:val="none"/>
-                <w:sz w:val="18"/>
-                <w:szCs w:val="18"/>
-                <w:color w:val="000000"/>
-              </w:rPr>
-              <w:t xml:space="preserve">Body weight (kg)</w:t>
+              <w:jc w:val="center"/>
+              <w:pBdr>
+                <w:bottom w:val="none" w:sz="0" w:space="0" w:color="000000"/>
+                <w:top w:val="none" w:sz="0" w:space="0" w:color="000000"/>
+                <w:left w:val="none" w:sz="0" w:space="0" w:color="000000"/>
+                <w:right w:val="none" w:sz="0" w:space="0" w:color="000000"/>
+              </w:pBdr>
+              <w:spacing w:after="40" w:before="40" w:line="240"/>
+              <w:ind w:left="100" w:right="100" w:firstLine="0" w:firstLineChars="0"/>
+            </w:pPr>
+            <w:r>
+              <w:rPr>
+                <w:rFonts w:ascii="DejaVu Sans" w:hAnsi="DejaVu Sans" w:eastAsia="DejaVu Sans" w:cs="DejaVu Sans"/>
+                <w:i w:val="false"/>
+                <w:b w:val="false"/>
+                <w:u w:val="none"/>
+                <w:sz w:val="18"/>
+                <w:szCs w:val="18"/>
+                <w:color w:val="000000"/>
+              </w:rPr>
+              <w:t xml:space="preserve">7.86 ± 0.84</w:t>
             </w:r>
           </w:p>
         </w:tc>
@@ -2338,7 +2337,95 @@
                 <w:szCs w:val="18"/>
                 <w:color w:val="000000"/>
               </w:rPr>
-              <w:t xml:space="preserve">7.86 ± 0.84</w:t>
+              <w:t xml:space="preserve">8.14 ± 1.03</w:t>
+            </w:r>
+          </w:p>
+        </w:tc>
+        <w:tc>
+          <w:tcPr>
+            <w:tcBorders>
+              <w:bottom w:val="single" w:sz="4" w:space="0" w:color="999999"/>
+              <w:top w:val="single" w:sz="4" w:space="0" w:color="999999"/>
+              <w:left w:val="none" w:sz="0" w:space="0" w:color="000000"/>
+              <w:right w:val="single" w:sz="6" w:space="0" w:color="000000"/>
+            </w:tcBorders>
+            <w:shd w:val="clear" w:color="auto" w:fill="FFFFFF"/>
+            <w:tcMar>
+              <w:top w:w="0" w:type="dxa"/>
+              <w:bottom w:w="0" w:type="dxa"/>
+              <w:left w:w="0" w:type="dxa"/>
+              <w:right w:w="0" w:type="dxa"/>
+            </w:tcMar>
+            <w:vAlign w:val="center"/>
+          </w:tcPr>
+          <w:p>
+            <w:pPr>
+              <w:pStyle w:val="Normal"/>
+              <w:jc w:val="center"/>
+              <w:pBdr>
+                <w:bottom w:val="none" w:sz="0" w:space="0" w:color="000000"/>
+                <w:top w:val="none" w:sz="0" w:space="0" w:color="000000"/>
+                <w:left w:val="none" w:sz="0" w:space="0" w:color="000000"/>
+                <w:right w:val="none" w:sz="0" w:space="0" w:color="000000"/>
+              </w:pBdr>
+              <w:spacing w:after="40" w:before="40" w:line="240"/>
+              <w:ind w:left="100" w:right="100" w:firstLine="0" w:firstLineChars="0"/>
+            </w:pPr>
+            <w:r>
+              <w:rPr>
+                <w:rFonts w:ascii="DejaVu Sans" w:hAnsi="DejaVu Sans" w:eastAsia="DejaVu Sans" w:cs="DejaVu Sans"/>
+                <w:i w:val="false"/>
+                <w:b w:val="false"/>
+                <w:u w:val="none"/>
+                <w:sz w:val="18"/>
+                <w:szCs w:val="18"/>
+                <w:color w:val="000000"/>
+              </w:rPr>
+              <w:t xml:space="preserve">6.80 ± 1.54</w:t>
+            </w:r>
+          </w:p>
+        </w:tc>
+        <w:tc>
+          <w:tcPr>
+            <w:tcBorders>
+              <w:bottom w:val="single" w:sz="4" w:space="0" w:color="999999"/>
+              <w:top w:val="single" w:sz="4" w:space="0" w:color="999999"/>
+              <w:left w:val="single" w:sz="6" w:space="0" w:color="000000"/>
+              <w:right w:val="none" w:sz="0" w:space="0" w:color="000000"/>
+            </w:tcBorders>
+            <w:shd w:val="clear" w:color="auto" w:fill="FFFFFF"/>
+            <w:tcMar>
+              <w:top w:w="0" w:type="dxa"/>
+              <w:bottom w:w="0" w:type="dxa"/>
+              <w:left w:w="0" w:type="dxa"/>
+              <w:right w:w="0" w:type="dxa"/>
+            </w:tcMar>
+            <w:vAlign w:val="center"/>
+          </w:tcPr>
+          <w:p>
+            <w:pPr>
+              <w:pStyle w:val="Normal"/>
+              <w:jc w:val="center"/>
+              <w:pBdr>
+                <w:bottom w:val="none" w:sz="0" w:space="0" w:color="000000"/>
+                <w:top w:val="none" w:sz="0" w:space="0" w:color="000000"/>
+                <w:left w:val="none" w:sz="0" w:space="0" w:color="000000"/>
+                <w:right w:val="none" w:sz="0" w:space="0" w:color="000000"/>
+              </w:pBdr>
+              <w:spacing w:after="40" w:before="40" w:line="240"/>
+              <w:ind w:left="100" w:right="100" w:firstLine="0" w:firstLineChars="0"/>
+            </w:pPr>
+            <w:r>
+              <w:rPr>
+                <w:rFonts w:ascii="DejaVu Sans" w:hAnsi="DejaVu Sans" w:eastAsia="DejaVu Sans" w:cs="DejaVu Sans"/>
+                <w:i w:val="false"/>
+                <w:b w:val="false"/>
+                <w:u w:val="none"/>
+                <w:sz w:val="18"/>
+                <w:szCs w:val="18"/>
+                <w:color w:val="000000"/>
+              </w:rPr>
+              <w:t xml:space="preserve">12.33 ± 1.65</w:t>
             </w:r>
           </w:p>
         </w:tc>
@@ -2382,7 +2469,7 @@
                 <w:szCs w:val="18"/>
                 <w:color w:val="000000"/>
               </w:rPr>
-              <w:t xml:space="preserve">12.33 ± 1.65</w:t>
+              <w:t xml:space="preserve">12.16 ± 1.90</w:t>
             </w:r>
           </w:p>
         </w:tc>
@@ -2392,139 +2479,7 @@
               <w:bottom w:val="single" w:sz="4" w:space="0" w:color="999999"/>
               <w:top w:val="single" w:sz="4" w:space="0" w:color="999999"/>
               <w:left w:val="none" w:sz="0" w:space="0" w:color="000000"/>
-              <w:right w:val="none" w:sz="0" w:space="0" w:color="000000"/>
-            </w:tcBorders>
-            <w:shd w:val="clear" w:color="auto" w:fill="FFFFFF"/>
-            <w:tcMar>
-              <w:top w:w="0" w:type="dxa"/>
-              <w:bottom w:w="0" w:type="dxa"/>
-              <w:left w:w="0" w:type="dxa"/>
-              <w:right w:w="0" w:type="dxa"/>
-            </w:tcMar>
-            <w:vAlign w:val="center"/>
-          </w:tcPr>
-          <w:p>
-            <w:pPr>
-              <w:pStyle w:val="Normal"/>
-              <w:jc w:val="center"/>
-              <w:pBdr>
-                <w:bottom w:val="none" w:sz="0" w:space="0" w:color="000000"/>
-                <w:top w:val="none" w:sz="0" w:space="0" w:color="000000"/>
-                <w:left w:val="none" w:sz="0" w:space="0" w:color="000000"/>
-                <w:right w:val="none" w:sz="0" w:space="0" w:color="000000"/>
-              </w:pBdr>
-              <w:spacing w:after="40" w:before="40" w:line="240"/>
-              <w:ind w:left="100" w:right="100" w:firstLine="0" w:firstLineChars="0"/>
-            </w:pPr>
-            <w:r>
-              <w:rPr>
-                <w:rFonts w:ascii="DejaVu Sans" w:hAnsi="DejaVu Sans" w:eastAsia="DejaVu Sans" w:cs="DejaVu Sans"/>
-                <w:i w:val="false"/>
-                <w:b w:val="false"/>
-                <w:u w:val="none"/>
-                <w:sz w:val="18"/>
-                <w:szCs w:val="18"/>
-                <w:color w:val="000000"/>
-              </w:rPr>
-              <w:t xml:space="preserve">8.14 ± 1.03</w:t>
-            </w:r>
-          </w:p>
-        </w:tc>
-        <w:tc>
-          <w:tcPr>
-            <w:tcBorders>
-              <w:bottom w:val="single" w:sz="4" w:space="0" w:color="999999"/>
-              <w:top w:val="single" w:sz="4" w:space="0" w:color="999999"/>
-              <w:left w:val="none" w:sz="0" w:space="0" w:color="000000"/>
-              <w:right w:val="none" w:sz="0" w:space="0" w:color="000000"/>
-            </w:tcBorders>
-            <w:shd w:val="clear" w:color="auto" w:fill="FFFFFF"/>
-            <w:tcMar>
-              <w:top w:w="0" w:type="dxa"/>
-              <w:bottom w:w="0" w:type="dxa"/>
-              <w:left w:w="0" w:type="dxa"/>
-              <w:right w:w="0" w:type="dxa"/>
-            </w:tcMar>
-            <w:vAlign w:val="center"/>
-          </w:tcPr>
-          <w:p>
-            <w:pPr>
-              <w:pStyle w:val="Normal"/>
-              <w:jc w:val="center"/>
-              <w:pBdr>
-                <w:bottom w:val="none" w:sz="0" w:space="0" w:color="000000"/>
-                <w:top w:val="none" w:sz="0" w:space="0" w:color="000000"/>
-                <w:left w:val="none" w:sz="0" w:space="0" w:color="000000"/>
-                <w:right w:val="none" w:sz="0" w:space="0" w:color="000000"/>
-              </w:pBdr>
-              <w:spacing w:after="40" w:before="40" w:line="240"/>
-              <w:ind w:left="100" w:right="100" w:firstLine="0" w:firstLineChars="0"/>
-            </w:pPr>
-            <w:r>
-              <w:rPr>
-                <w:rFonts w:ascii="DejaVu Sans" w:hAnsi="DejaVu Sans" w:eastAsia="DejaVu Sans" w:cs="DejaVu Sans"/>
-                <w:i w:val="false"/>
-                <w:b w:val="false"/>
-                <w:u w:val="none"/>
-                <w:sz w:val="18"/>
-                <w:szCs w:val="18"/>
-                <w:color w:val="000000"/>
-              </w:rPr>
-              <w:t xml:space="preserve">12.16 ± 1.90</w:t>
-            </w:r>
-          </w:p>
-        </w:tc>
-        <w:tc>
-          <w:tcPr>
-            <w:tcBorders>
-              <w:bottom w:val="single" w:sz="4" w:space="0" w:color="999999"/>
-              <w:top w:val="single" w:sz="4" w:space="0" w:color="999999"/>
-              <w:left w:val="none" w:sz="0" w:space="0" w:color="000000"/>
-              <w:right w:val="none" w:sz="0" w:space="0" w:color="000000"/>
-            </w:tcBorders>
-            <w:shd w:val="clear" w:color="auto" w:fill="FFFFFF"/>
-            <w:tcMar>
-              <w:top w:w="0" w:type="dxa"/>
-              <w:bottom w:w="0" w:type="dxa"/>
-              <w:left w:w="0" w:type="dxa"/>
-              <w:right w:w="0" w:type="dxa"/>
-            </w:tcMar>
-            <w:vAlign w:val="center"/>
-          </w:tcPr>
-          <w:p>
-            <w:pPr>
-              <w:pStyle w:val="Normal"/>
-              <w:jc w:val="center"/>
-              <w:pBdr>
-                <w:bottom w:val="none" w:sz="0" w:space="0" w:color="000000"/>
-                <w:top w:val="none" w:sz="0" w:space="0" w:color="000000"/>
-                <w:left w:val="none" w:sz="0" w:space="0" w:color="000000"/>
-                <w:right w:val="none" w:sz="0" w:space="0" w:color="000000"/>
-              </w:pBdr>
-              <w:spacing w:after="40" w:before="40" w:line="240"/>
-              <w:ind w:left="100" w:right="100" w:firstLine="0" w:firstLineChars="0"/>
-            </w:pPr>
-            <w:r>
-              <w:rPr>
-                <w:rFonts w:ascii="DejaVu Sans" w:hAnsi="DejaVu Sans" w:eastAsia="DejaVu Sans" w:cs="DejaVu Sans"/>
-                <w:i w:val="false"/>
-                <w:b w:val="false"/>
-                <w:u w:val="none"/>
-                <w:sz w:val="18"/>
-                <w:szCs w:val="18"/>
-                <w:color w:val="000000"/>
-              </w:rPr>
-              <w:t xml:space="preserve">6.80 ± 1.54</w:t>
-            </w:r>
-          </w:p>
-        </w:tc>
-        <w:tc>
-          <w:tcPr>
-            <w:tcBorders>
-              <w:bottom w:val="single" w:sz="4" w:space="0" w:color="999999"/>
-              <w:top w:val="single" w:sz="4" w:space="0" w:color="999999"/>
-              <w:left w:val="none" w:sz="0" w:space="0" w:color="000000"/>
-              <w:right w:val="none" w:sz="0" w:space="0" w:color="000000"/>
+              <w:right w:val="single" w:sz="6" w:space="0" w:color="000000"/>
             </w:tcBorders>
             <w:shd w:val="clear" w:color="auto" w:fill="FFFFFF"/>
             <w:tcMar>
@@ -2567,7 +2522,7 @@
             <w:tcBorders>
               <w:bottom w:val="single" w:sz="4" w:space="0" w:color="999999"/>
               <w:top w:val="single" w:sz="4" w:space="0" w:color="999999"/>
-              <w:left w:val="none" w:sz="0" w:space="0" w:color="000000"/>
+              <w:left w:val="single" w:sz="6" w:space="0" w:color="000000"/>
               <w:right w:val="none" w:sz="0" w:space="0" w:color="000000"/>
             </w:tcBorders>
             <w:shd w:val="clear" w:color="auto" w:fill="FFFFFF"/>
@@ -2662,6 +2617,50 @@
               <w:bottom w:val="single" w:sz="4" w:space="0" w:color="999999"/>
               <w:top w:val="single" w:sz="4" w:space="0" w:color="999999"/>
               <w:left w:val="single" w:sz="8" w:space="0" w:color="000000"/>
+              <w:right w:val="single" w:sz="6" w:space="0" w:color="000000"/>
+            </w:tcBorders>
+            <w:shd w:val="clear" w:color="auto" w:fill="FFFFFF"/>
+            <w:tcMar>
+              <w:top w:w="0" w:type="dxa"/>
+              <w:bottom w:w="0" w:type="dxa"/>
+              <w:left w:w="0" w:type="dxa"/>
+              <w:right w:w="0" w:type="dxa"/>
+            </w:tcMar>
+            <w:vAlign w:val="center"/>
+          </w:tcPr>
+          <w:p>
+            <w:pPr>
+              <w:pStyle w:val="Normal"/>
+              <w:jc w:val="left"/>
+              <w:pBdr>
+                <w:bottom w:val="none" w:sz="0" w:space="0" w:color="000000"/>
+                <w:top w:val="none" w:sz="0" w:space="0" w:color="000000"/>
+                <w:left w:val="none" w:sz="0" w:space="0" w:color="000000"/>
+                <w:right w:val="none" w:sz="0" w:space="0" w:color="000000"/>
+              </w:pBdr>
+              <w:spacing w:after="40" w:before="40" w:line="240"/>
+              <w:ind w:left="100" w:right="100" w:firstLine="0" w:firstLineChars="0"/>
+            </w:pPr>
+            <w:r>
+              <w:rPr>
+                <w:rFonts w:ascii="DejaVu Sans" w:hAnsi="DejaVu Sans" w:eastAsia="DejaVu Sans" w:cs="DejaVu Sans"/>
+                <w:i w:val="false"/>
+                <w:b w:val="false"/>
+                <w:u w:val="none"/>
+                <w:sz w:val="18"/>
+                <w:szCs w:val="18"/>
+                <w:color w:val="000000"/>
+              </w:rPr>
+              <w:t xml:space="preserve">Body height (cm)</w:t>
+            </w:r>
+          </w:p>
+        </w:tc>
+        <w:tc>
+          <w:tcPr>
+            <w:tcBorders>
+              <w:bottom w:val="single" w:sz="4" w:space="0" w:color="999999"/>
+              <w:top w:val="single" w:sz="4" w:space="0" w:color="999999"/>
+              <w:left w:val="single" w:sz="6" w:space="0" w:color="000000"/>
               <w:right w:val="none" w:sz="0" w:space="0" w:color="000000"/>
             </w:tcBorders>
             <w:shd w:val="clear" w:color="auto" w:fill="FFFFFF"/>
@@ -2676,27 +2675,27 @@
           <w:p>
             <w:pPr>
               <w:pStyle w:val="Normal"/>
-              <w:jc w:val="left"/>
-              <w:pBdr>
-                <w:bottom w:val="none" w:sz="0" w:space="0" w:color="000000"/>
-                <w:top w:val="none" w:sz="0" w:space="0" w:color="000000"/>
-                <w:left w:val="none" w:sz="0" w:space="0" w:color="000000"/>
-                <w:right w:val="none" w:sz="0" w:space="0" w:color="000000"/>
-              </w:pBdr>
-              <w:spacing w:after="40" w:before="40" w:line="240"/>
-              <w:ind w:left="100" w:right="100" w:firstLine="0" w:firstLineChars="0"/>
-            </w:pPr>
-            <w:r>
-              <w:rPr>
-                <w:rFonts w:ascii="DejaVu Sans" w:hAnsi="DejaVu Sans" w:eastAsia="DejaVu Sans" w:cs="DejaVu Sans"/>
-                <w:i w:val="false"/>
-                <w:b w:val="false"/>
-                <w:u w:val="none"/>
-                <w:sz w:val="18"/>
-                <w:szCs w:val="18"/>
-                <w:color w:val="000000"/>
-              </w:rPr>
-              <w:t xml:space="preserve">Body height (cm)</w:t>
+              <w:jc w:val="center"/>
+              <w:pBdr>
+                <w:bottom w:val="none" w:sz="0" w:space="0" w:color="000000"/>
+                <w:top w:val="none" w:sz="0" w:space="0" w:color="000000"/>
+                <w:left w:val="none" w:sz="0" w:space="0" w:color="000000"/>
+                <w:right w:val="none" w:sz="0" w:space="0" w:color="000000"/>
+              </w:pBdr>
+              <w:spacing w:after="40" w:before="40" w:line="240"/>
+              <w:ind w:left="100" w:right="100" w:firstLine="0" w:firstLineChars="0"/>
+            </w:pPr>
+            <w:r>
+              <w:rPr>
+                <w:rFonts w:ascii="DejaVu Sans" w:hAnsi="DejaVu Sans" w:eastAsia="DejaVu Sans" w:cs="DejaVu Sans"/>
+                <w:i w:val="false"/>
+                <w:b w:val="false"/>
+                <w:u w:val="none"/>
+                <w:sz w:val="18"/>
+                <w:szCs w:val="18"/>
+                <w:color w:val="000000"/>
+              </w:rPr>
+              <w:t xml:space="preserve">67.54 ± 3.40</w:t>
             </w:r>
           </w:p>
         </w:tc>
@@ -2740,7 +2739,95 @@
                 <w:szCs w:val="18"/>
                 <w:color w:val="000000"/>
               </w:rPr>
-              <w:t xml:space="preserve">67.54 ± 3.40</w:t>
+              <w:t xml:space="preserve">67.44 ± 2.94</w:t>
+            </w:r>
+          </w:p>
+        </w:tc>
+        <w:tc>
+          <w:tcPr>
+            <w:tcBorders>
+              <w:bottom w:val="single" w:sz="4" w:space="0" w:color="999999"/>
+              <w:top w:val="single" w:sz="4" w:space="0" w:color="999999"/>
+              <w:left w:val="none" w:sz="0" w:space="0" w:color="000000"/>
+              <w:right w:val="single" w:sz="6" w:space="0" w:color="000000"/>
+            </w:tcBorders>
+            <w:shd w:val="clear" w:color="auto" w:fill="FFFFFF"/>
+            <w:tcMar>
+              <w:top w:w="0" w:type="dxa"/>
+              <w:bottom w:w="0" w:type="dxa"/>
+              <w:left w:w="0" w:type="dxa"/>
+              <w:right w:w="0" w:type="dxa"/>
+            </w:tcMar>
+            <w:vAlign w:val="center"/>
+          </w:tcPr>
+          <w:p>
+            <w:pPr>
+              <w:pStyle w:val="Normal"/>
+              <w:jc w:val="center"/>
+              <w:pBdr>
+                <w:bottom w:val="none" w:sz="0" w:space="0" w:color="000000"/>
+                <w:top w:val="none" w:sz="0" w:space="0" w:color="000000"/>
+                <w:left w:val="none" w:sz="0" w:space="0" w:color="000000"/>
+                <w:right w:val="none" w:sz="0" w:space="0" w:color="000000"/>
+              </w:pBdr>
+              <w:spacing w:after="40" w:before="40" w:line="240"/>
+              <w:ind w:left="100" w:right="100" w:firstLine="0" w:firstLineChars="0"/>
+            </w:pPr>
+            <w:r>
+              <w:rPr>
+                <w:rFonts w:ascii="DejaVu Sans" w:hAnsi="DejaVu Sans" w:eastAsia="DejaVu Sans" w:cs="DejaVu Sans"/>
+                <w:i w:val="false"/>
+                <w:b w:val="false"/>
+                <w:u w:val="none"/>
+                <w:sz w:val="18"/>
+                <w:szCs w:val="18"/>
+                <w:color w:val="000000"/>
+              </w:rPr>
+              <w:t xml:space="preserve">63.83 ± 5.23</w:t>
+            </w:r>
+          </w:p>
+        </w:tc>
+        <w:tc>
+          <w:tcPr>
+            <w:tcBorders>
+              <w:bottom w:val="single" w:sz="4" w:space="0" w:color="999999"/>
+              <w:top w:val="single" w:sz="4" w:space="0" w:color="999999"/>
+              <w:left w:val="single" w:sz="6" w:space="0" w:color="000000"/>
+              <w:right w:val="none" w:sz="0" w:space="0" w:color="000000"/>
+            </w:tcBorders>
+            <w:shd w:val="clear" w:color="auto" w:fill="FFFFFF"/>
+            <w:tcMar>
+              <w:top w:w="0" w:type="dxa"/>
+              <w:bottom w:w="0" w:type="dxa"/>
+              <w:left w:w="0" w:type="dxa"/>
+              <w:right w:w="0" w:type="dxa"/>
+            </w:tcMar>
+            <w:vAlign w:val="center"/>
+          </w:tcPr>
+          <w:p>
+            <w:pPr>
+              <w:pStyle w:val="Normal"/>
+              <w:jc w:val="center"/>
+              <w:pBdr>
+                <w:bottom w:val="none" w:sz="0" w:space="0" w:color="000000"/>
+                <w:top w:val="none" w:sz="0" w:space="0" w:color="000000"/>
+                <w:left w:val="none" w:sz="0" w:space="0" w:color="000000"/>
+                <w:right w:val="none" w:sz="0" w:space="0" w:color="000000"/>
+              </w:pBdr>
+              <w:spacing w:after="40" w:before="40" w:line="240"/>
+              <w:ind w:left="100" w:right="100" w:firstLine="0" w:firstLineChars="0"/>
+            </w:pPr>
+            <w:r>
+              <w:rPr>
+                <w:rFonts w:ascii="DejaVu Sans" w:hAnsi="DejaVu Sans" w:eastAsia="DejaVu Sans" w:cs="DejaVu Sans"/>
+                <w:i w:val="false"/>
+                <w:b w:val="false"/>
+                <w:u w:val="none"/>
+                <w:sz w:val="18"/>
+                <w:szCs w:val="18"/>
+                <w:color w:val="000000"/>
+              </w:rPr>
+              <w:t xml:space="preserve">87.76 ± 4.34</w:t>
             </w:r>
           </w:p>
         </w:tc>
@@ -2784,7 +2871,7 @@
                 <w:szCs w:val="18"/>
                 <w:color w:val="000000"/>
               </w:rPr>
-              <w:t xml:space="preserve">87.76 ± 4.34</w:t>
+              <w:t xml:space="preserve">86.67 ± 3.62</w:t>
             </w:r>
           </w:p>
         </w:tc>
@@ -2794,139 +2881,7 @@
               <w:bottom w:val="single" w:sz="4" w:space="0" w:color="999999"/>
               <w:top w:val="single" w:sz="4" w:space="0" w:color="999999"/>
               <w:left w:val="none" w:sz="0" w:space="0" w:color="000000"/>
-              <w:right w:val="none" w:sz="0" w:space="0" w:color="000000"/>
-            </w:tcBorders>
-            <w:shd w:val="clear" w:color="auto" w:fill="FFFFFF"/>
-            <w:tcMar>
-              <w:top w:w="0" w:type="dxa"/>
-              <w:bottom w:w="0" w:type="dxa"/>
-              <w:left w:w="0" w:type="dxa"/>
-              <w:right w:w="0" w:type="dxa"/>
-            </w:tcMar>
-            <w:vAlign w:val="center"/>
-          </w:tcPr>
-          <w:p>
-            <w:pPr>
-              <w:pStyle w:val="Normal"/>
-              <w:jc w:val="center"/>
-              <w:pBdr>
-                <w:bottom w:val="none" w:sz="0" w:space="0" w:color="000000"/>
-                <w:top w:val="none" w:sz="0" w:space="0" w:color="000000"/>
-                <w:left w:val="none" w:sz="0" w:space="0" w:color="000000"/>
-                <w:right w:val="none" w:sz="0" w:space="0" w:color="000000"/>
-              </w:pBdr>
-              <w:spacing w:after="40" w:before="40" w:line="240"/>
-              <w:ind w:left="100" w:right="100" w:firstLine="0" w:firstLineChars="0"/>
-            </w:pPr>
-            <w:r>
-              <w:rPr>
-                <w:rFonts w:ascii="DejaVu Sans" w:hAnsi="DejaVu Sans" w:eastAsia="DejaVu Sans" w:cs="DejaVu Sans"/>
-                <w:i w:val="false"/>
-                <w:b w:val="false"/>
-                <w:u w:val="none"/>
-                <w:sz w:val="18"/>
-                <w:szCs w:val="18"/>
-                <w:color w:val="000000"/>
-              </w:rPr>
-              <w:t xml:space="preserve">67.44 ± 2.94</w:t>
-            </w:r>
-          </w:p>
-        </w:tc>
-        <w:tc>
-          <w:tcPr>
-            <w:tcBorders>
-              <w:bottom w:val="single" w:sz="4" w:space="0" w:color="999999"/>
-              <w:top w:val="single" w:sz="4" w:space="0" w:color="999999"/>
-              <w:left w:val="none" w:sz="0" w:space="0" w:color="000000"/>
-              <w:right w:val="none" w:sz="0" w:space="0" w:color="000000"/>
-            </w:tcBorders>
-            <w:shd w:val="clear" w:color="auto" w:fill="FFFFFF"/>
-            <w:tcMar>
-              <w:top w:w="0" w:type="dxa"/>
-              <w:bottom w:w="0" w:type="dxa"/>
-              <w:left w:w="0" w:type="dxa"/>
-              <w:right w:w="0" w:type="dxa"/>
-            </w:tcMar>
-            <w:vAlign w:val="center"/>
-          </w:tcPr>
-          <w:p>
-            <w:pPr>
-              <w:pStyle w:val="Normal"/>
-              <w:jc w:val="center"/>
-              <w:pBdr>
-                <w:bottom w:val="none" w:sz="0" w:space="0" w:color="000000"/>
-                <w:top w:val="none" w:sz="0" w:space="0" w:color="000000"/>
-                <w:left w:val="none" w:sz="0" w:space="0" w:color="000000"/>
-                <w:right w:val="none" w:sz="0" w:space="0" w:color="000000"/>
-              </w:pBdr>
-              <w:spacing w:after="40" w:before="40" w:line="240"/>
-              <w:ind w:left="100" w:right="100" w:firstLine="0" w:firstLineChars="0"/>
-            </w:pPr>
-            <w:r>
-              <w:rPr>
-                <w:rFonts w:ascii="DejaVu Sans" w:hAnsi="DejaVu Sans" w:eastAsia="DejaVu Sans" w:cs="DejaVu Sans"/>
-                <w:i w:val="false"/>
-                <w:b w:val="false"/>
-                <w:u w:val="none"/>
-                <w:sz w:val="18"/>
-                <w:szCs w:val="18"/>
-                <w:color w:val="000000"/>
-              </w:rPr>
-              <w:t xml:space="preserve">86.67 ± 3.62</w:t>
-            </w:r>
-          </w:p>
-        </w:tc>
-        <w:tc>
-          <w:tcPr>
-            <w:tcBorders>
-              <w:bottom w:val="single" w:sz="4" w:space="0" w:color="999999"/>
-              <w:top w:val="single" w:sz="4" w:space="0" w:color="999999"/>
-              <w:left w:val="none" w:sz="0" w:space="0" w:color="000000"/>
-              <w:right w:val="none" w:sz="0" w:space="0" w:color="000000"/>
-            </w:tcBorders>
-            <w:shd w:val="clear" w:color="auto" w:fill="FFFFFF"/>
-            <w:tcMar>
-              <w:top w:w="0" w:type="dxa"/>
-              <w:bottom w:w="0" w:type="dxa"/>
-              <w:left w:w="0" w:type="dxa"/>
-              <w:right w:w="0" w:type="dxa"/>
-            </w:tcMar>
-            <w:vAlign w:val="center"/>
-          </w:tcPr>
-          <w:p>
-            <w:pPr>
-              <w:pStyle w:val="Normal"/>
-              <w:jc w:val="center"/>
-              <w:pBdr>
-                <w:bottom w:val="none" w:sz="0" w:space="0" w:color="000000"/>
-                <w:top w:val="none" w:sz="0" w:space="0" w:color="000000"/>
-                <w:left w:val="none" w:sz="0" w:space="0" w:color="000000"/>
-                <w:right w:val="none" w:sz="0" w:space="0" w:color="000000"/>
-              </w:pBdr>
-              <w:spacing w:after="40" w:before="40" w:line="240"/>
-              <w:ind w:left="100" w:right="100" w:firstLine="0" w:firstLineChars="0"/>
-            </w:pPr>
-            <w:r>
-              <w:rPr>
-                <w:rFonts w:ascii="DejaVu Sans" w:hAnsi="DejaVu Sans" w:eastAsia="DejaVu Sans" w:cs="DejaVu Sans"/>
-                <w:i w:val="false"/>
-                <w:b w:val="false"/>
-                <w:u w:val="none"/>
-                <w:sz w:val="18"/>
-                <w:szCs w:val="18"/>
-                <w:color w:val="000000"/>
-              </w:rPr>
-              <w:t xml:space="preserve">63.83 ± 5.23</w:t>
-            </w:r>
-          </w:p>
-        </w:tc>
-        <w:tc>
-          <w:tcPr>
-            <w:tcBorders>
-              <w:bottom w:val="single" w:sz="4" w:space="0" w:color="999999"/>
-              <w:top w:val="single" w:sz="4" w:space="0" w:color="999999"/>
-              <w:left w:val="none" w:sz="0" w:space="0" w:color="000000"/>
-              <w:right w:val="none" w:sz="0" w:space="0" w:color="000000"/>
+              <w:right w:val="single" w:sz="6" w:space="0" w:color="000000"/>
             </w:tcBorders>
             <w:shd w:val="clear" w:color="auto" w:fill="FFFFFF"/>
             <w:tcMar>
@@ -2969,7 +2924,7 @@
             <w:tcBorders>
               <w:bottom w:val="single" w:sz="4" w:space="0" w:color="999999"/>
               <w:top w:val="single" w:sz="4" w:space="0" w:color="999999"/>
-              <w:left w:val="none" w:sz="0" w:space="0" w:color="000000"/>
+              <w:left w:val="single" w:sz="6" w:space="0" w:color="000000"/>
               <w:right w:val="none" w:sz="0" w:space="0" w:color="000000"/>
             </w:tcBorders>
             <w:shd w:val="clear" w:color="auto" w:fill="FFFFFF"/>
@@ -3064,6 +3019,50 @@
               <w:bottom w:val="single" w:sz="4" w:space="0" w:color="999999"/>
               <w:top w:val="single" w:sz="4" w:space="0" w:color="999999"/>
               <w:left w:val="single" w:sz="8" w:space="0" w:color="000000"/>
+              <w:right w:val="single" w:sz="6" w:space="0" w:color="000000"/>
+            </w:tcBorders>
+            <w:shd w:val="clear" w:color="auto" w:fill="FFFFFF"/>
+            <w:tcMar>
+              <w:top w:w="0" w:type="dxa"/>
+              <w:bottom w:w="0" w:type="dxa"/>
+              <w:left w:w="0" w:type="dxa"/>
+              <w:right w:w="0" w:type="dxa"/>
+            </w:tcMar>
+            <w:vAlign w:val="center"/>
+          </w:tcPr>
+          <w:p>
+            <w:pPr>
+              <w:pStyle w:val="Normal"/>
+              <w:jc w:val="left"/>
+              <w:pBdr>
+                <w:bottom w:val="none" w:sz="0" w:space="0" w:color="000000"/>
+                <w:top w:val="none" w:sz="0" w:space="0" w:color="000000"/>
+                <w:left w:val="none" w:sz="0" w:space="0" w:color="000000"/>
+                <w:right w:val="none" w:sz="0" w:space="0" w:color="000000"/>
+              </w:pBdr>
+              <w:spacing w:after="40" w:before="40" w:line="240"/>
+              <w:ind w:left="100" w:right="100" w:firstLine="0" w:firstLineChars="0"/>
+            </w:pPr>
+            <w:r>
+              <w:rPr>
+                <w:rFonts w:ascii="DejaVu Sans" w:hAnsi="DejaVu Sans" w:eastAsia="DejaVu Sans" w:cs="DejaVu Sans"/>
+                <w:i w:val="false"/>
+                <w:b w:val="false"/>
+                <w:u w:val="none"/>
+                <w:sz w:val="18"/>
+                <w:szCs w:val="18"/>
+                <w:color w:val="000000"/>
+              </w:rPr>
+              <w:t xml:space="preserve">BMI (kg/m²)</w:t>
+            </w:r>
+          </w:p>
+        </w:tc>
+        <w:tc>
+          <w:tcPr>
+            <w:tcBorders>
+              <w:bottom w:val="single" w:sz="4" w:space="0" w:color="999999"/>
+              <w:top w:val="single" w:sz="4" w:space="0" w:color="999999"/>
+              <w:left w:val="single" w:sz="6" w:space="0" w:color="000000"/>
               <w:right w:val="none" w:sz="0" w:space="0" w:color="000000"/>
             </w:tcBorders>
             <w:shd w:val="clear" w:color="auto" w:fill="FFFFFF"/>
@@ -3078,27 +3077,27 @@
           <w:p>
             <w:pPr>
               <w:pStyle w:val="Normal"/>
-              <w:jc w:val="left"/>
-              <w:pBdr>
-                <w:bottom w:val="none" w:sz="0" w:space="0" w:color="000000"/>
-                <w:top w:val="none" w:sz="0" w:space="0" w:color="000000"/>
-                <w:left w:val="none" w:sz="0" w:space="0" w:color="000000"/>
-                <w:right w:val="none" w:sz="0" w:space="0" w:color="000000"/>
-              </w:pBdr>
-              <w:spacing w:after="40" w:before="40" w:line="240"/>
-              <w:ind w:left="100" w:right="100" w:firstLine="0" w:firstLineChars="0"/>
-            </w:pPr>
-            <w:r>
-              <w:rPr>
-                <w:rFonts w:ascii="DejaVu Sans" w:hAnsi="DejaVu Sans" w:eastAsia="DejaVu Sans" w:cs="DejaVu Sans"/>
-                <w:i w:val="false"/>
-                <w:b w:val="false"/>
-                <w:u w:val="none"/>
-                <w:sz w:val="18"/>
-                <w:szCs w:val="18"/>
-                <w:color w:val="000000"/>
-              </w:rPr>
-              <w:t xml:space="preserve">BMI (kg/m²)</w:t>
+              <w:jc w:val="center"/>
+              <w:pBdr>
+                <w:bottom w:val="none" w:sz="0" w:space="0" w:color="000000"/>
+                <w:top w:val="none" w:sz="0" w:space="0" w:color="000000"/>
+                <w:left w:val="none" w:sz="0" w:space="0" w:color="000000"/>
+                <w:right w:val="none" w:sz="0" w:space="0" w:color="000000"/>
+              </w:pBdr>
+              <w:spacing w:after="40" w:before="40" w:line="240"/>
+              <w:ind w:left="100" w:right="100" w:firstLine="0" w:firstLineChars="0"/>
+            </w:pPr>
+            <w:r>
+              <w:rPr>
+                <w:rFonts w:ascii="DejaVu Sans" w:hAnsi="DejaVu Sans" w:eastAsia="DejaVu Sans" w:cs="DejaVu Sans"/>
+                <w:i w:val="false"/>
+                <w:b w:val="false"/>
+                <w:u w:val="none"/>
+                <w:sz w:val="18"/>
+                <w:szCs w:val="18"/>
+                <w:color w:val="000000"/>
+              </w:rPr>
+              <w:t xml:space="preserve">17.21 ± 1.05</w:t>
             </w:r>
           </w:p>
         </w:tc>
@@ -3142,7 +3141,95 @@
                 <w:szCs w:val="18"/>
                 <w:color w:val="000000"/>
               </w:rPr>
-              <w:t xml:space="preserve">17.21 ± 1.05</w:t>
+              <w:t xml:space="preserve">17.99 ± 1.84</w:t>
+            </w:r>
+          </w:p>
+        </w:tc>
+        <w:tc>
+          <w:tcPr>
+            <w:tcBorders>
+              <w:bottom w:val="single" w:sz="4" w:space="0" w:color="999999"/>
+              <w:top w:val="single" w:sz="4" w:space="0" w:color="999999"/>
+              <w:left w:val="none" w:sz="0" w:space="0" w:color="000000"/>
+              <w:right w:val="single" w:sz="6" w:space="0" w:color="000000"/>
+            </w:tcBorders>
+            <w:shd w:val="clear" w:color="auto" w:fill="FFFFFF"/>
+            <w:tcMar>
+              <w:top w:w="0" w:type="dxa"/>
+              <w:bottom w:w="0" w:type="dxa"/>
+              <w:left w:w="0" w:type="dxa"/>
+              <w:right w:w="0" w:type="dxa"/>
+            </w:tcMar>
+            <w:vAlign w:val="center"/>
+          </w:tcPr>
+          <w:p>
+            <w:pPr>
+              <w:pStyle w:val="Normal"/>
+              <w:jc w:val="center"/>
+              <w:pBdr>
+                <w:bottom w:val="none" w:sz="0" w:space="0" w:color="000000"/>
+                <w:top w:val="none" w:sz="0" w:space="0" w:color="000000"/>
+                <w:left w:val="none" w:sz="0" w:space="0" w:color="000000"/>
+                <w:right w:val="none" w:sz="0" w:space="0" w:color="000000"/>
+              </w:pBdr>
+              <w:spacing w:after="40" w:before="40" w:line="240"/>
+              <w:ind w:left="100" w:right="100" w:firstLine="0" w:firstLineChars="0"/>
+            </w:pPr>
+            <w:r>
+              <w:rPr>
+                <w:rFonts w:ascii="DejaVu Sans" w:hAnsi="DejaVu Sans" w:eastAsia="DejaVu Sans" w:cs="DejaVu Sans"/>
+                <w:i w:val="false"/>
+                <w:b w:val="false"/>
+                <w:u w:val="none"/>
+                <w:sz w:val="18"/>
+                <w:szCs w:val="18"/>
+                <w:color w:val="000000"/>
+              </w:rPr>
+              <w:t xml:space="preserve">16.50 ± 2.23</w:t>
+            </w:r>
+          </w:p>
+        </w:tc>
+        <w:tc>
+          <w:tcPr>
+            <w:tcBorders>
+              <w:bottom w:val="single" w:sz="4" w:space="0" w:color="999999"/>
+              <w:top w:val="single" w:sz="4" w:space="0" w:color="999999"/>
+              <w:left w:val="single" w:sz="6" w:space="0" w:color="000000"/>
+              <w:right w:val="none" w:sz="0" w:space="0" w:color="000000"/>
+            </w:tcBorders>
+            <w:shd w:val="clear" w:color="auto" w:fill="FFFFFF"/>
+            <w:tcMar>
+              <w:top w:w="0" w:type="dxa"/>
+              <w:bottom w:w="0" w:type="dxa"/>
+              <w:left w:w="0" w:type="dxa"/>
+              <w:right w:w="0" w:type="dxa"/>
+            </w:tcMar>
+            <w:vAlign w:val="center"/>
+          </w:tcPr>
+          <w:p>
+            <w:pPr>
+              <w:pStyle w:val="Normal"/>
+              <w:jc w:val="center"/>
+              <w:pBdr>
+                <w:bottom w:val="none" w:sz="0" w:space="0" w:color="000000"/>
+                <w:top w:val="none" w:sz="0" w:space="0" w:color="000000"/>
+                <w:left w:val="none" w:sz="0" w:space="0" w:color="000000"/>
+                <w:right w:val="none" w:sz="0" w:space="0" w:color="000000"/>
+              </w:pBdr>
+              <w:spacing w:after="40" w:before="40" w:line="240"/>
+              <w:ind w:left="100" w:right="100" w:firstLine="0" w:firstLineChars="0"/>
+            </w:pPr>
+            <w:r>
+              <w:rPr>
+                <w:rFonts w:ascii="DejaVu Sans" w:hAnsi="DejaVu Sans" w:eastAsia="DejaVu Sans" w:cs="DejaVu Sans"/>
+                <w:i w:val="false"/>
+                <w:b w:val="false"/>
+                <w:u w:val="none"/>
+                <w:sz w:val="18"/>
+                <w:szCs w:val="18"/>
+                <w:color w:val="000000"/>
+              </w:rPr>
+              <w:t xml:space="preserve">15.96 ± 1.37</w:t>
             </w:r>
           </w:p>
         </w:tc>
@@ -3186,7 +3273,7 @@
                 <w:szCs w:val="18"/>
                 <w:color w:val="000000"/>
               </w:rPr>
-              <w:t xml:space="preserve">15.96 ± 1.37</w:t>
+              <w:t xml:space="preserve">16.12 ± 1.62</w:t>
             </w:r>
           </w:p>
         </w:tc>
@@ -3196,139 +3283,7 @@
               <w:bottom w:val="single" w:sz="4" w:space="0" w:color="999999"/>
               <w:top w:val="single" w:sz="4" w:space="0" w:color="999999"/>
               <w:left w:val="none" w:sz="0" w:space="0" w:color="000000"/>
-              <w:right w:val="none" w:sz="0" w:space="0" w:color="000000"/>
-            </w:tcBorders>
-            <w:shd w:val="clear" w:color="auto" w:fill="FFFFFF"/>
-            <w:tcMar>
-              <w:top w:w="0" w:type="dxa"/>
-              <w:bottom w:w="0" w:type="dxa"/>
-              <w:left w:w="0" w:type="dxa"/>
-              <w:right w:w="0" w:type="dxa"/>
-            </w:tcMar>
-            <w:vAlign w:val="center"/>
-          </w:tcPr>
-          <w:p>
-            <w:pPr>
-              <w:pStyle w:val="Normal"/>
-              <w:jc w:val="center"/>
-              <w:pBdr>
-                <w:bottom w:val="none" w:sz="0" w:space="0" w:color="000000"/>
-                <w:top w:val="none" w:sz="0" w:space="0" w:color="000000"/>
-                <w:left w:val="none" w:sz="0" w:space="0" w:color="000000"/>
-                <w:right w:val="none" w:sz="0" w:space="0" w:color="000000"/>
-              </w:pBdr>
-              <w:spacing w:after="40" w:before="40" w:line="240"/>
-              <w:ind w:left="100" w:right="100" w:firstLine="0" w:firstLineChars="0"/>
-            </w:pPr>
-            <w:r>
-              <w:rPr>
-                <w:rFonts w:ascii="DejaVu Sans" w:hAnsi="DejaVu Sans" w:eastAsia="DejaVu Sans" w:cs="DejaVu Sans"/>
-                <w:i w:val="false"/>
-                <w:b w:val="false"/>
-                <w:u w:val="none"/>
-                <w:sz w:val="18"/>
-                <w:szCs w:val="18"/>
-                <w:color w:val="000000"/>
-              </w:rPr>
-              <w:t xml:space="preserve">17.99 ± 1.84</w:t>
-            </w:r>
-          </w:p>
-        </w:tc>
-        <w:tc>
-          <w:tcPr>
-            <w:tcBorders>
-              <w:bottom w:val="single" w:sz="4" w:space="0" w:color="999999"/>
-              <w:top w:val="single" w:sz="4" w:space="0" w:color="999999"/>
-              <w:left w:val="none" w:sz="0" w:space="0" w:color="000000"/>
-              <w:right w:val="none" w:sz="0" w:space="0" w:color="000000"/>
-            </w:tcBorders>
-            <w:shd w:val="clear" w:color="auto" w:fill="FFFFFF"/>
-            <w:tcMar>
-              <w:top w:w="0" w:type="dxa"/>
-              <w:bottom w:w="0" w:type="dxa"/>
-              <w:left w:w="0" w:type="dxa"/>
-              <w:right w:w="0" w:type="dxa"/>
-            </w:tcMar>
-            <w:vAlign w:val="center"/>
-          </w:tcPr>
-          <w:p>
-            <w:pPr>
-              <w:pStyle w:val="Normal"/>
-              <w:jc w:val="center"/>
-              <w:pBdr>
-                <w:bottom w:val="none" w:sz="0" w:space="0" w:color="000000"/>
-                <w:top w:val="none" w:sz="0" w:space="0" w:color="000000"/>
-                <w:left w:val="none" w:sz="0" w:space="0" w:color="000000"/>
-                <w:right w:val="none" w:sz="0" w:space="0" w:color="000000"/>
-              </w:pBdr>
-              <w:spacing w:after="40" w:before="40" w:line="240"/>
-              <w:ind w:left="100" w:right="100" w:firstLine="0" w:firstLineChars="0"/>
-            </w:pPr>
-            <w:r>
-              <w:rPr>
-                <w:rFonts w:ascii="DejaVu Sans" w:hAnsi="DejaVu Sans" w:eastAsia="DejaVu Sans" w:cs="DejaVu Sans"/>
-                <w:i w:val="false"/>
-                <w:b w:val="false"/>
-                <w:u w:val="none"/>
-                <w:sz w:val="18"/>
-                <w:szCs w:val="18"/>
-                <w:color w:val="000000"/>
-              </w:rPr>
-              <w:t xml:space="preserve">16.12 ± 1.62</w:t>
-            </w:r>
-          </w:p>
-        </w:tc>
-        <w:tc>
-          <w:tcPr>
-            <w:tcBorders>
-              <w:bottom w:val="single" w:sz="4" w:space="0" w:color="999999"/>
-              <w:top w:val="single" w:sz="4" w:space="0" w:color="999999"/>
-              <w:left w:val="none" w:sz="0" w:space="0" w:color="000000"/>
-              <w:right w:val="none" w:sz="0" w:space="0" w:color="000000"/>
-            </w:tcBorders>
-            <w:shd w:val="clear" w:color="auto" w:fill="FFFFFF"/>
-            <w:tcMar>
-              <w:top w:w="0" w:type="dxa"/>
-              <w:bottom w:w="0" w:type="dxa"/>
-              <w:left w:w="0" w:type="dxa"/>
-              <w:right w:w="0" w:type="dxa"/>
-            </w:tcMar>
-            <w:vAlign w:val="center"/>
-          </w:tcPr>
-          <w:p>
-            <w:pPr>
-              <w:pStyle w:val="Normal"/>
-              <w:jc w:val="center"/>
-              <w:pBdr>
-                <w:bottom w:val="none" w:sz="0" w:space="0" w:color="000000"/>
-                <w:top w:val="none" w:sz="0" w:space="0" w:color="000000"/>
-                <w:left w:val="none" w:sz="0" w:space="0" w:color="000000"/>
-                <w:right w:val="none" w:sz="0" w:space="0" w:color="000000"/>
-              </w:pBdr>
-              <w:spacing w:after="40" w:before="40" w:line="240"/>
-              <w:ind w:left="100" w:right="100" w:firstLine="0" w:firstLineChars="0"/>
-            </w:pPr>
-            <w:r>
-              <w:rPr>
-                <w:rFonts w:ascii="DejaVu Sans" w:hAnsi="DejaVu Sans" w:eastAsia="DejaVu Sans" w:cs="DejaVu Sans"/>
-                <w:i w:val="false"/>
-                <w:b w:val="false"/>
-                <w:u w:val="none"/>
-                <w:sz w:val="18"/>
-                <w:szCs w:val="18"/>
-                <w:color w:val="000000"/>
-              </w:rPr>
-              <w:t xml:space="preserve">16.50 ± 2.23</w:t>
-            </w:r>
-          </w:p>
-        </w:tc>
-        <w:tc>
-          <w:tcPr>
-            <w:tcBorders>
-              <w:bottom w:val="single" w:sz="4" w:space="0" w:color="999999"/>
-              <w:top w:val="single" w:sz="4" w:space="0" w:color="999999"/>
-              <w:left w:val="none" w:sz="0" w:space="0" w:color="000000"/>
-              <w:right w:val="none" w:sz="0" w:space="0" w:color="000000"/>
+              <w:right w:val="single" w:sz="6" w:space="0" w:color="000000"/>
             </w:tcBorders>
             <w:shd w:val="clear" w:color="auto" w:fill="FFFFFF"/>
             <w:tcMar>
@@ -3371,7 +3326,7 @@
             <w:tcBorders>
               <w:bottom w:val="single" w:sz="4" w:space="0" w:color="999999"/>
               <w:top w:val="single" w:sz="4" w:space="0" w:color="999999"/>
-              <w:left w:val="none" w:sz="0" w:space="0" w:color="000000"/>
+              <w:left w:val="single" w:sz="6" w:space="0" w:color="000000"/>
               <w:right w:val="none" w:sz="0" w:space="0" w:color="000000"/>
             </w:tcBorders>
             <w:shd w:val="clear" w:color="auto" w:fill="FFFFFF"/>
@@ -3466,6 +3421,50 @@
               <w:bottom w:val="single" w:sz="4" w:space="0" w:color="999999"/>
               <w:top w:val="single" w:sz="4" w:space="0" w:color="999999"/>
               <w:left w:val="single" w:sz="8" w:space="0" w:color="000000"/>
+              <w:right w:val="single" w:sz="6" w:space="0" w:color="000000"/>
+            </w:tcBorders>
+            <w:shd w:val="clear" w:color="auto" w:fill="FFFFFF"/>
+            <w:tcMar>
+              <w:top w:w="0" w:type="dxa"/>
+              <w:bottom w:w="0" w:type="dxa"/>
+              <w:left w:w="0" w:type="dxa"/>
+              <w:right w:w="0" w:type="dxa"/>
+            </w:tcMar>
+            <w:vAlign w:val="center"/>
+          </w:tcPr>
+          <w:p>
+            <w:pPr>
+              <w:pStyle w:val="Normal"/>
+              <w:jc w:val="left"/>
+              <w:pBdr>
+                <w:bottom w:val="none" w:sz="0" w:space="0" w:color="000000"/>
+                <w:top w:val="none" w:sz="0" w:space="0" w:color="000000"/>
+                <w:left w:val="none" w:sz="0" w:space="0" w:color="000000"/>
+                <w:right w:val="none" w:sz="0" w:space="0" w:color="000000"/>
+              </w:pBdr>
+              <w:spacing w:after="40" w:before="40" w:line="240"/>
+              <w:ind w:left="100" w:right="100" w:firstLine="0" w:firstLineChars="0"/>
+            </w:pPr>
+            <w:r>
+              <w:rPr>
+                <w:rFonts w:ascii="DejaVu Sans" w:hAnsi="DejaVu Sans" w:eastAsia="DejaVu Sans" w:cs="DejaVu Sans"/>
+                <w:i w:val="false"/>
+                <w:b w:val="false"/>
+                <w:u w:val="none"/>
+                <w:sz w:val="18"/>
+                <w:szCs w:val="18"/>
+                <w:color w:val="000000"/>
+              </w:rPr>
+              <w:t xml:space="preserve">Breastfeeding ≥6 months, n(%)</w:t>
+            </w:r>
+          </w:p>
+        </w:tc>
+        <w:tc>
+          <w:tcPr>
+            <w:tcBorders>
+              <w:bottom w:val="single" w:sz="4" w:space="0" w:color="999999"/>
+              <w:top w:val="single" w:sz="4" w:space="0" w:color="999999"/>
+              <w:left w:val="single" w:sz="6" w:space="0" w:color="000000"/>
               <w:right w:val="none" w:sz="0" w:space="0" w:color="000000"/>
             </w:tcBorders>
             <w:shd w:val="clear" w:color="auto" w:fill="FFFFFF"/>
@@ -3480,27 +3479,27 @@
           <w:p>
             <w:pPr>
               <w:pStyle w:val="Normal"/>
-              <w:jc w:val="left"/>
-              <w:pBdr>
-                <w:bottom w:val="none" w:sz="0" w:space="0" w:color="000000"/>
-                <w:top w:val="none" w:sz="0" w:space="0" w:color="000000"/>
-                <w:left w:val="none" w:sz="0" w:space="0" w:color="000000"/>
-                <w:right w:val="none" w:sz="0" w:space="0" w:color="000000"/>
-              </w:pBdr>
-              <w:spacing w:after="40" w:before="40" w:line="240"/>
-              <w:ind w:left="100" w:right="100" w:firstLine="0" w:firstLineChars="0"/>
-            </w:pPr>
-            <w:r>
-              <w:rPr>
-                <w:rFonts w:ascii="DejaVu Sans" w:hAnsi="DejaVu Sans" w:eastAsia="DejaVu Sans" w:cs="DejaVu Sans"/>
-                <w:i w:val="false"/>
-                <w:b w:val="false"/>
-                <w:u w:val="none"/>
-                <w:sz w:val="18"/>
-                <w:szCs w:val="18"/>
-                <w:color w:val="000000"/>
-              </w:rPr>
-              <w:t xml:space="preserve">Breastfeeding ≥6 months, n(%)</w:t>
+              <w:jc w:val="center"/>
+              <w:pBdr>
+                <w:bottom w:val="none" w:sz="0" w:space="0" w:color="000000"/>
+                <w:top w:val="none" w:sz="0" w:space="0" w:color="000000"/>
+                <w:left w:val="none" w:sz="0" w:space="0" w:color="000000"/>
+                <w:right w:val="none" w:sz="0" w:space="0" w:color="000000"/>
+              </w:pBdr>
+              <w:spacing w:after="40" w:before="40" w:line="240"/>
+              <w:ind w:left="100" w:right="100" w:firstLine="0" w:firstLineChars="0"/>
+            </w:pPr>
+            <w:r>
+              <w:rPr>
+                <w:rFonts w:ascii="DejaVu Sans" w:hAnsi="DejaVu Sans" w:eastAsia="DejaVu Sans" w:cs="DejaVu Sans"/>
+                <w:i w:val="false"/>
+                <w:b w:val="false"/>
+                <w:u w:val="none"/>
+                <w:sz w:val="18"/>
+                <w:szCs w:val="18"/>
+                <w:color w:val="000000"/>
+              </w:rPr>
+              <w:t xml:space="preserve">25 (56.8%)</w:t>
             </w:r>
           </w:p>
         </w:tc>
@@ -3544,7 +3543,95 @@
                 <w:szCs w:val="18"/>
                 <w:color w:val="000000"/>
               </w:rPr>
-              <w:t xml:space="preserve">25 (56.8%)</w:t>
+              <w:t xml:space="preserve">12 (35.3%)</w:t>
+            </w:r>
+          </w:p>
+        </w:tc>
+        <w:tc>
+          <w:tcPr>
+            <w:tcBorders>
+              <w:bottom w:val="single" w:sz="4" w:space="0" w:color="999999"/>
+              <w:top w:val="single" w:sz="4" w:space="0" w:color="999999"/>
+              <w:left w:val="none" w:sz="0" w:space="0" w:color="000000"/>
+              <w:right w:val="single" w:sz="6" w:space="0" w:color="000000"/>
+            </w:tcBorders>
+            <w:shd w:val="clear" w:color="auto" w:fill="FFFFFF"/>
+            <w:tcMar>
+              <w:top w:w="0" w:type="dxa"/>
+              <w:bottom w:w="0" w:type="dxa"/>
+              <w:left w:w="0" w:type="dxa"/>
+              <w:right w:w="0" w:type="dxa"/>
+            </w:tcMar>
+            <w:vAlign w:val="center"/>
+          </w:tcPr>
+          <w:p>
+            <w:pPr>
+              <w:pStyle w:val="Normal"/>
+              <w:jc w:val="center"/>
+              <w:pBdr>
+                <w:bottom w:val="none" w:sz="0" w:space="0" w:color="000000"/>
+                <w:top w:val="none" w:sz="0" w:space="0" w:color="000000"/>
+                <w:left w:val="none" w:sz="0" w:space="0" w:color="000000"/>
+                <w:right w:val="none" w:sz="0" w:space="0" w:color="000000"/>
+              </w:pBdr>
+              <w:spacing w:after="40" w:before="40" w:line="240"/>
+              <w:ind w:left="100" w:right="100" w:firstLine="0" w:firstLineChars="0"/>
+            </w:pPr>
+            <w:r>
+              <w:rPr>
+                <w:rFonts w:ascii="DejaVu Sans" w:hAnsi="DejaVu Sans" w:eastAsia="DejaVu Sans" w:cs="DejaVu Sans"/>
+                <w:i w:val="false"/>
+                <w:b w:val="false"/>
+                <w:u w:val="none"/>
+                <w:sz w:val="18"/>
+                <w:szCs w:val="18"/>
+                <w:color w:val="000000"/>
+              </w:rPr>
+              <w:t xml:space="preserve">17 (38.6%)</w:t>
+            </w:r>
+          </w:p>
+        </w:tc>
+        <w:tc>
+          <w:tcPr>
+            <w:tcBorders>
+              <w:bottom w:val="single" w:sz="4" w:space="0" w:color="999999"/>
+              <w:top w:val="single" w:sz="4" w:space="0" w:color="999999"/>
+              <w:left w:val="single" w:sz="6" w:space="0" w:color="000000"/>
+              <w:right w:val="none" w:sz="0" w:space="0" w:color="000000"/>
+            </w:tcBorders>
+            <w:shd w:val="clear" w:color="auto" w:fill="FFFFFF"/>
+            <w:tcMar>
+              <w:top w:w="0" w:type="dxa"/>
+              <w:bottom w:w="0" w:type="dxa"/>
+              <w:left w:w="0" w:type="dxa"/>
+              <w:right w:w="0" w:type="dxa"/>
+            </w:tcMar>
+            <w:vAlign w:val="center"/>
+          </w:tcPr>
+          <w:p>
+            <w:pPr>
+              <w:pStyle w:val="Normal"/>
+              <w:jc w:val="center"/>
+              <w:pBdr>
+                <w:bottom w:val="none" w:sz="0" w:space="0" w:color="000000"/>
+                <w:top w:val="none" w:sz="0" w:space="0" w:color="000000"/>
+                <w:left w:val="none" w:sz="0" w:space="0" w:color="000000"/>
+                <w:right w:val="none" w:sz="0" w:space="0" w:color="000000"/>
+              </w:pBdr>
+              <w:spacing w:after="40" w:before="40" w:line="240"/>
+              <w:ind w:left="100" w:right="100" w:firstLine="0" w:firstLineChars="0"/>
+            </w:pPr>
+            <w:r>
+              <w:rPr>
+                <w:rFonts w:ascii="DejaVu Sans" w:hAnsi="DejaVu Sans" w:eastAsia="DejaVu Sans" w:cs="DejaVu Sans"/>
+                <w:i w:val="false"/>
+                <w:b w:val="false"/>
+                <w:u w:val="none"/>
+                <w:sz w:val="18"/>
+                <w:szCs w:val="18"/>
+                <w:color w:val="000000"/>
+              </w:rPr>
+              <w:t xml:space="preserve">18 (54.5%)</w:t>
             </w:r>
           </w:p>
         </w:tc>
@@ -3588,7 +3675,7 @@
                 <w:szCs w:val="18"/>
                 <w:color w:val="000000"/>
               </w:rPr>
-              <w:t xml:space="preserve">18 (54.5%)</w:t>
+              <w:t xml:space="preserve">11 (40.7%)</w:t>
             </w:r>
           </w:p>
         </w:tc>
@@ -3598,139 +3685,7 @@
               <w:bottom w:val="single" w:sz="4" w:space="0" w:color="999999"/>
               <w:top w:val="single" w:sz="4" w:space="0" w:color="999999"/>
               <w:left w:val="none" w:sz="0" w:space="0" w:color="000000"/>
-              <w:right w:val="none" w:sz="0" w:space="0" w:color="000000"/>
-            </w:tcBorders>
-            <w:shd w:val="clear" w:color="auto" w:fill="FFFFFF"/>
-            <w:tcMar>
-              <w:top w:w="0" w:type="dxa"/>
-              <w:bottom w:w="0" w:type="dxa"/>
-              <w:left w:w="0" w:type="dxa"/>
-              <w:right w:w="0" w:type="dxa"/>
-            </w:tcMar>
-            <w:vAlign w:val="center"/>
-          </w:tcPr>
-          <w:p>
-            <w:pPr>
-              <w:pStyle w:val="Normal"/>
-              <w:jc w:val="center"/>
-              <w:pBdr>
-                <w:bottom w:val="none" w:sz="0" w:space="0" w:color="000000"/>
-                <w:top w:val="none" w:sz="0" w:space="0" w:color="000000"/>
-                <w:left w:val="none" w:sz="0" w:space="0" w:color="000000"/>
-                <w:right w:val="none" w:sz="0" w:space="0" w:color="000000"/>
-              </w:pBdr>
-              <w:spacing w:after="40" w:before="40" w:line="240"/>
-              <w:ind w:left="100" w:right="100" w:firstLine="0" w:firstLineChars="0"/>
-            </w:pPr>
-            <w:r>
-              <w:rPr>
-                <w:rFonts w:ascii="DejaVu Sans" w:hAnsi="DejaVu Sans" w:eastAsia="DejaVu Sans" w:cs="DejaVu Sans"/>
-                <w:i w:val="false"/>
-                <w:b w:val="false"/>
-                <w:u w:val="none"/>
-                <w:sz w:val="18"/>
-                <w:szCs w:val="18"/>
-                <w:color w:val="000000"/>
-              </w:rPr>
-              <w:t xml:space="preserve">12 (35.3%)</w:t>
-            </w:r>
-          </w:p>
-        </w:tc>
-        <w:tc>
-          <w:tcPr>
-            <w:tcBorders>
-              <w:bottom w:val="single" w:sz="4" w:space="0" w:color="999999"/>
-              <w:top w:val="single" w:sz="4" w:space="0" w:color="999999"/>
-              <w:left w:val="none" w:sz="0" w:space="0" w:color="000000"/>
-              <w:right w:val="none" w:sz="0" w:space="0" w:color="000000"/>
-            </w:tcBorders>
-            <w:shd w:val="clear" w:color="auto" w:fill="FFFFFF"/>
-            <w:tcMar>
-              <w:top w:w="0" w:type="dxa"/>
-              <w:bottom w:w="0" w:type="dxa"/>
-              <w:left w:w="0" w:type="dxa"/>
-              <w:right w:w="0" w:type="dxa"/>
-            </w:tcMar>
-            <w:vAlign w:val="center"/>
-          </w:tcPr>
-          <w:p>
-            <w:pPr>
-              <w:pStyle w:val="Normal"/>
-              <w:jc w:val="center"/>
-              <w:pBdr>
-                <w:bottom w:val="none" w:sz="0" w:space="0" w:color="000000"/>
-                <w:top w:val="none" w:sz="0" w:space="0" w:color="000000"/>
-                <w:left w:val="none" w:sz="0" w:space="0" w:color="000000"/>
-                <w:right w:val="none" w:sz="0" w:space="0" w:color="000000"/>
-              </w:pBdr>
-              <w:spacing w:after="40" w:before="40" w:line="240"/>
-              <w:ind w:left="100" w:right="100" w:firstLine="0" w:firstLineChars="0"/>
-            </w:pPr>
-            <w:r>
-              <w:rPr>
-                <w:rFonts w:ascii="DejaVu Sans" w:hAnsi="DejaVu Sans" w:eastAsia="DejaVu Sans" w:cs="DejaVu Sans"/>
-                <w:i w:val="false"/>
-                <w:b w:val="false"/>
-                <w:u w:val="none"/>
-                <w:sz w:val="18"/>
-                <w:szCs w:val="18"/>
-                <w:color w:val="000000"/>
-              </w:rPr>
-              <w:t xml:space="preserve">11 (40.7%)</w:t>
-            </w:r>
-          </w:p>
-        </w:tc>
-        <w:tc>
-          <w:tcPr>
-            <w:tcBorders>
-              <w:bottom w:val="single" w:sz="4" w:space="0" w:color="999999"/>
-              <w:top w:val="single" w:sz="4" w:space="0" w:color="999999"/>
-              <w:left w:val="none" w:sz="0" w:space="0" w:color="000000"/>
-              <w:right w:val="none" w:sz="0" w:space="0" w:color="000000"/>
-            </w:tcBorders>
-            <w:shd w:val="clear" w:color="auto" w:fill="FFFFFF"/>
-            <w:tcMar>
-              <w:top w:w="0" w:type="dxa"/>
-              <w:bottom w:w="0" w:type="dxa"/>
-              <w:left w:w="0" w:type="dxa"/>
-              <w:right w:w="0" w:type="dxa"/>
-            </w:tcMar>
-            <w:vAlign w:val="center"/>
-          </w:tcPr>
-          <w:p>
-            <w:pPr>
-              <w:pStyle w:val="Normal"/>
-              <w:jc w:val="center"/>
-              <w:pBdr>
-                <w:bottom w:val="none" w:sz="0" w:space="0" w:color="000000"/>
-                <w:top w:val="none" w:sz="0" w:space="0" w:color="000000"/>
-                <w:left w:val="none" w:sz="0" w:space="0" w:color="000000"/>
-                <w:right w:val="none" w:sz="0" w:space="0" w:color="000000"/>
-              </w:pBdr>
-              <w:spacing w:after="40" w:before="40" w:line="240"/>
-              <w:ind w:left="100" w:right="100" w:firstLine="0" w:firstLineChars="0"/>
-            </w:pPr>
-            <w:r>
-              <w:rPr>
-                <w:rFonts w:ascii="DejaVu Sans" w:hAnsi="DejaVu Sans" w:eastAsia="DejaVu Sans" w:cs="DejaVu Sans"/>
-                <w:i w:val="false"/>
-                <w:b w:val="false"/>
-                <w:u w:val="none"/>
-                <w:sz w:val="18"/>
-                <w:szCs w:val="18"/>
-                <w:color w:val="000000"/>
-              </w:rPr>
-              <w:t xml:space="preserve">17 (38.6%)</w:t>
-            </w:r>
-          </w:p>
-        </w:tc>
-        <w:tc>
-          <w:tcPr>
-            <w:tcBorders>
-              <w:bottom w:val="single" w:sz="4" w:space="0" w:color="999999"/>
-              <w:top w:val="single" w:sz="4" w:space="0" w:color="999999"/>
-              <w:left w:val="none" w:sz="0" w:space="0" w:color="000000"/>
-              <w:right w:val="none" w:sz="0" w:space="0" w:color="000000"/>
+              <w:right w:val="single" w:sz="6" w:space="0" w:color="000000"/>
             </w:tcBorders>
             <w:shd w:val="clear" w:color="auto" w:fill="FFFFFF"/>
             <w:tcMar>
@@ -3773,7 +3728,7 @@
             <w:tcBorders>
               <w:bottom w:val="single" w:sz="4" w:space="0" w:color="999999"/>
               <w:top w:val="single" w:sz="4" w:space="0" w:color="999999"/>
-              <w:left w:val="none" w:sz="0" w:space="0" w:color="000000"/>
+              <w:left w:val="single" w:sz="6" w:space="0" w:color="000000"/>
               <w:right w:val="none" w:sz="0" w:space="0" w:color="000000"/>
             </w:tcBorders>
             <w:shd w:val="clear" w:color="auto" w:fill="FFFFFF"/>
@@ -3868,6 +3823,50 @@
               <w:bottom w:val="single" w:sz="8" w:space="0" w:color="000000"/>
               <w:top w:val="single" w:sz="4" w:space="0" w:color="999999"/>
               <w:left w:val="single" w:sz="8" w:space="0" w:color="000000"/>
+              <w:right w:val="single" w:sz="6" w:space="0" w:color="000000"/>
+            </w:tcBorders>
+            <w:shd w:val="clear" w:color="auto" w:fill="FFFFFF"/>
+            <w:tcMar>
+              <w:top w:w="0" w:type="dxa"/>
+              <w:bottom w:w="0" w:type="dxa"/>
+              <w:left w:w="0" w:type="dxa"/>
+              <w:right w:w="0" w:type="dxa"/>
+            </w:tcMar>
+            <w:vAlign w:val="center"/>
+          </w:tcPr>
+          <w:p>
+            <w:pPr>
+              <w:pStyle w:val="Normal"/>
+              <w:jc w:val="left"/>
+              <w:pBdr>
+                <w:bottom w:val="none" w:sz="0" w:space="0" w:color="000000"/>
+                <w:top w:val="none" w:sz="0" w:space="0" w:color="000000"/>
+                <w:left w:val="none" w:sz="0" w:space="0" w:color="000000"/>
+                <w:right w:val="none" w:sz="0" w:space="0" w:color="000000"/>
+              </w:pBdr>
+              <w:spacing w:after="40" w:before="40" w:line="240"/>
+              <w:ind w:left="100" w:right="100" w:firstLine="0" w:firstLineChars="0"/>
+            </w:pPr>
+            <w:r>
+              <w:rPr>
+                <w:rFonts w:ascii="DejaVu Sans" w:hAnsi="DejaVu Sans" w:eastAsia="DejaVu Sans" w:cs="DejaVu Sans"/>
+                <w:i w:val="false"/>
+                <w:b w:val="false"/>
+                <w:u w:val="none"/>
+                <w:sz w:val="18"/>
+                <w:szCs w:val="18"/>
+                <w:color w:val="000000"/>
+              </w:rPr>
+              <w:t xml:space="preserve">Sepsis ever, n(%)</w:t>
+            </w:r>
+          </w:p>
+        </w:tc>
+        <w:tc>
+          <w:tcPr>
+            <w:tcBorders>
+              <w:bottom w:val="single" w:sz="8" w:space="0" w:color="000000"/>
+              <w:top w:val="single" w:sz="4" w:space="0" w:color="999999"/>
+              <w:left w:val="single" w:sz="6" w:space="0" w:color="000000"/>
               <w:right w:val="none" w:sz="0" w:space="0" w:color="000000"/>
             </w:tcBorders>
             <w:shd w:val="clear" w:color="auto" w:fill="FFFFFF"/>
@@ -3882,27 +3881,27 @@
           <w:p>
             <w:pPr>
               <w:pStyle w:val="Normal"/>
-              <w:jc w:val="left"/>
-              <w:pBdr>
-                <w:bottom w:val="none" w:sz="0" w:space="0" w:color="000000"/>
-                <w:top w:val="none" w:sz="0" w:space="0" w:color="000000"/>
-                <w:left w:val="none" w:sz="0" w:space="0" w:color="000000"/>
-                <w:right w:val="none" w:sz="0" w:space="0" w:color="000000"/>
-              </w:pBdr>
-              <w:spacing w:after="40" w:before="40" w:line="240"/>
-              <w:ind w:left="100" w:right="100" w:firstLine="0" w:firstLineChars="0"/>
-            </w:pPr>
-            <w:r>
-              <w:rPr>
-                <w:rFonts w:ascii="DejaVu Sans" w:hAnsi="DejaVu Sans" w:eastAsia="DejaVu Sans" w:cs="DejaVu Sans"/>
-                <w:i w:val="false"/>
-                <w:b w:val="false"/>
-                <w:u w:val="none"/>
-                <w:sz w:val="18"/>
-                <w:szCs w:val="18"/>
-                <w:color w:val="000000"/>
-              </w:rPr>
-              <w:t xml:space="preserve">Sepsis ever, n(%)</w:t>
+              <w:jc w:val="center"/>
+              <w:pBdr>
+                <w:bottom w:val="none" w:sz="0" w:space="0" w:color="000000"/>
+                <w:top w:val="none" w:sz="0" w:space="0" w:color="000000"/>
+                <w:left w:val="none" w:sz="0" w:space="0" w:color="000000"/>
+                <w:right w:val="none" w:sz="0" w:space="0" w:color="000000"/>
+              </w:pBdr>
+              <w:spacing w:after="40" w:before="40" w:line="240"/>
+              <w:ind w:left="100" w:right="100" w:firstLine="0" w:firstLineChars="0"/>
+            </w:pPr>
+            <w:r>
+              <w:rPr>
+                <w:rFonts w:ascii="DejaVu Sans" w:hAnsi="DejaVu Sans" w:eastAsia="DejaVu Sans" w:cs="DejaVu Sans"/>
+                <w:i w:val="false"/>
+                <w:b w:val="false"/>
+                <w:u w:val="none"/>
+                <w:sz w:val="18"/>
+                <w:szCs w:val="18"/>
+                <w:color w:val="000000"/>
+              </w:rPr>
+              <w:t xml:space="preserve">1 (2.3%)</w:t>
             </w:r>
           </w:p>
         </w:tc>
@@ -3946,7 +3945,95 @@
                 <w:szCs w:val="18"/>
                 <w:color w:val="000000"/>
               </w:rPr>
-              <w:t xml:space="preserve">1 (2.3%)</w:t>
+              <w:t xml:space="preserve">9 (26.5%)</w:t>
+            </w:r>
+          </w:p>
+        </w:tc>
+        <w:tc>
+          <w:tcPr>
+            <w:tcBorders>
+              <w:bottom w:val="single" w:sz="8" w:space="0" w:color="000000"/>
+              <w:top w:val="single" w:sz="4" w:space="0" w:color="999999"/>
+              <w:left w:val="none" w:sz="0" w:space="0" w:color="000000"/>
+              <w:right w:val="single" w:sz="6" w:space="0" w:color="000000"/>
+            </w:tcBorders>
+            <w:shd w:val="clear" w:color="auto" w:fill="FFFFFF"/>
+            <w:tcMar>
+              <w:top w:w="0" w:type="dxa"/>
+              <w:bottom w:w="0" w:type="dxa"/>
+              <w:left w:w="0" w:type="dxa"/>
+              <w:right w:w="0" w:type="dxa"/>
+            </w:tcMar>
+            <w:vAlign w:val="center"/>
+          </w:tcPr>
+          <w:p>
+            <w:pPr>
+              <w:pStyle w:val="Normal"/>
+              <w:jc w:val="center"/>
+              <w:pBdr>
+                <w:bottom w:val="none" w:sz="0" w:space="0" w:color="000000"/>
+                <w:top w:val="none" w:sz="0" w:space="0" w:color="000000"/>
+                <w:left w:val="none" w:sz="0" w:space="0" w:color="000000"/>
+                <w:right w:val="none" w:sz="0" w:space="0" w:color="000000"/>
+              </w:pBdr>
+              <w:spacing w:after="40" w:before="40" w:line="240"/>
+              <w:ind w:left="100" w:right="100" w:firstLine="0" w:firstLineChars="0"/>
+            </w:pPr>
+            <w:r>
+              <w:rPr>
+                <w:rFonts w:ascii="DejaVu Sans" w:hAnsi="DejaVu Sans" w:eastAsia="DejaVu Sans" w:cs="DejaVu Sans"/>
+                <w:i w:val="false"/>
+                <w:b w:val="false"/>
+                <w:u w:val="none"/>
+                <w:sz w:val="18"/>
+                <w:szCs w:val="18"/>
+                <w:color w:val="000000"/>
+              </w:rPr>
+              <w:t xml:space="preserve">33 (76.7%)</w:t>
+            </w:r>
+          </w:p>
+        </w:tc>
+        <w:tc>
+          <w:tcPr>
+            <w:tcBorders>
+              <w:bottom w:val="single" w:sz="8" w:space="0" w:color="000000"/>
+              <w:top w:val="single" w:sz="4" w:space="0" w:color="999999"/>
+              <w:left w:val="single" w:sz="6" w:space="0" w:color="000000"/>
+              <w:right w:val="none" w:sz="0" w:space="0" w:color="000000"/>
+            </w:tcBorders>
+            <w:shd w:val="clear" w:color="auto" w:fill="FFFFFF"/>
+            <w:tcMar>
+              <w:top w:w="0" w:type="dxa"/>
+              <w:bottom w:w="0" w:type="dxa"/>
+              <w:left w:w="0" w:type="dxa"/>
+              <w:right w:w="0" w:type="dxa"/>
+            </w:tcMar>
+            <w:vAlign w:val="center"/>
+          </w:tcPr>
+          <w:p>
+            <w:pPr>
+              <w:pStyle w:val="Normal"/>
+              <w:jc w:val="center"/>
+              <w:pBdr>
+                <w:bottom w:val="none" w:sz="0" w:space="0" w:color="000000"/>
+                <w:top w:val="none" w:sz="0" w:space="0" w:color="000000"/>
+                <w:left w:val="none" w:sz="0" w:space="0" w:color="000000"/>
+                <w:right w:val="none" w:sz="0" w:space="0" w:color="000000"/>
+              </w:pBdr>
+              <w:spacing w:after="40" w:before="40" w:line="240"/>
+              <w:ind w:left="100" w:right="100" w:firstLine="0" w:firstLineChars="0"/>
+            </w:pPr>
+            <w:r>
+              <w:rPr>
+                <w:rFonts w:ascii="DejaVu Sans" w:hAnsi="DejaVu Sans" w:eastAsia="DejaVu Sans" w:cs="DejaVu Sans"/>
+                <w:i w:val="false"/>
+                <w:b w:val="false"/>
+                <w:u w:val="none"/>
+                <w:sz w:val="18"/>
+                <w:szCs w:val="18"/>
+                <w:color w:val="000000"/>
+              </w:rPr>
+              <w:t xml:space="preserve">1 (2.0%)</w:t>
             </w:r>
           </w:p>
         </w:tc>
@@ -3990,7 +4077,7 @@
                 <w:szCs w:val="18"/>
                 <w:color w:val="000000"/>
               </w:rPr>
-              <w:t xml:space="preserve">1 (2.0%)</w:t>
+              <w:t xml:space="preserve">11 (27.5%)</w:t>
             </w:r>
           </w:p>
         </w:tc>
@@ -4000,41 +4087,41 @@
               <w:bottom w:val="single" w:sz="8" w:space="0" w:color="000000"/>
               <w:top w:val="single" w:sz="4" w:space="0" w:color="999999"/>
               <w:left w:val="none" w:sz="0" w:space="0" w:color="000000"/>
-              <w:right w:val="none" w:sz="0" w:space="0" w:color="000000"/>
-            </w:tcBorders>
-            <w:shd w:val="clear" w:color="auto" w:fill="FFFFFF"/>
-            <w:tcMar>
-              <w:top w:w="0" w:type="dxa"/>
-              <w:bottom w:w="0" w:type="dxa"/>
-              <w:left w:w="0" w:type="dxa"/>
-              <w:right w:w="0" w:type="dxa"/>
-            </w:tcMar>
-            <w:vAlign w:val="center"/>
-          </w:tcPr>
-          <w:p>
-            <w:pPr>
-              <w:pStyle w:val="Normal"/>
-              <w:jc w:val="center"/>
-              <w:pBdr>
-                <w:bottom w:val="none" w:sz="0" w:space="0" w:color="000000"/>
-                <w:top w:val="none" w:sz="0" w:space="0" w:color="000000"/>
-                <w:left w:val="none" w:sz="0" w:space="0" w:color="000000"/>
-                <w:right w:val="none" w:sz="0" w:space="0" w:color="000000"/>
-              </w:pBdr>
-              <w:spacing w:after="40" w:before="40" w:line="240"/>
-              <w:ind w:left="100" w:right="100" w:firstLine="0" w:firstLineChars="0"/>
-            </w:pPr>
-            <w:r>
-              <w:rPr>
-                <w:rFonts w:ascii="DejaVu Sans" w:hAnsi="DejaVu Sans" w:eastAsia="DejaVu Sans" w:cs="DejaVu Sans"/>
-                <w:i w:val="false"/>
-                <w:b w:val="false"/>
-                <w:u w:val="none"/>
-                <w:sz w:val="18"/>
-                <w:szCs w:val="18"/>
-                <w:color w:val="000000"/>
-              </w:rPr>
-              <w:t xml:space="preserve">9 (26.5%)</w:t>
+              <w:right w:val="single" w:sz="6" w:space="0" w:color="000000"/>
+            </w:tcBorders>
+            <w:shd w:val="clear" w:color="auto" w:fill="FFFFFF"/>
+            <w:tcMar>
+              <w:top w:w="0" w:type="dxa"/>
+              <w:bottom w:w="0" w:type="dxa"/>
+              <w:left w:w="0" w:type="dxa"/>
+              <w:right w:w="0" w:type="dxa"/>
+            </w:tcMar>
+            <w:vAlign w:val="center"/>
+          </w:tcPr>
+          <w:p>
+            <w:pPr>
+              <w:pStyle w:val="Normal"/>
+              <w:jc w:val="center"/>
+              <w:pBdr>
+                <w:bottom w:val="none" w:sz="0" w:space="0" w:color="000000"/>
+                <w:top w:val="none" w:sz="0" w:space="0" w:color="000000"/>
+                <w:left w:val="none" w:sz="0" w:space="0" w:color="000000"/>
+                <w:right w:val="none" w:sz="0" w:space="0" w:color="000000"/>
+              </w:pBdr>
+              <w:spacing w:after="40" w:before="40" w:line="240"/>
+              <w:ind w:left="100" w:right="100" w:firstLine="0" w:firstLineChars="0"/>
+            </w:pPr>
+            <w:r>
+              <w:rPr>
+                <w:rFonts w:ascii="DejaVu Sans" w:hAnsi="DejaVu Sans" w:eastAsia="DejaVu Sans" w:cs="DejaVu Sans"/>
+                <w:i w:val="false"/>
+                <w:b w:val="false"/>
+                <w:u w:val="none"/>
+                <w:sz w:val="18"/>
+                <w:szCs w:val="18"/>
+                <w:color w:val="000000"/>
+              </w:rPr>
+              <w:t xml:space="preserve">35 (72.9%)</w:t>
             </w:r>
           </w:p>
         </w:tc>
@@ -4043,139 +4130,7 @@
             <w:tcBorders>
               <w:bottom w:val="single" w:sz="8" w:space="0" w:color="000000"/>
               <w:top w:val="single" w:sz="4" w:space="0" w:color="999999"/>
-              <w:left w:val="none" w:sz="0" w:space="0" w:color="000000"/>
-              <w:right w:val="none" w:sz="0" w:space="0" w:color="000000"/>
-            </w:tcBorders>
-            <w:shd w:val="clear" w:color="auto" w:fill="FFFFFF"/>
-            <w:tcMar>
-              <w:top w:w="0" w:type="dxa"/>
-              <w:bottom w:w="0" w:type="dxa"/>
-              <w:left w:w="0" w:type="dxa"/>
-              <w:right w:w="0" w:type="dxa"/>
-            </w:tcMar>
-            <w:vAlign w:val="center"/>
-          </w:tcPr>
-          <w:p>
-            <w:pPr>
-              <w:pStyle w:val="Normal"/>
-              <w:jc w:val="center"/>
-              <w:pBdr>
-                <w:bottom w:val="none" w:sz="0" w:space="0" w:color="000000"/>
-                <w:top w:val="none" w:sz="0" w:space="0" w:color="000000"/>
-                <w:left w:val="none" w:sz="0" w:space="0" w:color="000000"/>
-                <w:right w:val="none" w:sz="0" w:space="0" w:color="000000"/>
-              </w:pBdr>
-              <w:spacing w:after="40" w:before="40" w:line="240"/>
-              <w:ind w:left="100" w:right="100" w:firstLine="0" w:firstLineChars="0"/>
-            </w:pPr>
-            <w:r>
-              <w:rPr>
-                <w:rFonts w:ascii="DejaVu Sans" w:hAnsi="DejaVu Sans" w:eastAsia="DejaVu Sans" w:cs="DejaVu Sans"/>
-                <w:i w:val="false"/>
-                <w:b w:val="false"/>
-                <w:u w:val="none"/>
-                <w:sz w:val="18"/>
-                <w:szCs w:val="18"/>
-                <w:color w:val="000000"/>
-              </w:rPr>
-              <w:t xml:space="preserve">11 (27.5%)</w:t>
-            </w:r>
-          </w:p>
-        </w:tc>
-        <w:tc>
-          <w:tcPr>
-            <w:tcBorders>
-              <w:bottom w:val="single" w:sz="8" w:space="0" w:color="000000"/>
-              <w:top w:val="single" w:sz="4" w:space="0" w:color="999999"/>
-              <w:left w:val="none" w:sz="0" w:space="0" w:color="000000"/>
-              <w:right w:val="none" w:sz="0" w:space="0" w:color="000000"/>
-            </w:tcBorders>
-            <w:shd w:val="clear" w:color="auto" w:fill="FFFFFF"/>
-            <w:tcMar>
-              <w:top w:w="0" w:type="dxa"/>
-              <w:bottom w:w="0" w:type="dxa"/>
-              <w:left w:w="0" w:type="dxa"/>
-              <w:right w:w="0" w:type="dxa"/>
-            </w:tcMar>
-            <w:vAlign w:val="center"/>
-          </w:tcPr>
-          <w:p>
-            <w:pPr>
-              <w:pStyle w:val="Normal"/>
-              <w:jc w:val="center"/>
-              <w:pBdr>
-                <w:bottom w:val="none" w:sz="0" w:space="0" w:color="000000"/>
-                <w:top w:val="none" w:sz="0" w:space="0" w:color="000000"/>
-                <w:left w:val="none" w:sz="0" w:space="0" w:color="000000"/>
-                <w:right w:val="none" w:sz="0" w:space="0" w:color="000000"/>
-              </w:pBdr>
-              <w:spacing w:after="40" w:before="40" w:line="240"/>
-              <w:ind w:left="100" w:right="100" w:firstLine="0" w:firstLineChars="0"/>
-            </w:pPr>
-            <w:r>
-              <w:rPr>
-                <w:rFonts w:ascii="DejaVu Sans" w:hAnsi="DejaVu Sans" w:eastAsia="DejaVu Sans" w:cs="DejaVu Sans"/>
-                <w:i w:val="false"/>
-                <w:b w:val="false"/>
-                <w:u w:val="none"/>
-                <w:sz w:val="18"/>
-                <w:szCs w:val="18"/>
-                <w:color w:val="000000"/>
-              </w:rPr>
-              <w:t xml:space="preserve">33 (76.7%)</w:t>
-            </w:r>
-          </w:p>
-        </w:tc>
-        <w:tc>
-          <w:tcPr>
-            <w:tcBorders>
-              <w:bottom w:val="single" w:sz="8" w:space="0" w:color="000000"/>
-              <w:top w:val="single" w:sz="4" w:space="0" w:color="999999"/>
-              <w:left w:val="none" w:sz="0" w:space="0" w:color="000000"/>
-              <w:right w:val="none" w:sz="0" w:space="0" w:color="000000"/>
-            </w:tcBorders>
-            <w:shd w:val="clear" w:color="auto" w:fill="FFFFFF"/>
-            <w:tcMar>
-              <w:top w:w="0" w:type="dxa"/>
-              <w:bottom w:w="0" w:type="dxa"/>
-              <w:left w:w="0" w:type="dxa"/>
-              <w:right w:w="0" w:type="dxa"/>
-            </w:tcMar>
-            <w:vAlign w:val="center"/>
-          </w:tcPr>
-          <w:p>
-            <w:pPr>
-              <w:pStyle w:val="Normal"/>
-              <w:jc w:val="center"/>
-              <w:pBdr>
-                <w:bottom w:val="none" w:sz="0" w:space="0" w:color="000000"/>
-                <w:top w:val="none" w:sz="0" w:space="0" w:color="000000"/>
-                <w:left w:val="none" w:sz="0" w:space="0" w:color="000000"/>
-                <w:right w:val="none" w:sz="0" w:space="0" w:color="000000"/>
-              </w:pBdr>
-              <w:spacing w:after="40" w:before="40" w:line="240"/>
-              <w:ind w:left="100" w:right="100" w:firstLine="0" w:firstLineChars="0"/>
-            </w:pPr>
-            <w:r>
-              <w:rPr>
-                <w:rFonts w:ascii="DejaVu Sans" w:hAnsi="DejaVu Sans" w:eastAsia="DejaVu Sans" w:cs="DejaVu Sans"/>
-                <w:i w:val="false"/>
-                <w:b w:val="false"/>
-                <w:u w:val="none"/>
-                <w:sz w:val="18"/>
-                <w:szCs w:val="18"/>
-                <w:color w:val="000000"/>
-              </w:rPr>
-              <w:t xml:space="preserve">35 (72.9%)</w:t>
-            </w:r>
-          </w:p>
-        </w:tc>
-        <w:tc>
-          <w:tcPr>
-            <w:tcBorders>
-              <w:bottom w:val="single" w:sz="8" w:space="0" w:color="000000"/>
-              <w:top w:val="single" w:sz="4" w:space="0" w:color="999999"/>
-              <w:left w:val="none" w:sz="0" w:space="0" w:color="000000"/>
+              <w:left w:val="single" w:sz="6" w:space="0" w:color="000000"/>
               <w:right w:val="none" w:sz="0" w:space="0" w:color="000000"/>
             </w:tcBorders>
             <w:shd w:val="clear" w:color="auto" w:fill="FFFFFF"/>

</xml_diff>

<commit_message>
Use each timepoint's own sample list; move P-value next to its block
Two changes:
1. Cohort: 6M uses all 139 cases from Blood_Urine, 2Y uses all 206
   from 收案名單 independently (no forced intersection). Group sizes
   now differ: e.g. GA 50/48/41 at 6M vs 70/73/63 at 2Y.
2. Layout: P-value column sits immediately after its timepoint's
   subgroup columns instead of both at the far right.
   New column order: Char | 6M groups | P(6M) | 2Y groups | P(2Y)

https://claude.ai/code/session_011RiFZevQfeNr1NU3Lbttjc
</commit_message>
<xml_diff>
--- a/table1/Table_1_BPD_6M_2Y.docx
+++ b/table1/Table_1_BPD_6M_2Y.docx
@@ -70,7 +70,7 @@
         </w:tc>
         <w:tc>
           <w:tcPr>
-            <w:gridSpan w:val="3"/>
+            <w:gridSpan w:val="4"/>
             <w:tcBorders>
               <w:bottom w:val="none" w:sz="0" w:space="0" w:color="FFFFFF"/>
               <w:top w:val="single" w:sz="8" w:space="0" w:color="000000"/>
@@ -115,7 +115,7 @@
         </w:tc>
         <w:tc>
           <w:tcPr>
-            <w:gridSpan w:val="3"/>
+            <w:gridSpan w:val="4"/>
             <w:tcBorders>
               <w:bottom w:val="none" w:sz="0" w:space="0" w:color="FFFFFF"/>
               <w:top w:val="single" w:sz="8" w:space="0" w:color="000000"/>
@@ -155,51 +155,6 @@
                 <w:color w:val="000000"/>
               </w:rPr>
               <w:t xml:space="preserve">2Y</w:t>
-            </w:r>
-          </w:p>
-        </w:tc>
-        <w:tc>
-          <w:tcPr>
-            <w:gridSpan w:val="2"/>
-            <w:tcBorders>
-              <w:bottom w:val="none" w:sz="0" w:space="0" w:color="FFFFFF"/>
-              <w:top w:val="single" w:sz="8" w:space="0" w:color="000000"/>
-              <w:left w:val="single" w:sz="6" w:space="0" w:color="000000"/>
-              <w:right w:val="none" w:sz="0" w:space="0" w:color="FFFFFF"/>
-            </w:tcBorders>
-            <w:shd w:val="clear" w:color="auto" w:fill="FFFFFF"/>
-            <w:tcMar>
-              <w:top w:w="0" w:type="dxa"/>
-              <w:bottom w:w="0" w:type="dxa"/>
-              <w:left w:w="0" w:type="dxa"/>
-              <w:right w:w="0" w:type="dxa"/>
-            </w:tcMar>
-            <w:vAlign w:val="center"/>
-          </w:tcPr>
-          <w:p>
-            <w:pPr>
-              <w:pStyle w:val="Normal"/>
-              <w:jc w:val="center"/>
-              <w:pBdr>
-                <w:bottom w:val="none" w:sz="0" w:space="0" w:color="000000"/>
-                <w:top w:val="none" w:sz="0" w:space="0" w:color="000000"/>
-                <w:left w:val="none" w:sz="0" w:space="0" w:color="000000"/>
-                <w:right w:val="none" w:sz="0" w:space="0" w:color="000000"/>
-              </w:pBdr>
-              <w:spacing w:after="40" w:before="40" w:line="240"/>
-              <w:ind w:left="100" w:right="100" w:firstLine="0" w:firstLineChars="0"/>
-            </w:pPr>
-            <w:r>
-              <w:rPr>
-                <w:rFonts w:ascii="DejaVu Sans" w:hAnsi="DejaVu Sans" w:eastAsia="DejaVu Sans" w:cs="DejaVu Sans"/>
-                <w:i w:val="false"/>
-                <w:b w:val="true"/>
-                <w:u w:val="none"/>
-                <w:sz w:val="20"/>
-                <w:szCs w:val="20"/>
-                <w:color w:val="000000"/>
-              </w:rPr>
-              <w:t xml:space="preserve">P-value</w:t>
             </w:r>
           </w:p>
         </w:tc>
@@ -337,7 +292,7 @@
               <w:bottom w:val="single" w:sz="8" w:space="0" w:color="000000"/>
               <w:top w:val="none" w:sz="0" w:space="0" w:color="FFFFFF"/>
               <w:left w:val="none" w:sz="0" w:space="0" w:color="FFFFFF"/>
-              <w:right w:val="single" w:sz="6" w:space="0" w:color="000000"/>
+              <w:right w:val="none" w:sz="0" w:space="0" w:color="FFFFFF"/>
             </w:tcBorders>
             <w:shd w:val="clear" w:color="auto" w:fill="FFFFFF"/>
             <w:tcMar>
@@ -372,6 +327,50 @@
                 <w:color w:val="000000"/>
               </w:rPr>
               <w:t xml:space="preserve">M+S BPD (n=49)</w:t>
+            </w:r>
+          </w:p>
+        </w:tc>
+        <w:tc>
+          <w:tcPr>
+            <w:tcBorders>
+              <w:bottom w:val="single" w:sz="8" w:space="0" w:color="000000"/>
+              <w:top w:val="none" w:sz="0" w:space="0" w:color="FFFFFF"/>
+              <w:left w:val="none" w:sz="0" w:space="0" w:color="FFFFFF"/>
+              <w:right w:val="single" w:sz="6" w:space="0" w:color="000000"/>
+            </w:tcBorders>
+            <w:shd w:val="clear" w:color="auto" w:fill="FFFFFF"/>
+            <w:tcMar>
+              <w:top w:w="0" w:type="dxa"/>
+              <w:bottom w:w="0" w:type="dxa"/>
+              <w:left w:w="0" w:type="dxa"/>
+              <w:right w:w="0" w:type="dxa"/>
+            </w:tcMar>
+            <w:vAlign w:val="center"/>
+          </w:tcPr>
+          <w:p>
+            <w:pPr>
+              <w:pStyle w:val="Normal"/>
+              <w:jc w:val="center"/>
+              <w:pBdr>
+                <w:bottom w:val="none" w:sz="0" w:space="0" w:color="000000"/>
+                <w:top w:val="none" w:sz="0" w:space="0" w:color="000000"/>
+                <w:left w:val="none" w:sz="0" w:space="0" w:color="000000"/>
+                <w:right w:val="none" w:sz="0" w:space="0" w:color="000000"/>
+              </w:pBdr>
+              <w:spacing w:after="40" w:before="40" w:line="240"/>
+              <w:ind w:left="100" w:right="100" w:firstLine="0" w:firstLineChars="0"/>
+            </w:pPr>
+            <w:r>
+              <w:rPr>
+                <w:rFonts w:ascii="DejaVu Sans" w:hAnsi="DejaVu Sans" w:eastAsia="DejaVu Sans" w:cs="DejaVu Sans"/>
+                <w:i w:val="false"/>
+                <w:b w:val="true"/>
+                <w:u w:val="none"/>
+                <w:sz w:val="20"/>
+                <w:szCs w:val="20"/>
+                <w:color w:val="000000"/>
+              </w:rPr>
+              <w:t xml:space="preserve">P</w:t>
             </w:r>
           </w:p>
         </w:tc>
@@ -415,7 +414,7 @@
                 <w:szCs w:val="20"/>
                 <w:color w:val="000000"/>
               </w:rPr>
-              <w:t xml:space="preserve">HC (n=50)</w:t>
+              <w:t xml:space="preserve">HC (n=70)</w:t>
             </w:r>
           </w:p>
         </w:tc>
@@ -459,7 +458,7 @@
                 <w:szCs w:val="20"/>
                 <w:color w:val="000000"/>
               </w:rPr>
-              <w:t xml:space="preserve">No+Mild BPD (n=40)</w:t>
+              <w:t xml:space="preserve">No+Mild BPD (n=54)</w:t>
             </w:r>
           </w:p>
         </w:tc>
@@ -469,7 +468,7 @@
               <w:bottom w:val="single" w:sz="8" w:space="0" w:color="000000"/>
               <w:top w:val="none" w:sz="0" w:space="0" w:color="FFFFFF"/>
               <w:left w:val="none" w:sz="0" w:space="0" w:color="FFFFFF"/>
-              <w:right w:val="single" w:sz="6" w:space="0" w:color="000000"/>
+              <w:right w:val="none" w:sz="0" w:space="0" w:color="FFFFFF"/>
             </w:tcBorders>
             <w:shd w:val="clear" w:color="auto" w:fill="FFFFFF"/>
             <w:tcMar>
@@ -503,51 +502,7 @@
                 <w:szCs w:val="20"/>
                 <w:color w:val="000000"/>
               </w:rPr>
-              <w:t xml:space="preserve">M+S BPD (n=49)</w:t>
-            </w:r>
-          </w:p>
-        </w:tc>
-        <w:tc>
-          <w:tcPr>
-            <w:tcBorders>
-              <w:bottom w:val="single" w:sz="8" w:space="0" w:color="000000"/>
-              <w:top w:val="none" w:sz="0" w:space="0" w:color="FFFFFF"/>
-              <w:left w:val="single" w:sz="6" w:space="0" w:color="000000"/>
-              <w:right w:val="none" w:sz="0" w:space="0" w:color="FFFFFF"/>
-            </w:tcBorders>
-            <w:shd w:val="clear" w:color="auto" w:fill="FFFFFF"/>
-            <w:tcMar>
-              <w:top w:w="0" w:type="dxa"/>
-              <w:bottom w:w="0" w:type="dxa"/>
-              <w:left w:w="0" w:type="dxa"/>
-              <w:right w:w="0" w:type="dxa"/>
-            </w:tcMar>
-            <w:vAlign w:val="center"/>
-          </w:tcPr>
-          <w:p>
-            <w:pPr>
-              <w:pStyle w:val="Normal"/>
-              <w:jc w:val="center"/>
-              <w:pBdr>
-                <w:bottom w:val="none" w:sz="0" w:space="0" w:color="000000"/>
-                <w:top w:val="none" w:sz="0" w:space="0" w:color="000000"/>
-                <w:left w:val="none" w:sz="0" w:space="0" w:color="000000"/>
-                <w:right w:val="none" w:sz="0" w:space="0" w:color="000000"/>
-              </w:pBdr>
-              <w:spacing w:after="40" w:before="40" w:line="240"/>
-              <w:ind w:left="100" w:right="100" w:firstLine="0" w:firstLineChars="0"/>
-            </w:pPr>
-            <w:r>
-              <w:rPr>
-                <w:rFonts w:ascii="DejaVu Sans" w:hAnsi="DejaVu Sans" w:eastAsia="DejaVu Sans" w:cs="DejaVu Sans"/>
-                <w:i w:val="false"/>
-                <w:b w:val="true"/>
-                <w:u w:val="none"/>
-                <w:sz w:val="20"/>
-                <w:szCs w:val="20"/>
-                <w:color w:val="000000"/>
-              </w:rPr>
-              <w:t xml:space="preserve">P (6M)</w:t>
+              <w:t xml:space="preserve">M+S BPD (n=82)</w:t>
             </w:r>
           </w:p>
         </w:tc>
@@ -591,7 +546,7 @@
                 <w:szCs w:val="20"/>
                 <w:color w:val="000000"/>
               </w:rPr>
-              <w:t xml:space="preserve">P (2Y)</w:t>
+              <w:t xml:space="preserve">P</w:t>
             </w:r>
           </w:p>
         </w:tc>
@@ -783,6 +738,50 @@
               <w:bottom w:val="single" w:sz="4" w:space="0" w:color="999999"/>
               <w:top w:val="single" w:sz="8" w:space="0" w:color="000000"/>
               <w:left w:val="single" w:sz="6" w:space="0" w:color="000000"/>
+              <w:right w:val="single" w:sz="6" w:space="0" w:color="000000"/>
+            </w:tcBorders>
+            <w:shd w:val="clear" w:color="auto" w:fill="FFFFFF"/>
+            <w:tcMar>
+              <w:top w:w="0" w:type="dxa"/>
+              <w:bottom w:w="0" w:type="dxa"/>
+              <w:left w:w="0" w:type="dxa"/>
+              <w:right w:w="0" w:type="dxa"/>
+            </w:tcMar>
+            <w:vAlign w:val="center"/>
+          </w:tcPr>
+          <w:p>
+            <w:pPr>
+              <w:pStyle w:val="Normal"/>
+              <w:jc w:val="center"/>
+              <w:pBdr>
+                <w:bottom w:val="none" w:sz="0" w:space="0" w:color="000000"/>
+                <w:top w:val="none" w:sz="0" w:space="0" w:color="000000"/>
+                <w:left w:val="none" w:sz="0" w:space="0" w:color="000000"/>
+                <w:right w:val="none" w:sz="0" w:space="0" w:color="000000"/>
+              </w:pBdr>
+              <w:spacing w:after="40" w:before="40" w:line="240"/>
+              <w:ind w:left="100" w:right="100" w:firstLine="0" w:firstLineChars="0"/>
+            </w:pPr>
+            <w:r>
+              <w:rPr>
+                <w:rFonts w:ascii="DejaVu Sans" w:hAnsi="DejaVu Sans" w:eastAsia="DejaVu Sans" w:cs="DejaVu Sans"/>
+                <w:i w:val="false"/>
+                <w:b w:val="false"/>
+                <w:u w:val="none"/>
+                <w:sz w:val="18"/>
+                <w:szCs w:val="18"/>
+                <w:color w:val="000000"/>
+              </w:rPr>
+              <w:t xml:space="preserve">0.714</w:t>
+            </w:r>
+          </w:p>
+        </w:tc>
+        <w:tc>
+          <w:tcPr>
+            <w:tcBorders>
+              <w:bottom w:val="single" w:sz="4" w:space="0" w:color="999999"/>
+              <w:top w:val="single" w:sz="8" w:space="0" w:color="000000"/>
+              <w:left w:val="single" w:sz="6" w:space="0" w:color="000000"/>
               <w:right w:val="none" w:sz="0" w:space="0" w:color="000000"/>
             </w:tcBorders>
             <w:shd w:val="clear" w:color="auto" w:fill="FFFFFF"/>
@@ -817,7 +816,7 @@
                 <w:szCs w:val="18"/>
                 <w:color w:val="000000"/>
               </w:rPr>
-              <w:t xml:space="preserve">20 (40.0%)</w:t>
+              <w:t xml:space="preserve">26 (37.1%)</w:t>
             </w:r>
           </w:p>
         </w:tc>
@@ -861,7 +860,7 @@
                 <w:szCs w:val="18"/>
                 <w:color w:val="000000"/>
               </w:rPr>
-              <w:t xml:space="preserve">19 (47.5%)</w:t>
+              <w:t xml:space="preserve">29 (53.7%)</w:t>
             </w:r>
           </w:p>
         </w:tc>
@@ -905,7 +904,7 @@
                 <w:szCs w:val="18"/>
                 <w:color w:val="000000"/>
               </w:rPr>
-              <w:t xml:space="preserve">23 (46.9%)</w:t>
+              <w:t xml:space="preserve">40 (48.8%)</w:t>
             </w:r>
           </w:p>
         </w:tc>
@@ -915,50 +914,6 @@
               <w:bottom w:val="single" w:sz="4" w:space="0" w:color="999999"/>
               <w:top w:val="single" w:sz="8" w:space="0" w:color="000000"/>
               <w:left w:val="single" w:sz="6" w:space="0" w:color="000000"/>
-              <w:right w:val="none" w:sz="0" w:space="0" w:color="000000"/>
-            </w:tcBorders>
-            <w:shd w:val="clear" w:color="auto" w:fill="FFFFFF"/>
-            <w:tcMar>
-              <w:top w:w="0" w:type="dxa"/>
-              <w:bottom w:w="0" w:type="dxa"/>
-              <w:left w:w="0" w:type="dxa"/>
-              <w:right w:w="0" w:type="dxa"/>
-            </w:tcMar>
-            <w:vAlign w:val="center"/>
-          </w:tcPr>
-          <w:p>
-            <w:pPr>
-              <w:pStyle w:val="Normal"/>
-              <w:jc w:val="center"/>
-              <w:pBdr>
-                <w:bottom w:val="none" w:sz="0" w:space="0" w:color="000000"/>
-                <w:top w:val="none" w:sz="0" w:space="0" w:color="000000"/>
-                <w:left w:val="none" w:sz="0" w:space="0" w:color="000000"/>
-                <w:right w:val="none" w:sz="0" w:space="0" w:color="000000"/>
-              </w:pBdr>
-              <w:spacing w:after="40" w:before="40" w:line="240"/>
-              <w:ind w:left="100" w:right="100" w:firstLine="0" w:firstLineChars="0"/>
-            </w:pPr>
-            <w:r>
-              <w:rPr>
-                <w:rFonts w:ascii="DejaVu Sans" w:hAnsi="DejaVu Sans" w:eastAsia="DejaVu Sans" w:cs="DejaVu Sans"/>
-                <w:i w:val="false"/>
-                <w:b w:val="false"/>
-                <w:u w:val="none"/>
-                <w:sz w:val="18"/>
-                <w:szCs w:val="18"/>
-                <w:color w:val="000000"/>
-              </w:rPr>
-              <w:t xml:space="preserve">0.714</w:t>
-            </w:r>
-          </w:p>
-        </w:tc>
-        <w:tc>
-          <w:tcPr>
-            <w:tcBorders>
-              <w:bottom w:val="single" w:sz="4" w:space="0" w:color="999999"/>
-              <w:top w:val="single" w:sz="8" w:space="0" w:color="000000"/>
-              <w:left w:val="none" w:sz="0" w:space="0" w:color="000000"/>
               <w:right w:val="single" w:sz="8" w:space="0" w:color="000000"/>
             </w:tcBorders>
             <w:shd w:val="clear" w:color="auto" w:fill="FFFFFF"/>
@@ -993,7 +948,7 @@
                 <w:szCs w:val="18"/>
                 <w:color w:val="000000"/>
               </w:rPr>
-              <w:t xml:space="preserve">0.714</w:t>
+              <w:t xml:space="preserve">0.153</w:t>
             </w:r>
           </w:p>
         </w:tc>
@@ -1185,6 +1140,50 @@
               <w:bottom w:val="single" w:sz="4" w:space="0" w:color="999999"/>
               <w:top w:val="single" w:sz="4" w:space="0" w:color="999999"/>
               <w:left w:val="single" w:sz="6" w:space="0" w:color="000000"/>
+              <w:right w:val="single" w:sz="6" w:space="0" w:color="000000"/>
+            </w:tcBorders>
+            <w:shd w:val="clear" w:color="auto" w:fill="FFFFFF"/>
+            <w:tcMar>
+              <w:top w:w="0" w:type="dxa"/>
+              <w:bottom w:w="0" w:type="dxa"/>
+              <w:left w:w="0" w:type="dxa"/>
+              <w:right w:w="0" w:type="dxa"/>
+            </w:tcMar>
+            <w:vAlign w:val="center"/>
+          </w:tcPr>
+          <w:p>
+            <w:pPr>
+              <w:pStyle w:val="Normal"/>
+              <w:jc w:val="center"/>
+              <w:pBdr>
+                <w:bottom w:val="none" w:sz="0" w:space="0" w:color="000000"/>
+                <w:top w:val="none" w:sz="0" w:space="0" w:color="000000"/>
+                <w:left w:val="none" w:sz="0" w:space="0" w:color="000000"/>
+                <w:right w:val="none" w:sz="0" w:space="0" w:color="000000"/>
+              </w:pBdr>
+              <w:spacing w:after="40" w:before="40" w:line="240"/>
+              <w:ind w:left="100" w:right="100" w:firstLine="0" w:firstLineChars="0"/>
+            </w:pPr>
+            <w:r>
+              <w:rPr>
+                <w:rFonts w:ascii="DejaVu Sans" w:hAnsi="DejaVu Sans" w:eastAsia="DejaVu Sans" w:cs="DejaVu Sans"/>
+                <w:i w:val="false"/>
+                <w:b w:val="true"/>
+                <w:u w:val="none"/>
+                <w:sz w:val="18"/>
+                <w:szCs w:val="18"/>
+                <w:color w:val="000000"/>
+              </w:rPr>
+              <w:t xml:space="preserve">&lt;0.001</w:t>
+            </w:r>
+          </w:p>
+        </w:tc>
+        <w:tc>
+          <w:tcPr>
+            <w:tcBorders>
+              <w:bottom w:val="single" w:sz="4" w:space="0" w:color="999999"/>
+              <w:top w:val="single" w:sz="4" w:space="0" w:color="999999"/>
+              <w:left w:val="single" w:sz="6" w:space="0" w:color="000000"/>
               <w:right w:val="none" w:sz="0" w:space="0" w:color="000000"/>
             </w:tcBorders>
             <w:shd w:val="clear" w:color="auto" w:fill="FFFFFF"/>
@@ -1219,7 +1218,7 @@
                 <w:szCs w:val="18"/>
                 <w:color w:val="000000"/>
               </w:rPr>
-              <w:t xml:space="preserve">39.07 ± 0.80</w:t>
+              <w:t xml:space="preserve">39.12 ± 0.84</w:t>
             </w:r>
           </w:p>
         </w:tc>
@@ -1263,7 +1262,7 @@
                 <w:szCs w:val="18"/>
                 <w:color w:val="000000"/>
               </w:rPr>
-              <w:t xml:space="preserve">30.18 ± 1.69</w:t>
+              <w:t xml:space="preserve">30.07 ± 1.79</w:t>
             </w:r>
           </w:p>
         </w:tc>
@@ -1307,7 +1306,7 @@
                 <w:szCs w:val="18"/>
                 <w:color w:val="000000"/>
               </w:rPr>
-              <w:t xml:space="preserve">27.24 ± 2.42</w:t>
+              <w:t xml:space="preserve">27.63 ± 2.50</w:t>
             </w:r>
           </w:p>
         </w:tc>
@@ -1317,50 +1316,6 @@
               <w:bottom w:val="single" w:sz="4" w:space="0" w:color="999999"/>
               <w:top w:val="single" w:sz="4" w:space="0" w:color="999999"/>
               <w:left w:val="single" w:sz="6" w:space="0" w:color="000000"/>
-              <w:right w:val="none" w:sz="0" w:space="0" w:color="000000"/>
-            </w:tcBorders>
-            <w:shd w:val="clear" w:color="auto" w:fill="FFFFFF"/>
-            <w:tcMar>
-              <w:top w:w="0" w:type="dxa"/>
-              <w:bottom w:w="0" w:type="dxa"/>
-              <w:left w:w="0" w:type="dxa"/>
-              <w:right w:w="0" w:type="dxa"/>
-            </w:tcMar>
-            <w:vAlign w:val="center"/>
-          </w:tcPr>
-          <w:p>
-            <w:pPr>
-              <w:pStyle w:val="Normal"/>
-              <w:jc w:val="center"/>
-              <w:pBdr>
-                <w:bottom w:val="none" w:sz="0" w:space="0" w:color="000000"/>
-                <w:top w:val="none" w:sz="0" w:space="0" w:color="000000"/>
-                <w:left w:val="none" w:sz="0" w:space="0" w:color="000000"/>
-                <w:right w:val="none" w:sz="0" w:space="0" w:color="000000"/>
-              </w:pBdr>
-              <w:spacing w:after="40" w:before="40" w:line="240"/>
-              <w:ind w:left="100" w:right="100" w:firstLine="0" w:firstLineChars="0"/>
-            </w:pPr>
-            <w:r>
-              <w:rPr>
-                <w:rFonts w:ascii="DejaVu Sans" w:hAnsi="DejaVu Sans" w:eastAsia="DejaVu Sans" w:cs="DejaVu Sans"/>
-                <w:i w:val="false"/>
-                <w:b w:val="true"/>
-                <w:u w:val="none"/>
-                <w:sz w:val="18"/>
-                <w:szCs w:val="18"/>
-                <w:color w:val="000000"/>
-              </w:rPr>
-              <w:t xml:space="preserve">&lt;0.001</w:t>
-            </w:r>
-          </w:p>
-        </w:tc>
-        <w:tc>
-          <w:tcPr>
-            <w:tcBorders>
-              <w:bottom w:val="single" w:sz="4" w:space="0" w:color="999999"/>
-              <w:top w:val="single" w:sz="4" w:space="0" w:color="999999"/>
-              <w:left w:val="none" w:sz="0" w:space="0" w:color="000000"/>
               <w:right w:val="single" w:sz="8" w:space="0" w:color="000000"/>
             </w:tcBorders>
             <w:shd w:val="clear" w:color="auto" w:fill="FFFFFF"/>
@@ -1587,6 +1542,50 @@
               <w:bottom w:val="single" w:sz="4" w:space="0" w:color="999999"/>
               <w:top w:val="single" w:sz="4" w:space="0" w:color="999999"/>
               <w:left w:val="single" w:sz="6" w:space="0" w:color="000000"/>
+              <w:right w:val="single" w:sz="6" w:space="0" w:color="000000"/>
+            </w:tcBorders>
+            <w:shd w:val="clear" w:color="auto" w:fill="FFFFFF"/>
+            <w:tcMar>
+              <w:top w:w="0" w:type="dxa"/>
+              <w:bottom w:w="0" w:type="dxa"/>
+              <w:left w:w="0" w:type="dxa"/>
+              <w:right w:w="0" w:type="dxa"/>
+            </w:tcMar>
+            <w:vAlign w:val="center"/>
+          </w:tcPr>
+          <w:p>
+            <w:pPr>
+              <w:pStyle w:val="Normal"/>
+              <w:jc w:val="center"/>
+              <w:pBdr>
+                <w:bottom w:val="none" w:sz="0" w:space="0" w:color="000000"/>
+                <w:top w:val="none" w:sz="0" w:space="0" w:color="000000"/>
+                <w:left w:val="none" w:sz="0" w:space="0" w:color="000000"/>
+                <w:right w:val="none" w:sz="0" w:space="0" w:color="000000"/>
+              </w:pBdr>
+              <w:spacing w:after="40" w:before="40" w:line="240"/>
+              <w:ind w:left="100" w:right="100" w:firstLine="0" w:firstLineChars="0"/>
+            </w:pPr>
+            <w:r>
+              <w:rPr>
+                <w:rFonts w:ascii="DejaVu Sans" w:hAnsi="DejaVu Sans" w:eastAsia="DejaVu Sans" w:cs="DejaVu Sans"/>
+                <w:i w:val="false"/>
+                <w:b w:val="true"/>
+                <w:u w:val="none"/>
+                <w:sz w:val="18"/>
+                <w:szCs w:val="18"/>
+                <w:color w:val="000000"/>
+              </w:rPr>
+              <w:t xml:space="preserve">&lt;0.001</w:t>
+            </w:r>
+          </w:p>
+        </w:tc>
+        <w:tc>
+          <w:tcPr>
+            <w:tcBorders>
+              <w:bottom w:val="single" w:sz="4" w:space="0" w:color="999999"/>
+              <w:top w:val="single" w:sz="4" w:space="0" w:color="999999"/>
+              <w:left w:val="single" w:sz="6" w:space="0" w:color="000000"/>
               <w:right w:val="none" w:sz="0" w:space="0" w:color="000000"/>
             </w:tcBorders>
             <w:shd w:val="clear" w:color="auto" w:fill="FFFFFF"/>
@@ -1621,7 +1620,7 @@
                 <w:szCs w:val="18"/>
                 <w:color w:val="000000"/>
               </w:rPr>
-              <w:t xml:space="preserve">3145.70 ± 367.06</w:t>
+              <w:t xml:space="preserve">3107.71 ± 362.54</w:t>
             </w:r>
           </w:p>
         </w:tc>
@@ -1665,7 +1664,7 @@
                 <w:szCs w:val="18"/>
                 <w:color w:val="000000"/>
               </w:rPr>
-              <w:t xml:space="preserve">1404.90 ± 287.17</w:t>
+              <w:t xml:space="preserve">1376.22 ± 275.12</w:t>
             </w:r>
           </w:p>
         </w:tc>
@@ -1709,7 +1708,7 @@
                 <w:szCs w:val="18"/>
                 <w:color w:val="000000"/>
               </w:rPr>
-              <w:t xml:space="preserve">841.00 ± 242.59</w:t>
+              <w:t xml:space="preserve">900.17 ± 283.34</w:t>
             </w:r>
           </w:p>
         </w:tc>
@@ -1719,50 +1718,6 @@
               <w:bottom w:val="single" w:sz="4" w:space="0" w:color="999999"/>
               <w:top w:val="single" w:sz="4" w:space="0" w:color="999999"/>
               <w:left w:val="single" w:sz="6" w:space="0" w:color="000000"/>
-              <w:right w:val="none" w:sz="0" w:space="0" w:color="000000"/>
-            </w:tcBorders>
-            <w:shd w:val="clear" w:color="auto" w:fill="FFFFFF"/>
-            <w:tcMar>
-              <w:top w:w="0" w:type="dxa"/>
-              <w:bottom w:w="0" w:type="dxa"/>
-              <w:left w:w="0" w:type="dxa"/>
-              <w:right w:w="0" w:type="dxa"/>
-            </w:tcMar>
-            <w:vAlign w:val="center"/>
-          </w:tcPr>
-          <w:p>
-            <w:pPr>
-              <w:pStyle w:val="Normal"/>
-              <w:jc w:val="center"/>
-              <w:pBdr>
-                <w:bottom w:val="none" w:sz="0" w:space="0" w:color="000000"/>
-                <w:top w:val="none" w:sz="0" w:space="0" w:color="000000"/>
-                <w:left w:val="none" w:sz="0" w:space="0" w:color="000000"/>
-                <w:right w:val="none" w:sz="0" w:space="0" w:color="000000"/>
-              </w:pBdr>
-              <w:spacing w:after="40" w:before="40" w:line="240"/>
-              <w:ind w:left="100" w:right="100" w:firstLine="0" w:firstLineChars="0"/>
-            </w:pPr>
-            <w:r>
-              <w:rPr>
-                <w:rFonts w:ascii="DejaVu Sans" w:hAnsi="DejaVu Sans" w:eastAsia="DejaVu Sans" w:cs="DejaVu Sans"/>
-                <w:i w:val="false"/>
-                <w:b w:val="true"/>
-                <w:u w:val="none"/>
-                <w:sz w:val="18"/>
-                <w:szCs w:val="18"/>
-                <w:color w:val="000000"/>
-              </w:rPr>
-              <w:t xml:space="preserve">&lt;0.001</w:t>
-            </w:r>
-          </w:p>
-        </w:tc>
-        <w:tc>
-          <w:tcPr>
-            <w:tcBorders>
-              <w:bottom w:val="single" w:sz="4" w:space="0" w:color="999999"/>
-              <w:top w:val="single" w:sz="4" w:space="0" w:color="999999"/>
-              <w:left w:val="none" w:sz="0" w:space="0" w:color="000000"/>
               <w:right w:val="single" w:sz="8" w:space="0" w:color="000000"/>
             </w:tcBorders>
             <w:shd w:val="clear" w:color="auto" w:fill="FFFFFF"/>
@@ -1989,6 +1944,50 @@
               <w:bottom w:val="single" w:sz="4" w:space="0" w:color="999999"/>
               <w:top w:val="single" w:sz="4" w:space="0" w:color="999999"/>
               <w:left w:val="single" w:sz="6" w:space="0" w:color="000000"/>
+              <w:right w:val="single" w:sz="6" w:space="0" w:color="000000"/>
+            </w:tcBorders>
+            <w:shd w:val="clear" w:color="auto" w:fill="FFFFFF"/>
+            <w:tcMar>
+              <w:top w:w="0" w:type="dxa"/>
+              <w:bottom w:w="0" w:type="dxa"/>
+              <w:left w:w="0" w:type="dxa"/>
+              <w:right w:w="0" w:type="dxa"/>
+            </w:tcMar>
+            <w:vAlign w:val="center"/>
+          </w:tcPr>
+          <w:p>
+            <w:pPr>
+              <w:pStyle w:val="Normal"/>
+              <w:jc w:val="center"/>
+              <w:pBdr>
+                <w:bottom w:val="none" w:sz="0" w:space="0" w:color="000000"/>
+                <w:top w:val="none" w:sz="0" w:space="0" w:color="000000"/>
+                <w:left w:val="none" w:sz="0" w:space="0" w:color="000000"/>
+                <w:right w:val="none" w:sz="0" w:space="0" w:color="000000"/>
+              </w:pBdr>
+              <w:spacing w:after="40" w:before="40" w:line="240"/>
+              <w:ind w:left="100" w:right="100" w:firstLine="0" w:firstLineChars="0"/>
+            </w:pPr>
+            <w:r>
+              <w:rPr>
+                <w:rFonts w:ascii="DejaVu Sans" w:hAnsi="DejaVu Sans" w:eastAsia="DejaVu Sans" w:cs="DejaVu Sans"/>
+                <w:i w:val="false"/>
+                <w:b w:val="false"/>
+                <w:u w:val="none"/>
+                <w:sz w:val="18"/>
+                <w:szCs w:val="18"/>
+                <w:color w:val="000000"/>
+              </w:rPr>
+              <w:t xml:space="preserve">0.430</w:t>
+            </w:r>
+          </w:p>
+        </w:tc>
+        <w:tc>
+          <w:tcPr>
+            <w:tcBorders>
+              <w:bottom w:val="single" w:sz="4" w:space="0" w:color="999999"/>
+              <w:top w:val="single" w:sz="4" w:space="0" w:color="999999"/>
+              <w:left w:val="single" w:sz="6" w:space="0" w:color="000000"/>
               <w:right w:val="none" w:sz="0" w:space="0" w:color="000000"/>
             </w:tcBorders>
             <w:shd w:val="clear" w:color="auto" w:fill="FFFFFF"/>
@@ -2023,7 +2022,7 @@
                 <w:szCs w:val="18"/>
                 <w:color w:val="000000"/>
               </w:rPr>
-              <w:t xml:space="preserve">27.30 ± 2.59</w:t>
+              <w:t xml:space="preserve">27.36 ± 2.60</w:t>
             </w:r>
           </w:p>
         </w:tc>
@@ -2067,7 +2066,7 @@
                 <w:szCs w:val="18"/>
                 <w:color w:val="000000"/>
               </w:rPr>
-              <w:t xml:space="preserve">25.31 ± 1.00</w:t>
+              <w:t xml:space="preserve">25.52 ± 1.18</w:t>
             </w:r>
           </w:p>
         </w:tc>
@@ -2111,7 +2110,7 @@
                 <w:szCs w:val="18"/>
                 <w:color w:val="000000"/>
               </w:rPr>
-              <w:t xml:space="preserve">24.96 ± 1.45</w:t>
+              <w:t xml:space="preserve">25.18 ± 1.79</w:t>
             </w:r>
           </w:p>
         </w:tc>
@@ -2121,50 +2120,6 @@
               <w:bottom w:val="single" w:sz="4" w:space="0" w:color="999999"/>
               <w:top w:val="single" w:sz="4" w:space="0" w:color="999999"/>
               <w:left w:val="single" w:sz="6" w:space="0" w:color="000000"/>
-              <w:right w:val="none" w:sz="0" w:space="0" w:color="000000"/>
-            </w:tcBorders>
-            <w:shd w:val="clear" w:color="auto" w:fill="FFFFFF"/>
-            <w:tcMar>
-              <w:top w:w="0" w:type="dxa"/>
-              <w:bottom w:w="0" w:type="dxa"/>
-              <w:left w:w="0" w:type="dxa"/>
-              <w:right w:w="0" w:type="dxa"/>
-            </w:tcMar>
-            <w:vAlign w:val="center"/>
-          </w:tcPr>
-          <w:p>
-            <w:pPr>
-              <w:pStyle w:val="Normal"/>
-              <w:jc w:val="center"/>
-              <w:pBdr>
-                <w:bottom w:val="none" w:sz="0" w:space="0" w:color="000000"/>
-                <w:top w:val="none" w:sz="0" w:space="0" w:color="000000"/>
-                <w:left w:val="none" w:sz="0" w:space="0" w:color="000000"/>
-                <w:right w:val="none" w:sz="0" w:space="0" w:color="000000"/>
-              </w:pBdr>
-              <w:spacing w:after="40" w:before="40" w:line="240"/>
-              <w:ind w:left="100" w:right="100" w:firstLine="0" w:firstLineChars="0"/>
-            </w:pPr>
-            <w:r>
-              <w:rPr>
-                <w:rFonts w:ascii="DejaVu Sans" w:hAnsi="DejaVu Sans" w:eastAsia="DejaVu Sans" w:cs="DejaVu Sans"/>
-                <w:i w:val="false"/>
-                <w:b w:val="false"/>
-                <w:u w:val="none"/>
-                <w:sz w:val="18"/>
-                <w:szCs w:val="18"/>
-                <w:color w:val="000000"/>
-              </w:rPr>
-              <w:t xml:space="preserve">0.430</w:t>
-            </w:r>
-          </w:p>
-        </w:tc>
-        <w:tc>
-          <w:tcPr>
-            <w:tcBorders>
-              <w:bottom w:val="single" w:sz="4" w:space="0" w:color="999999"/>
-              <w:top w:val="single" w:sz="4" w:space="0" w:color="999999"/>
-              <w:left w:val="none" w:sz="0" w:space="0" w:color="000000"/>
               <w:right w:val="single" w:sz="8" w:space="0" w:color="000000"/>
             </w:tcBorders>
             <w:shd w:val="clear" w:color="auto" w:fill="FFFFFF"/>
@@ -2391,6 +2346,50 @@
               <w:bottom w:val="single" w:sz="4" w:space="0" w:color="999999"/>
               <w:top w:val="single" w:sz="4" w:space="0" w:color="999999"/>
               <w:left w:val="single" w:sz="6" w:space="0" w:color="000000"/>
+              <w:right w:val="single" w:sz="6" w:space="0" w:color="000000"/>
+            </w:tcBorders>
+            <w:shd w:val="clear" w:color="auto" w:fill="FFFFFF"/>
+            <w:tcMar>
+              <w:top w:w="0" w:type="dxa"/>
+              <w:bottom w:w="0" w:type="dxa"/>
+              <w:left w:w="0" w:type="dxa"/>
+              <w:right w:w="0" w:type="dxa"/>
+            </w:tcMar>
+            <w:vAlign w:val="center"/>
+          </w:tcPr>
+          <w:p>
+            <w:pPr>
+              <w:pStyle w:val="Normal"/>
+              <w:jc w:val="center"/>
+              <w:pBdr>
+                <w:bottom w:val="none" w:sz="0" w:space="0" w:color="000000"/>
+                <w:top w:val="none" w:sz="0" w:space="0" w:color="000000"/>
+                <w:left w:val="none" w:sz="0" w:space="0" w:color="000000"/>
+                <w:right w:val="none" w:sz="0" w:space="0" w:color="000000"/>
+              </w:pBdr>
+              <w:spacing w:after="40" w:before="40" w:line="240"/>
+              <w:ind w:left="100" w:right="100" w:firstLine="0" w:firstLineChars="0"/>
+            </w:pPr>
+            <w:r>
+              <w:rPr>
+                <w:rFonts w:ascii="DejaVu Sans" w:hAnsi="DejaVu Sans" w:eastAsia="DejaVu Sans" w:cs="DejaVu Sans"/>
+                <w:i w:val="false"/>
+                <w:b w:val="true"/>
+                <w:u w:val="none"/>
+                <w:sz w:val="18"/>
+                <w:szCs w:val="18"/>
+                <w:color w:val="000000"/>
+              </w:rPr>
+              <w:t xml:space="preserve">&lt;0.001</w:t>
+            </w:r>
+          </w:p>
+        </w:tc>
+        <w:tc>
+          <w:tcPr>
+            <w:tcBorders>
+              <w:bottom w:val="single" w:sz="4" w:space="0" w:color="999999"/>
+              <w:top w:val="single" w:sz="4" w:space="0" w:color="999999"/>
+              <w:left w:val="single" w:sz="6" w:space="0" w:color="000000"/>
               <w:right w:val="none" w:sz="0" w:space="0" w:color="000000"/>
             </w:tcBorders>
             <w:shd w:val="clear" w:color="auto" w:fill="FFFFFF"/>
@@ -2425,7 +2424,7 @@
                 <w:szCs w:val="18"/>
                 <w:color w:val="000000"/>
               </w:rPr>
-              <w:t xml:space="preserve">12.33 ± 1.65</w:t>
+              <w:t xml:space="preserve">12.37 ± 1.62</w:t>
             </w:r>
           </w:p>
         </w:tc>
@@ -2469,7 +2468,7 @@
                 <w:szCs w:val="18"/>
                 <w:color w:val="000000"/>
               </w:rPr>
-              <w:t xml:space="preserve">12.16 ± 1.90</w:t>
+              <w:t xml:space="preserve">11.95 ± 1.80</w:t>
             </w:r>
           </w:p>
         </w:tc>
@@ -2513,7 +2512,7 @@
                 <w:szCs w:val="18"/>
                 <w:color w:val="000000"/>
               </w:rPr>
-              <w:t xml:space="preserve">10.20 ± 1.26</w:t>
+              <w:t xml:space="preserve">10.40 ± 1.47</w:t>
             </w:r>
           </w:p>
         </w:tc>
@@ -2523,50 +2522,6 @@
               <w:bottom w:val="single" w:sz="4" w:space="0" w:color="999999"/>
               <w:top w:val="single" w:sz="4" w:space="0" w:color="999999"/>
               <w:left w:val="single" w:sz="6" w:space="0" w:color="000000"/>
-              <w:right w:val="none" w:sz="0" w:space="0" w:color="000000"/>
-            </w:tcBorders>
-            <w:shd w:val="clear" w:color="auto" w:fill="FFFFFF"/>
-            <w:tcMar>
-              <w:top w:w="0" w:type="dxa"/>
-              <w:bottom w:w="0" w:type="dxa"/>
-              <w:left w:w="0" w:type="dxa"/>
-              <w:right w:w="0" w:type="dxa"/>
-            </w:tcMar>
-            <w:vAlign w:val="center"/>
-          </w:tcPr>
-          <w:p>
-            <w:pPr>
-              <w:pStyle w:val="Normal"/>
-              <w:jc w:val="center"/>
-              <w:pBdr>
-                <w:bottom w:val="none" w:sz="0" w:space="0" w:color="000000"/>
-                <w:top w:val="none" w:sz="0" w:space="0" w:color="000000"/>
-                <w:left w:val="none" w:sz="0" w:space="0" w:color="000000"/>
-                <w:right w:val="none" w:sz="0" w:space="0" w:color="000000"/>
-              </w:pBdr>
-              <w:spacing w:after="40" w:before="40" w:line="240"/>
-              <w:ind w:left="100" w:right="100" w:firstLine="0" w:firstLineChars="0"/>
-            </w:pPr>
-            <w:r>
-              <w:rPr>
-                <w:rFonts w:ascii="DejaVu Sans" w:hAnsi="DejaVu Sans" w:eastAsia="DejaVu Sans" w:cs="DejaVu Sans"/>
-                <w:i w:val="false"/>
-                <w:b w:val="true"/>
-                <w:u w:val="none"/>
-                <w:sz w:val="18"/>
-                <w:szCs w:val="18"/>
-                <w:color w:val="000000"/>
-              </w:rPr>
-              <w:t xml:space="preserve">&lt;0.001</w:t>
-            </w:r>
-          </w:p>
-        </w:tc>
-        <w:tc>
-          <w:tcPr>
-            <w:tcBorders>
-              <w:bottom w:val="single" w:sz="4" w:space="0" w:color="999999"/>
-              <w:top w:val="single" w:sz="4" w:space="0" w:color="999999"/>
-              <w:left w:val="none" w:sz="0" w:space="0" w:color="000000"/>
               <w:right w:val="single" w:sz="8" w:space="0" w:color="000000"/>
             </w:tcBorders>
             <w:shd w:val="clear" w:color="auto" w:fill="FFFFFF"/>
@@ -2793,6 +2748,50 @@
               <w:bottom w:val="single" w:sz="4" w:space="0" w:color="999999"/>
               <w:top w:val="single" w:sz="4" w:space="0" w:color="999999"/>
               <w:left w:val="single" w:sz="6" w:space="0" w:color="000000"/>
+              <w:right w:val="single" w:sz="6" w:space="0" w:color="000000"/>
+            </w:tcBorders>
+            <w:shd w:val="clear" w:color="auto" w:fill="FFFFFF"/>
+            <w:tcMar>
+              <w:top w:w="0" w:type="dxa"/>
+              <w:bottom w:w="0" w:type="dxa"/>
+              <w:left w:w="0" w:type="dxa"/>
+              <w:right w:w="0" w:type="dxa"/>
+            </w:tcMar>
+            <w:vAlign w:val="center"/>
+          </w:tcPr>
+          <w:p>
+            <w:pPr>
+              <w:pStyle w:val="Normal"/>
+              <w:jc w:val="center"/>
+              <w:pBdr>
+                <w:bottom w:val="none" w:sz="0" w:space="0" w:color="000000"/>
+                <w:top w:val="none" w:sz="0" w:space="0" w:color="000000"/>
+                <w:left w:val="none" w:sz="0" w:space="0" w:color="000000"/>
+                <w:right w:val="none" w:sz="0" w:space="0" w:color="000000"/>
+              </w:pBdr>
+              <w:spacing w:after="40" w:before="40" w:line="240"/>
+              <w:ind w:left="100" w:right="100" w:firstLine="0" w:firstLineChars="0"/>
+            </w:pPr>
+            <w:r>
+              <w:rPr>
+                <w:rFonts w:ascii="DejaVu Sans" w:hAnsi="DejaVu Sans" w:eastAsia="DejaVu Sans" w:cs="DejaVu Sans"/>
+                <w:i w:val="false"/>
+                <w:b w:val="true"/>
+                <w:u w:val="none"/>
+                <w:sz w:val="18"/>
+                <w:szCs w:val="18"/>
+                <w:color w:val="000000"/>
+              </w:rPr>
+              <w:t xml:space="preserve">&lt;0.001</w:t>
+            </w:r>
+          </w:p>
+        </w:tc>
+        <w:tc>
+          <w:tcPr>
+            <w:tcBorders>
+              <w:bottom w:val="single" w:sz="4" w:space="0" w:color="999999"/>
+              <w:top w:val="single" w:sz="4" w:space="0" w:color="999999"/>
+              <w:left w:val="single" w:sz="6" w:space="0" w:color="000000"/>
               <w:right w:val="none" w:sz="0" w:space="0" w:color="000000"/>
             </w:tcBorders>
             <w:shd w:val="clear" w:color="auto" w:fill="FFFFFF"/>
@@ -2827,7 +2826,7 @@
                 <w:szCs w:val="18"/>
                 <w:color w:val="000000"/>
               </w:rPr>
-              <w:t xml:space="preserve">87.76 ± 4.34</w:t>
+              <w:t xml:space="preserve">87.61 ± 4.29</w:t>
             </w:r>
           </w:p>
         </w:tc>
@@ -2871,7 +2870,7 @@
                 <w:szCs w:val="18"/>
                 <w:color w:val="000000"/>
               </w:rPr>
-              <w:t xml:space="preserve">86.67 ± 3.62</w:t>
+              <w:t xml:space="preserve">86.36 ± 3.66</w:t>
             </w:r>
           </w:p>
         </w:tc>
@@ -2915,7 +2914,7 @@
                 <w:szCs w:val="18"/>
                 <w:color w:val="000000"/>
               </w:rPr>
-              <w:t xml:space="preserve">83.24 ± 3.33</w:t>
+              <w:t xml:space="preserve">83.91 ± 4.37</w:t>
             </w:r>
           </w:p>
         </w:tc>
@@ -2925,50 +2924,6 @@
               <w:bottom w:val="single" w:sz="4" w:space="0" w:color="999999"/>
               <w:top w:val="single" w:sz="4" w:space="0" w:color="999999"/>
               <w:left w:val="single" w:sz="6" w:space="0" w:color="000000"/>
-              <w:right w:val="none" w:sz="0" w:space="0" w:color="000000"/>
-            </w:tcBorders>
-            <w:shd w:val="clear" w:color="auto" w:fill="FFFFFF"/>
-            <w:tcMar>
-              <w:top w:w="0" w:type="dxa"/>
-              <w:bottom w:w="0" w:type="dxa"/>
-              <w:left w:w="0" w:type="dxa"/>
-              <w:right w:w="0" w:type="dxa"/>
-            </w:tcMar>
-            <w:vAlign w:val="center"/>
-          </w:tcPr>
-          <w:p>
-            <w:pPr>
-              <w:pStyle w:val="Normal"/>
-              <w:jc w:val="center"/>
-              <w:pBdr>
-                <w:bottom w:val="none" w:sz="0" w:space="0" w:color="000000"/>
-                <w:top w:val="none" w:sz="0" w:space="0" w:color="000000"/>
-                <w:left w:val="none" w:sz="0" w:space="0" w:color="000000"/>
-                <w:right w:val="none" w:sz="0" w:space="0" w:color="000000"/>
-              </w:pBdr>
-              <w:spacing w:after="40" w:before="40" w:line="240"/>
-              <w:ind w:left="100" w:right="100" w:firstLine="0" w:firstLineChars="0"/>
-            </w:pPr>
-            <w:r>
-              <w:rPr>
-                <w:rFonts w:ascii="DejaVu Sans" w:hAnsi="DejaVu Sans" w:eastAsia="DejaVu Sans" w:cs="DejaVu Sans"/>
-                <w:i w:val="false"/>
-                <w:b w:val="true"/>
-                <w:u w:val="none"/>
-                <w:sz w:val="18"/>
-                <w:szCs w:val="18"/>
-                <w:color w:val="000000"/>
-              </w:rPr>
-              <w:t xml:space="preserve">&lt;0.001</w:t>
-            </w:r>
-          </w:p>
-        </w:tc>
-        <w:tc>
-          <w:tcPr>
-            <w:tcBorders>
-              <w:bottom w:val="single" w:sz="4" w:space="0" w:color="999999"/>
-              <w:top w:val="single" w:sz="4" w:space="0" w:color="999999"/>
-              <w:left w:val="none" w:sz="0" w:space="0" w:color="000000"/>
               <w:right w:val="single" w:sz="8" w:space="0" w:color="000000"/>
             </w:tcBorders>
             <w:shd w:val="clear" w:color="auto" w:fill="FFFFFF"/>
@@ -3195,6 +3150,50 @@
               <w:bottom w:val="single" w:sz="4" w:space="0" w:color="999999"/>
               <w:top w:val="single" w:sz="4" w:space="0" w:color="999999"/>
               <w:left w:val="single" w:sz="6" w:space="0" w:color="000000"/>
+              <w:right w:val="single" w:sz="6" w:space="0" w:color="000000"/>
+            </w:tcBorders>
+            <w:shd w:val="clear" w:color="auto" w:fill="FFFFFF"/>
+            <w:tcMar>
+              <w:top w:w="0" w:type="dxa"/>
+              <w:bottom w:w="0" w:type="dxa"/>
+              <w:left w:w="0" w:type="dxa"/>
+              <w:right w:w="0" w:type="dxa"/>
+            </w:tcMar>
+            <w:vAlign w:val="center"/>
+          </w:tcPr>
+          <w:p>
+            <w:pPr>
+              <w:pStyle w:val="Normal"/>
+              <w:jc w:val="center"/>
+              <w:pBdr>
+                <w:bottom w:val="none" w:sz="0" w:space="0" w:color="000000"/>
+                <w:top w:val="none" w:sz="0" w:space="0" w:color="000000"/>
+                <w:left w:val="none" w:sz="0" w:space="0" w:color="000000"/>
+                <w:right w:val="none" w:sz="0" w:space="0" w:color="000000"/>
+              </w:pBdr>
+              <w:spacing w:after="40" w:before="40" w:line="240"/>
+              <w:ind w:left="100" w:right="100" w:firstLine="0" w:firstLineChars="0"/>
+            </w:pPr>
+            <w:r>
+              <w:rPr>
+                <w:rFonts w:ascii="DejaVu Sans" w:hAnsi="DejaVu Sans" w:eastAsia="DejaVu Sans" w:cs="DejaVu Sans"/>
+                <w:i w:val="false"/>
+                <w:b w:val="true"/>
+                <w:u w:val="none"/>
+                <w:sz w:val="18"/>
+                <w:szCs w:val="18"/>
+                <w:color w:val="000000"/>
+              </w:rPr>
+              <w:t xml:space="preserve">0.002</w:t>
+            </w:r>
+          </w:p>
+        </w:tc>
+        <w:tc>
+          <w:tcPr>
+            <w:tcBorders>
+              <w:bottom w:val="single" w:sz="4" w:space="0" w:color="999999"/>
+              <w:top w:val="single" w:sz="4" w:space="0" w:color="999999"/>
+              <w:left w:val="single" w:sz="6" w:space="0" w:color="000000"/>
               <w:right w:val="none" w:sz="0" w:space="0" w:color="000000"/>
             </w:tcBorders>
             <w:shd w:val="clear" w:color="auto" w:fill="FFFFFF"/>
@@ -3229,7 +3228,7 @@
                 <w:szCs w:val="18"/>
                 <w:color w:val="000000"/>
               </w:rPr>
-              <w:t xml:space="preserve">15.96 ± 1.37</w:t>
+              <w:t xml:space="preserve">16.06 ± 1.28</w:t>
             </w:r>
           </w:p>
         </w:tc>
@@ -3273,7 +3272,7 @@
                 <w:szCs w:val="18"/>
                 <w:color w:val="000000"/>
               </w:rPr>
-              <w:t xml:space="preserve">16.12 ± 1.62</w:t>
+              <w:t xml:space="preserve">15.96 ± 1.51</w:t>
             </w:r>
           </w:p>
         </w:tc>
@@ -3317,7 +3316,7 @@
                 <w:szCs w:val="18"/>
                 <w:color w:val="000000"/>
               </w:rPr>
-              <w:t xml:space="preserve">14.71 ± 1.46</w:t>
+              <w:t xml:space="preserve">14.73 ± 1.32</w:t>
             </w:r>
           </w:p>
         </w:tc>
@@ -3327,50 +3326,6 @@
               <w:bottom w:val="single" w:sz="4" w:space="0" w:color="999999"/>
               <w:top w:val="single" w:sz="4" w:space="0" w:color="999999"/>
               <w:left w:val="single" w:sz="6" w:space="0" w:color="000000"/>
-              <w:right w:val="none" w:sz="0" w:space="0" w:color="000000"/>
-            </w:tcBorders>
-            <w:shd w:val="clear" w:color="auto" w:fill="FFFFFF"/>
-            <w:tcMar>
-              <w:top w:w="0" w:type="dxa"/>
-              <w:bottom w:w="0" w:type="dxa"/>
-              <w:left w:w="0" w:type="dxa"/>
-              <w:right w:w="0" w:type="dxa"/>
-            </w:tcMar>
-            <w:vAlign w:val="center"/>
-          </w:tcPr>
-          <w:p>
-            <w:pPr>
-              <w:pStyle w:val="Normal"/>
-              <w:jc w:val="center"/>
-              <w:pBdr>
-                <w:bottom w:val="none" w:sz="0" w:space="0" w:color="000000"/>
-                <w:top w:val="none" w:sz="0" w:space="0" w:color="000000"/>
-                <w:left w:val="none" w:sz="0" w:space="0" w:color="000000"/>
-                <w:right w:val="none" w:sz="0" w:space="0" w:color="000000"/>
-              </w:pBdr>
-              <w:spacing w:after="40" w:before="40" w:line="240"/>
-              <w:ind w:left="100" w:right="100" w:firstLine="0" w:firstLineChars="0"/>
-            </w:pPr>
-            <w:r>
-              <w:rPr>
-                <w:rFonts w:ascii="DejaVu Sans" w:hAnsi="DejaVu Sans" w:eastAsia="DejaVu Sans" w:cs="DejaVu Sans"/>
-                <w:i w:val="false"/>
-                <w:b w:val="true"/>
-                <w:u w:val="none"/>
-                <w:sz w:val="18"/>
-                <w:szCs w:val="18"/>
-                <w:color w:val="000000"/>
-              </w:rPr>
-              <w:t xml:space="preserve">0.002</w:t>
-            </w:r>
-          </w:p>
-        </w:tc>
-        <w:tc>
-          <w:tcPr>
-            <w:tcBorders>
-              <w:bottom w:val="single" w:sz="4" w:space="0" w:color="999999"/>
-              <w:top w:val="single" w:sz="4" w:space="0" w:color="999999"/>
-              <w:left w:val="none" w:sz="0" w:space="0" w:color="000000"/>
               <w:right w:val="single" w:sz="8" w:space="0" w:color="000000"/>
             </w:tcBorders>
             <w:shd w:val="clear" w:color="auto" w:fill="FFFFFF"/>
@@ -3597,6 +3552,50 @@
               <w:bottom w:val="single" w:sz="4" w:space="0" w:color="999999"/>
               <w:top w:val="single" w:sz="4" w:space="0" w:color="999999"/>
               <w:left w:val="single" w:sz="6" w:space="0" w:color="000000"/>
+              <w:right w:val="single" w:sz="6" w:space="0" w:color="000000"/>
+            </w:tcBorders>
+            <w:shd w:val="clear" w:color="auto" w:fill="FFFFFF"/>
+            <w:tcMar>
+              <w:top w:w="0" w:type="dxa"/>
+              <w:bottom w:w="0" w:type="dxa"/>
+              <w:left w:w="0" w:type="dxa"/>
+              <w:right w:w="0" w:type="dxa"/>
+            </w:tcMar>
+            <w:vAlign w:val="center"/>
+          </w:tcPr>
+          <w:p>
+            <w:pPr>
+              <w:pStyle w:val="Normal"/>
+              <w:jc w:val="center"/>
+              <w:pBdr>
+                <w:bottom w:val="none" w:sz="0" w:space="0" w:color="000000"/>
+                <w:top w:val="none" w:sz="0" w:space="0" w:color="000000"/>
+                <w:left w:val="none" w:sz="0" w:space="0" w:color="000000"/>
+                <w:right w:val="none" w:sz="0" w:space="0" w:color="000000"/>
+              </w:pBdr>
+              <w:spacing w:after="40" w:before="40" w:line="240"/>
+              <w:ind w:left="100" w:right="100" w:firstLine="0" w:firstLineChars="0"/>
+            </w:pPr>
+            <w:r>
+              <w:rPr>
+                <w:rFonts w:ascii="DejaVu Sans" w:hAnsi="DejaVu Sans" w:eastAsia="DejaVu Sans" w:cs="DejaVu Sans"/>
+                <w:i w:val="false"/>
+                <w:b w:val="false"/>
+                <w:u w:val="none"/>
+                <w:sz w:val="18"/>
+                <w:szCs w:val="18"/>
+                <w:color w:val="000000"/>
+              </w:rPr>
+              <w:t xml:space="preserve">0.106</w:t>
+            </w:r>
+          </w:p>
+        </w:tc>
+        <w:tc>
+          <w:tcPr>
+            <w:tcBorders>
+              <w:bottom w:val="single" w:sz="4" w:space="0" w:color="999999"/>
+              <w:top w:val="single" w:sz="4" w:space="0" w:color="999999"/>
+              <w:left w:val="single" w:sz="6" w:space="0" w:color="000000"/>
               <w:right w:val="none" w:sz="0" w:space="0" w:color="000000"/>
             </w:tcBorders>
             <w:shd w:val="clear" w:color="auto" w:fill="FFFFFF"/>
@@ -3631,7 +3630,7 @@
                 <w:szCs w:val="18"/>
                 <w:color w:val="000000"/>
               </w:rPr>
-              <w:t xml:space="preserve">18 (54.5%)</w:t>
+              <w:t xml:space="preserve">25 (56.8%)</w:t>
             </w:r>
           </w:p>
         </w:tc>
@@ -3675,7 +3674,7 @@
                 <w:szCs w:val="18"/>
                 <w:color w:val="000000"/>
               </w:rPr>
-              <w:t xml:space="preserve">11 (40.7%)</w:t>
+              <w:t xml:space="preserve">17 (47.2%)</w:t>
             </w:r>
           </w:p>
         </w:tc>
@@ -3719,7 +3718,7 @@
                 <w:szCs w:val="18"/>
                 <w:color w:val="000000"/>
               </w:rPr>
-              <w:t xml:space="preserve">11 (33.3%)</w:t>
+              <w:t xml:space="preserve">17 (32.1%)</w:t>
             </w:r>
           </w:p>
         </w:tc>
@@ -3729,50 +3728,6 @@
               <w:bottom w:val="single" w:sz="4" w:space="0" w:color="999999"/>
               <w:top w:val="single" w:sz="4" w:space="0" w:color="999999"/>
               <w:left w:val="single" w:sz="6" w:space="0" w:color="000000"/>
-              <w:right w:val="none" w:sz="0" w:space="0" w:color="000000"/>
-            </w:tcBorders>
-            <w:shd w:val="clear" w:color="auto" w:fill="FFFFFF"/>
-            <w:tcMar>
-              <w:top w:w="0" w:type="dxa"/>
-              <w:bottom w:w="0" w:type="dxa"/>
-              <w:left w:w="0" w:type="dxa"/>
-              <w:right w:w="0" w:type="dxa"/>
-            </w:tcMar>
-            <w:vAlign w:val="center"/>
-          </w:tcPr>
-          <w:p>
-            <w:pPr>
-              <w:pStyle w:val="Normal"/>
-              <w:jc w:val="center"/>
-              <w:pBdr>
-                <w:bottom w:val="none" w:sz="0" w:space="0" w:color="000000"/>
-                <w:top w:val="none" w:sz="0" w:space="0" w:color="000000"/>
-                <w:left w:val="none" w:sz="0" w:space="0" w:color="000000"/>
-                <w:right w:val="none" w:sz="0" w:space="0" w:color="000000"/>
-              </w:pBdr>
-              <w:spacing w:after="40" w:before="40" w:line="240"/>
-              <w:ind w:left="100" w:right="100" w:firstLine="0" w:firstLineChars="0"/>
-            </w:pPr>
-            <w:r>
-              <w:rPr>
-                <w:rFonts w:ascii="DejaVu Sans" w:hAnsi="DejaVu Sans" w:eastAsia="DejaVu Sans" w:cs="DejaVu Sans"/>
-                <w:i w:val="false"/>
-                <w:b w:val="false"/>
-                <w:u w:val="none"/>
-                <w:sz w:val="18"/>
-                <w:szCs w:val="18"/>
-                <w:color w:val="000000"/>
-              </w:rPr>
-              <w:t xml:space="preserve">0.106</w:t>
-            </w:r>
-          </w:p>
-        </w:tc>
-        <w:tc>
-          <w:tcPr>
-            <w:tcBorders>
-              <w:bottom w:val="single" w:sz="4" w:space="0" w:color="999999"/>
-              <w:top w:val="single" w:sz="4" w:space="0" w:color="999999"/>
-              <w:left w:val="none" w:sz="0" w:space="0" w:color="000000"/>
               <w:right w:val="single" w:sz="8" w:space="0" w:color="000000"/>
             </w:tcBorders>
             <w:shd w:val="clear" w:color="auto" w:fill="FFFFFF"/>
@@ -3801,13 +3756,13 @@
               <w:rPr>
                 <w:rFonts w:ascii="DejaVu Sans" w:hAnsi="DejaVu Sans" w:eastAsia="DejaVu Sans" w:cs="DejaVu Sans"/>
                 <w:i w:val="false"/>
-                <w:b w:val="false"/>
-                <w:u w:val="none"/>
-                <w:sz w:val="18"/>
-                <w:szCs w:val="18"/>
-                <w:color w:val="000000"/>
-              </w:rPr>
-              <w:t xml:space="preserve">0.211</w:t>
+                <w:b w:val="true"/>
+                <w:u w:val="none"/>
+                <w:sz w:val="18"/>
+                <w:szCs w:val="18"/>
+                <w:color w:val="000000"/>
+              </w:rPr>
+              <w:t xml:space="preserve">0.047</w:t>
             </w:r>
           </w:p>
         </w:tc>
@@ -3999,6 +3954,50 @@
               <w:bottom w:val="single" w:sz="8" w:space="0" w:color="000000"/>
               <w:top w:val="single" w:sz="4" w:space="0" w:color="999999"/>
               <w:left w:val="single" w:sz="6" w:space="0" w:color="000000"/>
+              <w:right w:val="single" w:sz="6" w:space="0" w:color="000000"/>
+            </w:tcBorders>
+            <w:shd w:val="clear" w:color="auto" w:fill="FFFFFF"/>
+            <w:tcMar>
+              <w:top w:w="0" w:type="dxa"/>
+              <w:bottom w:w="0" w:type="dxa"/>
+              <w:left w:w="0" w:type="dxa"/>
+              <w:right w:w="0" w:type="dxa"/>
+            </w:tcMar>
+            <w:vAlign w:val="center"/>
+          </w:tcPr>
+          <w:p>
+            <w:pPr>
+              <w:pStyle w:val="Normal"/>
+              <w:jc w:val="center"/>
+              <w:pBdr>
+                <w:bottom w:val="none" w:sz="0" w:space="0" w:color="000000"/>
+                <w:top w:val="none" w:sz="0" w:space="0" w:color="000000"/>
+                <w:left w:val="none" w:sz="0" w:space="0" w:color="000000"/>
+                <w:right w:val="none" w:sz="0" w:space="0" w:color="000000"/>
+              </w:pBdr>
+              <w:spacing w:after="40" w:before="40" w:line="240"/>
+              <w:ind w:left="100" w:right="100" w:firstLine="0" w:firstLineChars="0"/>
+            </w:pPr>
+            <w:r>
+              <w:rPr>
+                <w:rFonts w:ascii="DejaVu Sans" w:hAnsi="DejaVu Sans" w:eastAsia="DejaVu Sans" w:cs="DejaVu Sans"/>
+                <w:i w:val="false"/>
+                <w:b w:val="true"/>
+                <w:u w:val="none"/>
+                <w:sz w:val="18"/>
+                <w:szCs w:val="18"/>
+                <w:color w:val="000000"/>
+              </w:rPr>
+              <w:t xml:space="preserve">&lt;0.001</w:t>
+            </w:r>
+          </w:p>
+        </w:tc>
+        <w:tc>
+          <w:tcPr>
+            <w:tcBorders>
+              <w:bottom w:val="single" w:sz="8" w:space="0" w:color="000000"/>
+              <w:top w:val="single" w:sz="4" w:space="0" w:color="999999"/>
+              <w:left w:val="single" w:sz="6" w:space="0" w:color="000000"/>
               <w:right w:val="none" w:sz="0" w:space="0" w:color="000000"/>
             </w:tcBorders>
             <w:shd w:val="clear" w:color="auto" w:fill="FFFFFF"/>
@@ -4033,7 +4032,7 @@
                 <w:szCs w:val="18"/>
                 <w:color w:val="000000"/>
               </w:rPr>
-              <w:t xml:space="preserve">1 (2.0%)</w:t>
+              <w:t xml:space="preserve">1 (1.4%)</w:t>
             </w:r>
           </w:p>
         </w:tc>
@@ -4077,7 +4076,7 @@
                 <w:szCs w:val="18"/>
                 <w:color w:val="000000"/>
               </w:rPr>
-              <w:t xml:space="preserve">11 (27.5%)</w:t>
+              <w:t xml:space="preserve">15 (27.8%)</w:t>
             </w:r>
           </w:p>
         </w:tc>
@@ -4121,7 +4120,7 @@
                 <w:szCs w:val="18"/>
                 <w:color w:val="000000"/>
               </w:rPr>
-              <w:t xml:space="preserve">35 (72.9%)</w:t>
+              <w:t xml:space="preserve">57 (71.2%)</w:t>
             </w:r>
           </w:p>
         </w:tc>
@@ -4131,50 +4130,6 @@
               <w:bottom w:val="single" w:sz="8" w:space="0" w:color="000000"/>
               <w:top w:val="single" w:sz="4" w:space="0" w:color="999999"/>
               <w:left w:val="single" w:sz="6" w:space="0" w:color="000000"/>
-              <w:right w:val="none" w:sz="0" w:space="0" w:color="000000"/>
-            </w:tcBorders>
-            <w:shd w:val="clear" w:color="auto" w:fill="FFFFFF"/>
-            <w:tcMar>
-              <w:top w:w="0" w:type="dxa"/>
-              <w:bottom w:w="0" w:type="dxa"/>
-              <w:left w:w="0" w:type="dxa"/>
-              <w:right w:w="0" w:type="dxa"/>
-            </w:tcMar>
-            <w:vAlign w:val="center"/>
-          </w:tcPr>
-          <w:p>
-            <w:pPr>
-              <w:pStyle w:val="Normal"/>
-              <w:jc w:val="center"/>
-              <w:pBdr>
-                <w:bottom w:val="none" w:sz="0" w:space="0" w:color="000000"/>
-                <w:top w:val="none" w:sz="0" w:space="0" w:color="000000"/>
-                <w:left w:val="none" w:sz="0" w:space="0" w:color="000000"/>
-                <w:right w:val="none" w:sz="0" w:space="0" w:color="000000"/>
-              </w:pBdr>
-              <w:spacing w:after="40" w:before="40" w:line="240"/>
-              <w:ind w:left="100" w:right="100" w:firstLine="0" w:firstLineChars="0"/>
-            </w:pPr>
-            <w:r>
-              <w:rPr>
-                <w:rFonts w:ascii="DejaVu Sans" w:hAnsi="DejaVu Sans" w:eastAsia="DejaVu Sans" w:cs="DejaVu Sans"/>
-                <w:i w:val="false"/>
-                <w:b w:val="true"/>
-                <w:u w:val="none"/>
-                <w:sz w:val="18"/>
-                <w:szCs w:val="18"/>
-                <w:color w:val="000000"/>
-              </w:rPr>
-              <w:t xml:space="preserve">&lt;0.001</w:t>
-            </w:r>
-          </w:p>
-        </w:tc>
-        <w:tc>
-          <w:tcPr>
-            <w:tcBorders>
-              <w:bottom w:val="single" w:sz="8" w:space="0" w:color="000000"/>
-              <w:top w:val="single" w:sz="4" w:space="0" w:color="999999"/>
-              <w:left w:val="none" w:sz="0" w:space="0" w:color="000000"/>
               <w:right w:val="single" w:sz="8" w:space="0" w:color="000000"/>
             </w:tcBorders>
             <w:shd w:val="clear" w:color="auto" w:fill="FFFFFF"/>

</xml_diff>

<commit_message>
Filter cohort by sample list.xlsx: 6M n=139, 2Y n=115
The sample list (table1/sample list.xlsx) now determines which cases
are included at each timepoint.  The 6M column lists 139 cases
(identical to Blood_Urine), while the 2Y column lists 115 cases
(a subset of the 206 in 收案名單).  Group sizes updated accordingly:
  GA  6M: 50/48/41   2Y: 40/37/38
  BPD 6M: 50/40/49   2Y: 40/31/44

https://claude.ai/code/session_011RiFZevQfeNr1NU3Lbttjc
</commit_message>
<xml_diff>
--- a/table1/Table_1_BPD_6M_2Y.docx
+++ b/table1/Table_1_BPD_6M_2Y.docx
@@ -414,7 +414,7 @@
                 <w:szCs w:val="20"/>
                 <w:color w:val="000000"/>
               </w:rPr>
-              <w:t xml:space="preserve">HC (n=70)</w:t>
+              <w:t xml:space="preserve">HC (n=40)</w:t>
             </w:r>
           </w:p>
         </w:tc>
@@ -458,7 +458,7 @@
                 <w:szCs w:val="20"/>
                 <w:color w:val="000000"/>
               </w:rPr>
-              <w:t xml:space="preserve">No+Mild BPD (n=54)</w:t>
+              <w:t xml:space="preserve">No+Mild BPD (n=31)</w:t>
             </w:r>
           </w:p>
         </w:tc>
@@ -502,7 +502,7 @@
                 <w:szCs w:val="20"/>
                 <w:color w:val="000000"/>
               </w:rPr>
-              <w:t xml:space="preserve">M+S BPD (n=82)</w:t>
+              <w:t xml:space="preserve">M+S BPD (n=44)</w:t>
             </w:r>
           </w:p>
         </w:tc>
@@ -640,7 +640,7 @@
                 <w:szCs w:val="18"/>
                 <w:color w:val="000000"/>
               </w:rPr>
-              <w:t xml:space="preserve">20 (40.0%)</w:t>
+              <w:t xml:space="preserve">20 (41.7%)</w:t>
             </w:r>
           </w:p>
         </w:tc>
@@ -684,7 +684,7 @@
                 <w:szCs w:val="18"/>
                 <w:color w:val="000000"/>
               </w:rPr>
-              <w:t xml:space="preserve">19 (47.5%)</w:t>
+              <w:t xml:space="preserve">18 (47.4%)</w:t>
             </w:r>
           </w:p>
         </w:tc>
@@ -728,7 +728,7 @@
                 <w:szCs w:val="18"/>
                 <w:color w:val="000000"/>
               </w:rPr>
-              <w:t xml:space="preserve">23 (46.9%)</w:t>
+              <w:t xml:space="preserve">21 (47.7%)</w:t>
             </w:r>
           </w:p>
         </w:tc>
@@ -772,7 +772,7 @@
                 <w:szCs w:val="18"/>
                 <w:color w:val="000000"/>
               </w:rPr>
-              <w:t xml:space="preserve">0.714</w:t>
+              <w:t xml:space="preserve">0.808</w:t>
             </w:r>
           </w:p>
         </w:tc>
@@ -816,7 +816,7 @@
                 <w:szCs w:val="18"/>
                 <w:color w:val="000000"/>
               </w:rPr>
-              <w:t xml:space="preserve">26 (37.1%)</w:t>
+              <w:t xml:space="preserve">19 (47.5%)</w:t>
             </w:r>
           </w:p>
         </w:tc>
@@ -860,7 +860,7 @@
                 <w:szCs w:val="18"/>
                 <w:color w:val="000000"/>
               </w:rPr>
-              <w:t xml:space="preserve">29 (53.7%)</w:t>
+              <w:t xml:space="preserve">15 (48.4%)</w:t>
             </w:r>
           </w:p>
         </w:tc>
@@ -904,7 +904,7 @@
                 <w:szCs w:val="18"/>
                 <w:color w:val="000000"/>
               </w:rPr>
-              <w:t xml:space="preserve">40 (48.8%)</w:t>
+              <w:t xml:space="preserve">21 (47.7%)</w:t>
             </w:r>
           </w:p>
         </w:tc>
@@ -948,7 +948,7 @@
                 <w:szCs w:val="18"/>
                 <w:color w:val="000000"/>
               </w:rPr>
-              <w:t xml:space="preserve">0.153</w:t>
+              <w:t xml:space="preserve">0.997</w:t>
             </w:r>
           </w:p>
         </w:tc>
@@ -1218,7 +1218,7 @@
                 <w:szCs w:val="18"/>
                 <w:color w:val="000000"/>
               </w:rPr>
-              <w:t xml:space="preserve">39.12 ± 0.84</w:t>
+              <w:t xml:space="preserve">39.04 ± 0.86</w:t>
             </w:r>
           </w:p>
         </w:tc>
@@ -1262,7 +1262,7 @@
                 <w:szCs w:val="18"/>
                 <w:color w:val="000000"/>
               </w:rPr>
-              <w:t xml:space="preserve">30.07 ± 1.79</w:t>
+              <w:t xml:space="preserve">30.18 ± 1.74</w:t>
             </w:r>
           </w:p>
         </w:tc>
@@ -1306,7 +1306,7 @@
                 <w:szCs w:val="18"/>
                 <w:color w:val="000000"/>
               </w:rPr>
-              <w:t xml:space="preserve">27.63 ± 2.50</w:t>
+              <w:t xml:space="preserve">27.22 ± 2.35</w:t>
             </w:r>
           </w:p>
         </w:tc>
@@ -1444,7 +1444,7 @@
                 <w:szCs w:val="18"/>
                 <w:color w:val="000000"/>
               </w:rPr>
-              <w:t xml:space="preserve">3145.70 ± 367.06</w:t>
+              <w:t xml:space="preserve">3135.73 ± 347.52</w:t>
             </w:r>
           </w:p>
         </w:tc>
@@ -1488,7 +1488,7 @@
                 <w:szCs w:val="18"/>
                 <w:color w:val="000000"/>
               </w:rPr>
-              <w:t xml:space="preserve">1404.90 ± 287.17</w:t>
+              <w:t xml:space="preserve">1389.11 ± 285.47</w:t>
             </w:r>
           </w:p>
         </w:tc>
@@ -1532,7 +1532,7 @@
                 <w:szCs w:val="18"/>
                 <w:color w:val="000000"/>
               </w:rPr>
-              <w:t xml:space="preserve">843.47 ± 241.74</w:t>
+              <w:t xml:space="preserve">827.39 ± 215.37</w:t>
             </w:r>
           </w:p>
         </w:tc>
@@ -1620,7 +1620,7 @@
                 <w:szCs w:val="18"/>
                 <w:color w:val="000000"/>
               </w:rPr>
-              <w:t xml:space="preserve">3107.71 ± 362.54</w:t>
+              <w:t xml:space="preserve">3147.38 ± 384.50</w:t>
             </w:r>
           </w:p>
         </w:tc>
@@ -1664,7 +1664,7 @@
                 <w:szCs w:val="18"/>
                 <w:color w:val="000000"/>
               </w:rPr>
-              <w:t xml:space="preserve">1376.22 ± 275.12</w:t>
+              <w:t xml:space="preserve">1379.97 ± 256.93</w:t>
             </w:r>
           </w:p>
         </w:tc>
@@ -1708,7 +1708,7 @@
                 <w:szCs w:val="18"/>
                 <w:color w:val="000000"/>
               </w:rPr>
-              <w:t xml:space="preserve">900.17 ± 283.34</w:t>
+              <w:t xml:space="preserve">849.75 ± 252.78</w:t>
             </w:r>
           </w:p>
         </w:tc>
@@ -2022,7 +2022,7 @@
                 <w:szCs w:val="18"/>
                 <w:color w:val="000000"/>
               </w:rPr>
-              <w:t xml:space="preserve">27.36 ± 2.60</w:t>
+              <w:t xml:space="preserve">27.31 ± 2.55</w:t>
             </w:r>
           </w:p>
         </w:tc>
@@ -2066,7 +2066,7 @@
                 <w:szCs w:val="18"/>
                 <w:color w:val="000000"/>
               </w:rPr>
-              <w:t xml:space="preserve">25.52 ± 1.18</w:t>
+              <w:t xml:space="preserve">25.58 ± 1.20</w:t>
             </w:r>
           </w:p>
         </w:tc>
@@ -2110,7 +2110,7 @@
                 <w:szCs w:val="18"/>
                 <w:color w:val="000000"/>
               </w:rPr>
-              <w:t xml:space="preserve">25.18 ± 1.79</w:t>
+              <w:t xml:space="preserve">25.20 ± 1.84</w:t>
             </w:r>
           </w:p>
         </w:tc>
@@ -2424,7 +2424,7 @@
                 <w:szCs w:val="18"/>
                 <w:color w:val="000000"/>
               </w:rPr>
-              <w:t xml:space="preserve">12.37 ± 1.62</w:t>
+              <w:t xml:space="preserve">12.32 ± 1.61</w:t>
             </w:r>
           </w:p>
         </w:tc>
@@ -2468,7 +2468,7 @@
                 <w:szCs w:val="18"/>
                 <w:color w:val="000000"/>
               </w:rPr>
-              <w:t xml:space="preserve">11.95 ± 1.80</w:t>
+              <w:t xml:space="preserve">11.68 ± 1.64</w:t>
             </w:r>
           </w:p>
         </w:tc>
@@ -2512,7 +2512,7 @@
                 <w:szCs w:val="18"/>
                 <w:color w:val="000000"/>
               </w:rPr>
-              <w:t xml:space="preserve">10.40 ± 1.47</w:t>
+              <w:t xml:space="preserve">10.51 ± 1.54</w:t>
             </w:r>
           </w:p>
         </w:tc>
@@ -2826,7 +2826,7 @@
                 <w:szCs w:val="18"/>
                 <w:color w:val="000000"/>
               </w:rPr>
-              <w:t xml:space="preserve">87.61 ± 4.29</w:t>
+              <w:t xml:space="preserve">87.50 ± 4.26</w:t>
             </w:r>
           </w:p>
         </w:tc>
@@ -2870,7 +2870,7 @@
                 <w:szCs w:val="18"/>
                 <w:color w:val="000000"/>
               </w:rPr>
-              <w:t xml:space="preserve">86.36 ± 3.66</w:t>
+              <w:t xml:space="preserve">85.88 ± 3.22</w:t>
             </w:r>
           </w:p>
         </w:tc>
@@ -2914,7 +2914,7 @@
                 <w:szCs w:val="18"/>
                 <w:color w:val="000000"/>
               </w:rPr>
-              <w:t xml:space="preserve">83.91 ± 4.37</w:t>
+              <w:t xml:space="preserve">83.88 ± 4.48</w:t>
             </w:r>
           </w:p>
         </w:tc>
@@ -3228,7 +3228,7 @@
                 <w:szCs w:val="18"/>
                 <w:color w:val="000000"/>
               </w:rPr>
-              <w:t xml:space="preserve">16.06 ± 1.28</w:t>
+              <w:t xml:space="preserve">16.03 ± 1.27</w:t>
             </w:r>
           </w:p>
         </w:tc>
@@ -3272,7 +3272,7 @@
                 <w:szCs w:val="18"/>
                 <w:color w:val="000000"/>
               </w:rPr>
-              <w:t xml:space="preserve">15.96 ± 1.51</w:t>
+              <w:t xml:space="preserve">15.79 ± 1.42</w:t>
             </w:r>
           </w:p>
         </w:tc>
@@ -3316,7 +3316,7 @@
                 <w:szCs w:val="18"/>
                 <w:color w:val="000000"/>
               </w:rPr>
-              <w:t xml:space="preserve">14.73 ± 1.32</w:t>
+              <w:t xml:space="preserve">14.88 ± 1.32</w:t>
             </w:r>
           </w:p>
         </w:tc>
@@ -3630,7 +3630,7 @@
                 <w:szCs w:val="18"/>
                 <w:color w:val="000000"/>
               </w:rPr>
-              <w:t xml:space="preserve">25 (56.8%)</w:t>
+              <w:t xml:space="preserve">24 (60.0%)</w:t>
             </w:r>
           </w:p>
         </w:tc>
@@ -3674,7 +3674,7 @@
                 <w:szCs w:val="18"/>
                 <w:color w:val="000000"/>
               </w:rPr>
-              <w:t xml:space="preserve">17 (47.2%)</w:t>
+              <w:t xml:space="preserve">17 (54.8%)</w:t>
             </w:r>
           </w:p>
         </w:tc>
@@ -3718,7 +3718,7 @@
                 <w:szCs w:val="18"/>
                 <w:color w:val="000000"/>
               </w:rPr>
-              <w:t xml:space="preserve">17 (32.1%)</w:t>
+              <w:t xml:space="preserve">16 (36.4%)</w:t>
             </w:r>
           </w:p>
         </w:tc>
@@ -3756,13 +3756,13 @@
               <w:rPr>
                 <w:rFonts w:ascii="DejaVu Sans" w:hAnsi="DejaVu Sans" w:eastAsia="DejaVu Sans" w:cs="DejaVu Sans"/>
                 <w:i w:val="false"/>
-                <w:b w:val="true"/>
-                <w:u w:val="none"/>
-                <w:sz w:val="18"/>
-                <w:szCs w:val="18"/>
-                <w:color w:val="000000"/>
-              </w:rPr>
-              <w:t xml:space="preserve">0.047</w:t>
+                <w:b w:val="false"/>
+                <w:u w:val="none"/>
+                <w:sz w:val="18"/>
+                <w:szCs w:val="18"/>
+                <w:color w:val="000000"/>
+              </w:rPr>
+              <w:t xml:space="preserve">0.076</w:t>
             </w:r>
           </w:p>
         </w:tc>
@@ -4032,7 +4032,7 @@
                 <w:szCs w:val="18"/>
                 <w:color w:val="000000"/>
               </w:rPr>
-              <w:t xml:space="preserve">1 (1.4%)</w:t>
+              <w:t xml:space="preserve">0 (0.0%)</w:t>
             </w:r>
           </w:p>
         </w:tc>
@@ -4076,7 +4076,7 @@
                 <w:szCs w:val="18"/>
                 <w:color w:val="000000"/>
               </w:rPr>
-              <w:t xml:space="preserve">15 (27.8%)</w:t>
+              <w:t xml:space="preserve">8 (25.8%)</w:t>
             </w:r>
           </w:p>
         </w:tc>
@@ -4120,7 +4120,7 @@
                 <w:szCs w:val="18"/>
                 <w:color w:val="000000"/>
               </w:rPr>
-              <w:t xml:space="preserve">57 (71.2%)</w:t>
+              <w:t xml:space="preserve">34 (79.1%)</w:t>
             </w:r>
           </w:p>
         </w:tc>

</xml_diff>

<commit_message>
Compute 6M BMI percentile from WHO LMS parameters
The 6M source file lacks a BMI percentile column. Added WHO Child
Growth Standards BMI-for-age LMS table (0-24 months, both sexes) to
the R script and compute z-score -> percentile via pnorm(). Missing
count for 6M BMI_pct dropped from 139/139 to 21/139 (remaining 21
lack sex or age data needed for calculation).

https://claude.ai/code/session_011RiFZevQfeNr1NU3Lbttjc
</commit_message>
<xml_diff>
--- a/table1/Table_1_BPD_6M_2Y.docx
+++ b/table1/Table_1_BPD_6M_2Y.docx
@@ -3052,7 +3052,7 @@
                 <w:szCs w:val="18"/>
                 <w:color w:val="000000"/>
               </w:rPr>
-              <w:t xml:space="preserve">-</w:t>
+              <w:t xml:space="preserve">57.09 ± 25.87</w:t>
             </w:r>
           </w:p>
         </w:tc>
@@ -3096,7 +3096,7 @@
                 <w:szCs w:val="18"/>
                 <w:color w:val="000000"/>
               </w:rPr>
-              <w:t xml:space="preserve">-</w:t>
+              <w:t xml:space="preserve">68.51 ± 28.01</w:t>
             </w:r>
           </w:p>
         </w:tc>
@@ -3140,7 +3140,7 @@
                 <w:szCs w:val="18"/>
                 <w:color w:val="000000"/>
               </w:rPr>
-              <w:t xml:space="preserve">-</w:t>
+              <w:t xml:space="preserve">43.84 ± 32.89</w:t>
             </w:r>
           </w:p>
         </w:tc>
@@ -3178,13 +3178,13 @@
               <w:rPr>
                 <w:rFonts w:ascii="DejaVu Sans" w:hAnsi="DejaVu Sans" w:eastAsia="DejaVu Sans" w:cs="DejaVu Sans"/>
                 <w:i w:val="false"/>
-                <w:b w:val="false"/>
-                <w:u w:val="none"/>
-                <w:sz w:val="18"/>
-                <w:szCs w:val="18"/>
-                <w:color w:val="000000"/>
-              </w:rPr>
-              <w:t xml:space="preserve">-</w:t>
+                <w:b w:val="true"/>
+                <w:u w:val="none"/>
+                <w:sz w:val="18"/>
+                <w:szCs w:val="18"/>
+                <w:color w:val="000000"/>
+              </w:rPr>
+              <w:t xml:space="preserve">0.002</w:t>
             </w:r>
           </w:p>
         </w:tc>
@@ -4183,7 +4183,7 @@
         <w:pStyle w:val="Normal"/>
       </w:pPr>
       <w:r>
-        <w:t xml:space="preserve">Data shown are mean ± SD or number (%) of patients as appropriate. Body weight, body height and BMI are presented as percentiles. GA, gestational age; BPD, bronchopulmonary dysplasia; HC, healthy controls; No+Mild BPD, no and mild BPD; M+S BPD, moderate and severe BPD; wk, week; g, gram; BMI, body mass index. 6M BMI percentile was not available. All P-values &lt; 0.05, which is in bold, are significant.</w:t>
+        <w:t xml:space="preserve">Data shown are mean ± SD or number (%) of patients as appropriate. Body weight, body height and BMI are presented as percentiles. GA, gestational age; BPD, bronchopulmonary dysplasia; HC, healthy controls; No+Mild BPD, no and mild BPD; M+S BPD, moderate and severe BPD; wk, week; g, gram; BMI, body mass index. 6M BMI percentile was computed from WHO Child Growth Standards LMS parameters. All P-values &lt; 0.05, which is in bold, are significant.</w:t>
       </w:r>
     </w:p>
     <w:sectPr w:officer="true">

</xml_diff>

<commit_message>
Round 6M BMI percentile to integers before computing group statistics
Matches the convention used by existing BW/BH percentile columns in the
6M source data (integer-rounded WHO 2006 values).

https://claude.ai/code/session_011RiFZevQfeNr1NU3Lbttjc
</commit_message>
<xml_diff>
--- a/table1/Table_1_BPD_6M_2Y.docx
+++ b/table1/Table_1_BPD_6M_2Y.docx
@@ -3052,7 +3052,7 @@
                 <w:szCs w:val="18"/>
                 <w:color w:val="000000"/>
               </w:rPr>
-              <w:t xml:space="preserve">57.09 ± 25.87</w:t>
+              <w:t xml:space="preserve">57.07 ± 25.88</w:t>
             </w:r>
           </w:p>
         </w:tc>
@@ -3096,7 +3096,7 @@
                 <w:szCs w:val="18"/>
                 <w:color w:val="000000"/>
               </w:rPr>
-              <w:t xml:space="preserve">68.51 ± 28.01</w:t>
+              <w:t xml:space="preserve">68.48 ± 27.99</w:t>
             </w:r>
           </w:p>
         </w:tc>
@@ -3140,7 +3140,7 @@
                 <w:szCs w:val="18"/>
                 <w:color w:val="000000"/>
               </w:rPr>
-              <w:t xml:space="preserve">43.84 ± 32.89</w:t>
+              <w:t xml:space="preserve">43.84 ± 32.91</w:t>
             </w:r>
           </w:p>
         </w:tc>

</xml_diff>

<commit_message>
Round 6M BMI percentile to 1 decimal place instead of integer
https://claude.ai/code/session_011RiFZevQfeNr1NU3Lbttjc
</commit_message>
<xml_diff>
--- a/table1/Table_1_BPD_6M_2Y.docx
+++ b/table1/Table_1_BPD_6M_2Y.docx
@@ -3052,7 +3052,7 @@
                 <w:szCs w:val="18"/>
                 <w:color w:val="000000"/>
               </w:rPr>
-              <w:t xml:space="preserve">57.07 ± 25.88</w:t>
+              <w:t xml:space="preserve">57.09 ± 25.87</w:t>
             </w:r>
           </w:p>
         </w:tc>
@@ -3096,7 +3096,7 @@
                 <w:szCs w:val="18"/>
                 <w:color w:val="000000"/>
               </w:rPr>
-              <w:t xml:space="preserve">68.48 ± 27.99</w:t>
+              <w:t xml:space="preserve">68.51 ± 28.01</w:t>
             </w:r>
           </w:p>
         </w:tc>
@@ -3140,7 +3140,7 @@
                 <w:szCs w:val="18"/>
                 <w:color w:val="000000"/>
               </w:rPr>
-              <w:t xml:space="preserve">43.84 ± 32.91</w:t>
+              <w:t xml:space="preserve">43.84 ± 32.89</w:t>
             </w:r>
           </w:p>
         </w:tc>

</xml_diff>